<commit_message>
fill weighting note diagnostics tables from Stata results (idempotent)
</commit_message>
<xml_diff>
--- a/CAPI/Analysis/SL/doc/L2PHL_WEIGHTING_TECHNICAL_NOTE.docx
+++ b/CAPI/Analysis/SL/doc/L2PHL_WEIGHTING_TECHNICAL_NOTE.docx
@@ -519,6 +519,2707 @@
         <w:t>This section reports how the weights behave. For the CAPI baseline and for each CATI round, it documents weight dispersion, the design effect from weighting (DEFFw = 1 + CV², where CV is the coefficient of variation of the weights), the effective sample size (ESS = N / DEFFw, cross-checked against Kish’s effective sample size), and the reconciliation of weighted totals to census benchmarks. The figures follow.</w:t>
       </w:r>
     </w:p>
+    <w:p>
+      <w:pPr>
+        <w:pStyle w:val="Heading2"/>
+      </w:pPr>
+      <w:r>
+        <w:t>CAPI baseline: weight distribution and design effect</w:t>
+      </w:r>
+    </w:p>
+    <w:tbl>
+      <w:tblPr>
+        <w:tblStyle w:val="TableGrid"/>
+        <w:tblW w:type="auto" w:w="0"/>
+        <w:tblLook w:firstColumn="1" w:firstRow="1" w:lastColumn="0" w:lastRow="0" w:noHBand="0" w:noVBand="1" w:val="04A0"/>
+      </w:tblPr>
+      <w:tblGrid>
+        <w:gridCol w:w="907"/>
+        <w:gridCol w:w="907"/>
+        <w:gridCol w:w="907"/>
+        <w:gridCol w:w="907"/>
+        <w:gridCol w:w="907"/>
+        <w:gridCol w:w="907"/>
+        <w:gridCol w:w="907"/>
+        <w:gridCol w:w="907"/>
+        <w:gridCol w:w="907"/>
+        <w:gridCol w:w="907"/>
+        <w:gridCol w:w="907"/>
+      </w:tblGrid>
+      <w:tr>
+        <w:tc>
+          <w:tcPr>
+            <w:tcW w:type="dxa" w:w="907"/>
+          </w:tcPr>
+          <w:p>
+            <w:r>
+              <w:t>weight</w:t>
+            </w:r>
+          </w:p>
+        </w:tc>
+        <w:tc>
+          <w:tcPr>
+            <w:tcW w:type="dxa" w:w="907"/>
+          </w:tcPr>
+          <w:p>
+            <w:r>
+              <w:t>N</w:t>
+            </w:r>
+          </w:p>
+        </w:tc>
+        <w:tc>
+          <w:tcPr>
+            <w:tcW w:type="dxa" w:w="907"/>
+          </w:tcPr>
+          <w:p>
+            <w:r>
+              <w:t>mean</w:t>
+            </w:r>
+          </w:p>
+        </w:tc>
+        <w:tc>
+          <w:tcPr>
+            <w:tcW w:type="dxa" w:w="907"/>
+          </w:tcPr>
+          <w:p>
+            <w:r>
+              <w:t>median</w:t>
+            </w:r>
+          </w:p>
+        </w:tc>
+        <w:tc>
+          <w:tcPr>
+            <w:tcW w:type="dxa" w:w="907"/>
+          </w:tcPr>
+          <w:p>
+            <w:r>
+              <w:t>min</w:t>
+            </w:r>
+          </w:p>
+        </w:tc>
+        <w:tc>
+          <w:tcPr>
+            <w:tcW w:type="dxa" w:w="907"/>
+          </w:tcPr>
+          <w:p>
+            <w:r>
+              <w:t>max</w:t>
+            </w:r>
+          </w:p>
+        </w:tc>
+        <w:tc>
+          <w:tcPr>
+            <w:tcW w:type="dxa" w:w="907"/>
+          </w:tcPr>
+          <w:p>
+            <w:r>
+              <w:t>CV</w:t>
+            </w:r>
+          </w:p>
+        </w:tc>
+        <w:tc>
+          <w:tcPr>
+            <w:tcW w:type="dxa" w:w="907"/>
+          </w:tcPr>
+          <w:p>
+            <w:r>
+              <w:t>max_min</w:t>
+            </w:r>
+          </w:p>
+        </w:tc>
+        <w:tc>
+          <w:tcPr>
+            <w:tcW w:type="dxa" w:w="907"/>
+          </w:tcPr>
+          <w:p>
+            <w:r>
+              <w:t>DEFFw</w:t>
+            </w:r>
+          </w:p>
+        </w:tc>
+        <w:tc>
+          <w:tcPr>
+            <w:tcW w:type="dxa" w:w="907"/>
+          </w:tcPr>
+          <w:p>
+            <w:r>
+              <w:t>ESS</w:t>
+            </w:r>
+          </w:p>
+        </w:tc>
+        <w:tc>
+          <w:tcPr>
+            <w:tcW w:type="dxa" w:w="907"/>
+          </w:tcPr>
+          <w:p>
+            <w:r>
+              <w:t>KishESS</w:t>
+            </w:r>
+          </w:p>
+        </w:tc>
+      </w:tr>
+      <w:tr>
+        <w:tc>
+          <w:tcPr>
+            <w:tcW w:type="dxa" w:w="907"/>
+          </w:tcPr>
+          <w:p>
+            <w:r>
+              <w:t>indw</w:t>
+            </w:r>
+          </w:p>
+        </w:tc>
+        <w:tc>
+          <w:tcPr>
+            <w:tcW w:type="dxa" w:w="907"/>
+          </w:tcPr>
+          <w:p>
+            <w:r>
+              <w:t>10,496</w:t>
+            </w:r>
+          </w:p>
+        </w:tc>
+        <w:tc>
+          <w:tcPr>
+            <w:tcW w:type="dxa" w:w="907"/>
+          </w:tcPr>
+          <w:p>
+            <w:r>
+              <w:t>10,353</w:t>
+            </w:r>
+          </w:p>
+        </w:tc>
+        <w:tc>
+          <w:tcPr>
+            <w:tcW w:type="dxa" w:w="907"/>
+          </w:tcPr>
+          <w:p>
+            <w:r>
+              <w:t>10,515</w:t>
+            </w:r>
+          </w:p>
+        </w:tc>
+        <w:tc>
+          <w:tcPr>
+            <w:tcW w:type="dxa" w:w="907"/>
+          </w:tcPr>
+          <w:p>
+            <w:r>
+              <w:t>3,271</w:t>
+            </w:r>
+          </w:p>
+        </w:tc>
+        <w:tc>
+          <w:tcPr>
+            <w:tcW w:type="dxa" w:w="907"/>
+          </w:tcPr>
+          <w:p>
+            <w:r>
+              <w:t>37,264</w:t>
+            </w:r>
+          </w:p>
+        </w:tc>
+        <w:tc>
+          <w:tcPr>
+            <w:tcW w:type="dxa" w:w="907"/>
+          </w:tcPr>
+          <w:p>
+            <w:r>
+              <w:t>0.346</w:t>
+            </w:r>
+          </w:p>
+        </w:tc>
+        <w:tc>
+          <w:tcPr>
+            <w:tcW w:type="dxa" w:w="907"/>
+          </w:tcPr>
+          <w:p>
+            <w:r>
+              <w:t>11.392</w:t>
+            </w:r>
+          </w:p>
+        </w:tc>
+        <w:tc>
+          <w:tcPr>
+            <w:tcW w:type="dxa" w:w="907"/>
+          </w:tcPr>
+          <w:p>
+            <w:r>
+              <w:t>1.120</w:t>
+            </w:r>
+          </w:p>
+        </w:tc>
+        <w:tc>
+          <w:tcPr>
+            <w:tcW w:type="dxa" w:w="907"/>
+          </w:tcPr>
+          <w:p>
+            <w:r>
+              <w:t>9,374</w:t>
+            </w:r>
+          </w:p>
+        </w:tc>
+        <w:tc>
+          <w:tcPr>
+            <w:tcW w:type="dxa" w:w="907"/>
+          </w:tcPr>
+          <w:p>
+            <w:r>
+              <w:t>9,374</w:t>
+            </w:r>
+          </w:p>
+        </w:tc>
+      </w:tr>
+      <w:tr>
+        <w:tc>
+          <w:tcPr>
+            <w:tcW w:type="dxa" w:w="907"/>
+          </w:tcPr>
+          <w:p>
+            <w:r>
+              <w:t>popw</w:t>
+            </w:r>
+          </w:p>
+        </w:tc>
+        <w:tc>
+          <w:tcPr>
+            <w:tcW w:type="dxa" w:w="907"/>
+          </w:tcPr>
+          <w:p>
+            <w:r>
+              <w:t>2,470</w:t>
+            </w:r>
+          </w:p>
+        </w:tc>
+        <w:tc>
+          <w:tcPr>
+            <w:tcW w:type="dxa" w:w="907"/>
+          </w:tcPr>
+          <w:p>
+            <w:r>
+              <w:t>43,995</w:t>
+            </w:r>
+          </w:p>
+        </w:tc>
+        <w:tc>
+          <w:tcPr>
+            <w:tcW w:type="dxa" w:w="907"/>
+          </w:tcPr>
+          <w:p>
+            <w:r>
+              <w:t>41,146</w:t>
+            </w:r>
+          </w:p>
+        </w:tc>
+        <w:tc>
+          <w:tcPr>
+            <w:tcW w:type="dxa" w:w="907"/>
+          </w:tcPr>
+          <w:p>
+            <w:r>
+              <w:t>3,432</w:t>
+            </w:r>
+          </w:p>
+        </w:tc>
+        <w:tc>
+          <w:tcPr>
+            <w:tcW w:type="dxa" w:w="907"/>
+          </w:tcPr>
+          <w:p>
+            <w:r>
+              <w:t>206,870</w:t>
+            </w:r>
+          </w:p>
+        </w:tc>
+        <w:tc>
+          <w:tcPr>
+            <w:tcW w:type="dxa" w:w="907"/>
+          </w:tcPr>
+          <w:p>
+            <w:r>
+              <w:t>0.575</w:t>
+            </w:r>
+          </w:p>
+        </w:tc>
+        <w:tc>
+          <w:tcPr>
+            <w:tcW w:type="dxa" w:w="907"/>
+          </w:tcPr>
+          <w:p>
+            <w:r>
+              <w:t>60.278</w:t>
+            </w:r>
+          </w:p>
+        </w:tc>
+        <w:tc>
+          <w:tcPr>
+            <w:tcW w:type="dxa" w:w="907"/>
+          </w:tcPr>
+          <w:p>
+            <w:r>
+              <w:t>1.331</w:t>
+            </w:r>
+          </w:p>
+        </w:tc>
+        <w:tc>
+          <w:tcPr>
+            <w:tcW w:type="dxa" w:w="907"/>
+          </w:tcPr>
+          <w:p>
+            <w:r>
+              <w:t>1,856</w:t>
+            </w:r>
+          </w:p>
+        </w:tc>
+        <w:tc>
+          <w:tcPr>
+            <w:tcW w:type="dxa" w:w="907"/>
+          </w:tcPr>
+          <w:p>
+            <w:r>
+              <w:t>1,856</w:t>
+            </w:r>
+          </w:p>
+        </w:tc>
+      </w:tr>
+      <w:tr>
+        <w:tc>
+          <w:tcPr>
+            <w:tcW w:type="dxa" w:w="907"/>
+          </w:tcPr>
+          <w:p>
+            <w:r>
+              <w:t>hhw</w:t>
+            </w:r>
+          </w:p>
+        </w:tc>
+        <w:tc>
+          <w:tcPr>
+            <w:tcW w:type="dxa" w:w="907"/>
+          </w:tcPr>
+          <w:p>
+            <w:r>
+              <w:t>2,470</w:t>
+            </w:r>
+          </w:p>
+        </w:tc>
+        <w:tc>
+          <w:tcPr>
+            <w:tcW w:type="dxa" w:w="907"/>
+          </w:tcPr>
+          <w:p>
+            <w:r>
+              <w:t>10,686</w:t>
+            </w:r>
+          </w:p>
+        </w:tc>
+        <w:tc>
+          <w:tcPr>
+            <w:tcW w:type="dxa" w:w="907"/>
+          </w:tcPr>
+          <w:p>
+            <w:r>
+              <w:t>11,489</w:t>
+            </w:r>
+          </w:p>
+        </w:tc>
+        <w:tc>
+          <w:tcPr>
+            <w:tcW w:type="dxa" w:w="907"/>
+          </w:tcPr>
+          <w:p>
+            <w:r>
+              <w:t>4,632</w:t>
+            </w:r>
+          </w:p>
+        </w:tc>
+        <w:tc>
+          <w:tcPr>
+            <w:tcW w:type="dxa" w:w="907"/>
+          </w:tcPr>
+          <w:p>
+            <w:r>
+              <w:t>24,114</w:t>
+            </w:r>
+          </w:p>
+        </w:tc>
+        <w:tc>
+          <w:tcPr>
+            <w:tcW w:type="dxa" w:w="907"/>
+          </w:tcPr>
+          <w:p>
+            <w:r>
+              <w:t>0.265</w:t>
+            </w:r>
+          </w:p>
+        </w:tc>
+        <w:tc>
+          <w:tcPr>
+            <w:tcW w:type="dxa" w:w="907"/>
+          </w:tcPr>
+          <w:p>
+            <w:r>
+              <w:t>5.206</w:t>
+            </w:r>
+          </w:p>
+        </w:tc>
+        <w:tc>
+          <w:tcPr>
+            <w:tcW w:type="dxa" w:w="907"/>
+          </w:tcPr>
+          <w:p>
+            <w:r>
+              <w:t>1.070</w:t>
+            </w:r>
+          </w:p>
+        </w:tc>
+        <w:tc>
+          <w:tcPr>
+            <w:tcW w:type="dxa" w:w="907"/>
+          </w:tcPr>
+          <w:p>
+            <w:r>
+              <w:t>2,308</w:t>
+            </w:r>
+          </w:p>
+        </w:tc>
+        <w:tc>
+          <w:tcPr>
+            <w:tcW w:type="dxa" w:w="907"/>
+          </w:tcPr>
+          <w:p>
+            <w:r>
+              <w:t>2,308</w:t>
+            </w:r>
+          </w:p>
+        </w:tc>
+      </w:tr>
+    </w:tbl>
+    <w:p>
+      <w:r>
+        <w:t>All 39 strata reconcile to their census population and household totals. The largest absolute residual is 6.33e-08 for the population total and 2.33e-09 for the household total, so the weighted totals match the census benchmarks to within rounding.</w:t>
+      </w:r>
+    </w:p>
+    <w:p>
+      <w:pPr>
+        <w:pStyle w:val="Heading2"/>
+      </w:pPr>
+      <w:r>
+        <w:t>CAPI baseline: effect of calibration (design vs final weights)</w:t>
+      </w:r>
+    </w:p>
+    <w:tbl>
+      <w:tblPr>
+        <w:tblStyle w:val="TableGrid"/>
+        <w:tblW w:type="auto" w:w="0"/>
+        <w:tblLook w:firstColumn="1" w:firstRow="1" w:lastColumn="0" w:lastRow="0" w:noHBand="0" w:noVBand="1" w:val="04A0"/>
+      </w:tblPr>
+      <w:tblGrid>
+        <w:gridCol w:w="1994"/>
+        <w:gridCol w:w="1994"/>
+        <w:gridCol w:w="1994"/>
+        <w:gridCol w:w="1994"/>
+        <w:gridCol w:w="1994"/>
+      </w:tblGrid>
+      <w:tr>
+        <w:tc>
+          <w:tcPr>
+            <w:tcW w:type="dxa" w:w="1994"/>
+          </w:tcPr>
+          <w:p>
+            <w:r>
+              <w:t>weight</w:t>
+            </w:r>
+          </w:p>
+        </w:tc>
+        <w:tc>
+          <w:tcPr>
+            <w:tcW w:type="dxa" w:w="1994"/>
+          </w:tcPr>
+          <w:p>
+            <w:r>
+              <w:t>stage</w:t>
+            </w:r>
+          </w:p>
+        </w:tc>
+        <w:tc>
+          <w:tcPr>
+            <w:tcW w:type="dxa" w:w="1994"/>
+          </w:tcPr>
+          <w:p>
+            <w:r>
+              <w:t>CV</w:t>
+            </w:r>
+          </w:p>
+        </w:tc>
+        <w:tc>
+          <w:tcPr>
+            <w:tcW w:type="dxa" w:w="1994"/>
+          </w:tcPr>
+          <w:p>
+            <w:r>
+              <w:t>DEFFw</w:t>
+            </w:r>
+          </w:p>
+        </w:tc>
+        <w:tc>
+          <w:tcPr>
+            <w:tcW w:type="dxa" w:w="1994"/>
+          </w:tcPr>
+          <w:p>
+            <w:r>
+              <w:t>ESS</w:t>
+            </w:r>
+          </w:p>
+        </w:tc>
+      </w:tr>
+      <w:tr>
+        <w:tc>
+          <w:tcPr>
+            <w:tcW w:type="dxa" w:w="1994"/>
+          </w:tcPr>
+          <w:p>
+            <w:r>
+              <w:t>indw</w:t>
+            </w:r>
+          </w:p>
+        </w:tc>
+        <w:tc>
+          <w:tcPr>
+            <w:tcW w:type="dxa" w:w="1994"/>
+          </w:tcPr>
+          <w:p>
+            <w:r>
+              <w:t>design</w:t>
+            </w:r>
+          </w:p>
+        </w:tc>
+        <w:tc>
+          <w:tcPr>
+            <w:tcW w:type="dxa" w:w="1994"/>
+          </w:tcPr>
+          <w:p>
+            <w:r>
+              <w:t>0.256</w:t>
+            </w:r>
+          </w:p>
+        </w:tc>
+        <w:tc>
+          <w:tcPr>
+            <w:tcW w:type="dxa" w:w="1994"/>
+          </w:tcPr>
+          <w:p>
+            <w:r>
+              <w:t>1.066</w:t>
+            </w:r>
+          </w:p>
+        </w:tc>
+        <w:tc>
+          <w:tcPr>
+            <w:tcW w:type="dxa" w:w="1994"/>
+          </w:tcPr>
+          <w:p>
+            <w:r>
+              <w:t>9,850</w:t>
+            </w:r>
+          </w:p>
+        </w:tc>
+      </w:tr>
+      <w:tr>
+        <w:tc>
+          <w:tcPr>
+            <w:tcW w:type="dxa" w:w="1994"/>
+          </w:tcPr>
+          <w:p>
+            <w:r>
+              <w:t>indw</w:t>
+            </w:r>
+          </w:p>
+        </w:tc>
+        <w:tc>
+          <w:tcPr>
+            <w:tcW w:type="dxa" w:w="1994"/>
+          </w:tcPr>
+          <w:p>
+            <w:r>
+              <w:t>final</w:t>
+            </w:r>
+          </w:p>
+        </w:tc>
+        <w:tc>
+          <w:tcPr>
+            <w:tcW w:type="dxa" w:w="1994"/>
+          </w:tcPr>
+          <w:p>
+            <w:r>
+              <w:t>0.346</w:t>
+            </w:r>
+          </w:p>
+        </w:tc>
+        <w:tc>
+          <w:tcPr>
+            <w:tcW w:type="dxa" w:w="1994"/>
+          </w:tcPr>
+          <w:p>
+            <w:r>
+              <w:t>1.120</w:t>
+            </w:r>
+          </w:p>
+        </w:tc>
+        <w:tc>
+          <w:tcPr>
+            <w:tcW w:type="dxa" w:w="1994"/>
+          </w:tcPr>
+          <w:p>
+            <w:r>
+              <w:t>9,374</w:t>
+            </w:r>
+          </w:p>
+        </w:tc>
+      </w:tr>
+      <w:tr>
+        <w:tc>
+          <w:tcPr>
+            <w:tcW w:type="dxa" w:w="1994"/>
+          </w:tcPr>
+          <w:p>
+            <w:r>
+              <w:t>popw</w:t>
+            </w:r>
+          </w:p>
+        </w:tc>
+        <w:tc>
+          <w:tcPr>
+            <w:tcW w:type="dxa" w:w="1994"/>
+          </w:tcPr>
+          <w:p>
+            <w:r>
+              <w:t>design</w:t>
+            </w:r>
+          </w:p>
+        </w:tc>
+        <w:tc>
+          <w:tcPr>
+            <w:tcW w:type="dxa" w:w="1994"/>
+          </w:tcPr>
+          <w:p>
+            <w:r>
+              <w:t>0.540</w:t>
+            </w:r>
+          </w:p>
+        </w:tc>
+        <w:tc>
+          <w:tcPr>
+            <w:tcW w:type="dxa" w:w="1994"/>
+          </w:tcPr>
+          <w:p>
+            <w:r>
+              <w:t>1.292</w:t>
+            </w:r>
+          </w:p>
+        </w:tc>
+        <w:tc>
+          <w:tcPr>
+            <w:tcW w:type="dxa" w:w="1994"/>
+          </w:tcPr>
+          <w:p>
+            <w:r>
+              <w:t>1,912</w:t>
+            </w:r>
+          </w:p>
+        </w:tc>
+      </w:tr>
+      <w:tr>
+        <w:tc>
+          <w:tcPr>
+            <w:tcW w:type="dxa" w:w="1994"/>
+          </w:tcPr>
+          <w:p>
+            <w:r>
+              <w:t>popw</w:t>
+            </w:r>
+          </w:p>
+        </w:tc>
+        <w:tc>
+          <w:tcPr>
+            <w:tcW w:type="dxa" w:w="1994"/>
+          </w:tcPr>
+          <w:p>
+            <w:r>
+              <w:t>final</w:t>
+            </w:r>
+          </w:p>
+        </w:tc>
+        <w:tc>
+          <w:tcPr>
+            <w:tcW w:type="dxa" w:w="1994"/>
+          </w:tcPr>
+          <w:p>
+            <w:r>
+              <w:t>0.575</w:t>
+            </w:r>
+          </w:p>
+        </w:tc>
+        <w:tc>
+          <w:tcPr>
+            <w:tcW w:type="dxa" w:w="1994"/>
+          </w:tcPr>
+          <w:p>
+            <w:r>
+              <w:t>1.331</w:t>
+            </w:r>
+          </w:p>
+        </w:tc>
+        <w:tc>
+          <w:tcPr>
+            <w:tcW w:type="dxa" w:w="1994"/>
+          </w:tcPr>
+          <w:p>
+            <w:r>
+              <w:t>1,856</w:t>
+            </w:r>
+          </w:p>
+        </w:tc>
+      </w:tr>
+      <w:tr>
+        <w:tc>
+          <w:tcPr>
+            <w:tcW w:type="dxa" w:w="1994"/>
+          </w:tcPr>
+          <w:p>
+            <w:r>
+              <w:t>hhw</w:t>
+            </w:r>
+          </w:p>
+        </w:tc>
+        <w:tc>
+          <w:tcPr>
+            <w:tcW w:type="dxa" w:w="1994"/>
+          </w:tcPr>
+          <w:p>
+            <w:r>
+              <w:t>design</w:t>
+            </w:r>
+          </w:p>
+        </w:tc>
+        <w:tc>
+          <w:tcPr>
+            <w:tcW w:type="dxa" w:w="1994"/>
+          </w:tcPr>
+          <w:p>
+            <w:r>
+              <w:t>0.263</w:t>
+            </w:r>
+          </w:p>
+        </w:tc>
+        <w:tc>
+          <w:tcPr>
+            <w:tcW w:type="dxa" w:w="1994"/>
+          </w:tcPr>
+          <w:p>
+            <w:r>
+              <w:t>1.069</w:t>
+            </w:r>
+          </w:p>
+        </w:tc>
+        <w:tc>
+          <w:tcPr>
+            <w:tcW w:type="dxa" w:w="1994"/>
+          </w:tcPr>
+          <w:p>
+            <w:r>
+              <w:t>2,311</w:t>
+            </w:r>
+          </w:p>
+        </w:tc>
+      </w:tr>
+      <w:tr>
+        <w:tc>
+          <w:tcPr>
+            <w:tcW w:type="dxa" w:w="1994"/>
+          </w:tcPr>
+          <w:p>
+            <w:r>
+              <w:t>hhw</w:t>
+            </w:r>
+          </w:p>
+        </w:tc>
+        <w:tc>
+          <w:tcPr>
+            <w:tcW w:type="dxa" w:w="1994"/>
+          </w:tcPr>
+          <w:p>
+            <w:r>
+              <w:t>final</w:t>
+            </w:r>
+          </w:p>
+        </w:tc>
+        <w:tc>
+          <w:tcPr>
+            <w:tcW w:type="dxa" w:w="1994"/>
+          </w:tcPr>
+          <w:p>
+            <w:r>
+              <w:t>0.265</w:t>
+            </w:r>
+          </w:p>
+        </w:tc>
+        <w:tc>
+          <w:tcPr>
+            <w:tcW w:type="dxa" w:w="1994"/>
+          </w:tcPr>
+          <w:p>
+            <w:r>
+              <w:t>1.070</w:t>
+            </w:r>
+          </w:p>
+        </w:tc>
+        <w:tc>
+          <w:tcPr>
+            <w:tcW w:type="dxa" w:w="1994"/>
+          </w:tcPr>
+          <w:p>
+            <w:r>
+              <w:t>2,308</w:t>
+            </w:r>
+          </w:p>
+        </w:tc>
+      </w:tr>
+    </w:tbl>
+    <w:p>
+      <w:pPr>
+        <w:pStyle w:val="Heading2"/>
+      </w:pPr>
+      <w:r>
+        <w:t>CATI panel: individual weight by round</w:t>
+      </w:r>
+    </w:p>
+    <w:tbl>
+      <w:tblPr>
+        <w:tblStyle w:val="TableGrid"/>
+        <w:tblW w:type="auto" w:w="0"/>
+        <w:tblLook w:firstColumn="1" w:firstRow="1" w:lastColumn="0" w:lastRow="0" w:noHBand="0" w:noVBand="1" w:val="04A0"/>
+      </w:tblPr>
+      <w:tblGrid>
+        <w:gridCol w:w="1425"/>
+        <w:gridCol w:w="1425"/>
+        <w:gridCol w:w="1425"/>
+        <w:gridCol w:w="1425"/>
+        <w:gridCol w:w="1425"/>
+        <w:gridCol w:w="1425"/>
+        <w:gridCol w:w="1425"/>
+      </w:tblGrid>
+      <w:tr>
+        <w:tc>
+          <w:tcPr>
+            <w:tcW w:type="dxa" w:w="1425"/>
+          </w:tcPr>
+          <w:p>
+            <w:r>
+              <w:t>round</w:t>
+            </w:r>
+          </w:p>
+        </w:tc>
+        <w:tc>
+          <w:tcPr>
+            <w:tcW w:type="dxa" w:w="1425"/>
+          </w:tcPr>
+          <w:p>
+            <w:r>
+              <w:t>N</w:t>
+            </w:r>
+          </w:p>
+        </w:tc>
+        <w:tc>
+          <w:tcPr>
+            <w:tcW w:type="dxa" w:w="1425"/>
+          </w:tcPr>
+          <w:p>
+            <w:r>
+              <w:t>CV</w:t>
+            </w:r>
+          </w:p>
+        </w:tc>
+        <w:tc>
+          <w:tcPr>
+            <w:tcW w:type="dxa" w:w="1425"/>
+          </w:tcPr>
+          <w:p>
+            <w:r>
+              <w:t>DEFFw</w:t>
+            </w:r>
+          </w:p>
+        </w:tc>
+        <w:tc>
+          <w:tcPr>
+            <w:tcW w:type="dxa" w:w="1425"/>
+          </w:tcPr>
+          <w:p>
+            <w:r>
+              <w:t>ESS</w:t>
+            </w:r>
+          </w:p>
+        </w:tc>
+        <w:tc>
+          <w:tcPr>
+            <w:tcW w:type="dxa" w:w="1425"/>
+          </w:tcPr>
+          <w:p>
+            <w:r>
+              <w:t>KishESS</w:t>
+            </w:r>
+          </w:p>
+        </w:tc>
+        <w:tc>
+          <w:tcPr>
+            <w:tcW w:type="dxa" w:w="1425"/>
+          </w:tcPr>
+          <w:p>
+            <w:r>
+              <w:t>sum_indw</w:t>
+            </w:r>
+          </w:p>
+        </w:tc>
+      </w:tr>
+      <w:tr>
+        <w:tc>
+          <w:tcPr>
+            <w:tcW w:type="dxa" w:w="1425"/>
+          </w:tcPr>
+          <w:p>
+            <w:r>
+              <w:t>1</w:t>
+            </w:r>
+          </w:p>
+        </w:tc>
+        <w:tc>
+          <w:tcPr>
+            <w:tcW w:type="dxa" w:w="1425"/>
+          </w:tcPr>
+          <w:p>
+            <w:r>
+              <w:t>5,378</w:t>
+            </w:r>
+          </w:p>
+        </w:tc>
+        <w:tc>
+          <w:tcPr>
+            <w:tcW w:type="dxa" w:w="1425"/>
+          </w:tcPr>
+          <w:p>
+            <w:r>
+              <w:t>0.438</w:t>
+            </w:r>
+          </w:p>
+        </w:tc>
+        <w:tc>
+          <w:tcPr>
+            <w:tcW w:type="dxa" w:w="1425"/>
+          </w:tcPr>
+          <w:p>
+            <w:r>
+              <w:t>1.192</w:t>
+            </w:r>
+          </w:p>
+        </w:tc>
+        <w:tc>
+          <w:tcPr>
+            <w:tcW w:type="dxa" w:w="1425"/>
+          </w:tcPr>
+          <w:p>
+            <w:r>
+              <w:t>4,513</w:t>
+            </w:r>
+          </w:p>
+        </w:tc>
+        <w:tc>
+          <w:tcPr>
+            <w:tcW w:type="dxa" w:w="1425"/>
+          </w:tcPr>
+          <w:p>
+            <w:r>
+              <w:t>4,513</w:t>
+            </w:r>
+          </w:p>
+        </w:tc>
+        <w:tc>
+          <w:tcPr>
+            <w:tcW w:type="dxa" w:w="1425"/>
+          </w:tcPr>
+          <w:p>
+            <w:r>
+              <w:t>108,667,043</w:t>
+            </w:r>
+          </w:p>
+        </w:tc>
+      </w:tr>
+      <w:tr>
+        <w:tc>
+          <w:tcPr>
+            <w:tcW w:type="dxa" w:w="1425"/>
+          </w:tcPr>
+          <w:p>
+            <w:r>
+              <w:t>2</w:t>
+            </w:r>
+          </w:p>
+        </w:tc>
+        <w:tc>
+          <w:tcPr>
+            <w:tcW w:type="dxa" w:w="1425"/>
+          </w:tcPr>
+          <w:p>
+            <w:r>
+              <w:t>5,353</w:t>
+            </w:r>
+          </w:p>
+        </w:tc>
+        <w:tc>
+          <w:tcPr>
+            <w:tcW w:type="dxa" w:w="1425"/>
+          </w:tcPr>
+          <w:p>
+            <w:r>
+              <w:t>0.388</w:t>
+            </w:r>
+          </w:p>
+        </w:tc>
+        <w:tc>
+          <w:tcPr>
+            <w:tcW w:type="dxa" w:w="1425"/>
+          </w:tcPr>
+          <w:p>
+            <w:r>
+              <w:t>1.150</w:t>
+            </w:r>
+          </w:p>
+        </w:tc>
+        <w:tc>
+          <w:tcPr>
+            <w:tcW w:type="dxa" w:w="1425"/>
+          </w:tcPr>
+          <w:p>
+            <w:r>
+              <w:t>4,654</w:t>
+            </w:r>
+          </w:p>
+        </w:tc>
+        <w:tc>
+          <w:tcPr>
+            <w:tcW w:type="dxa" w:w="1425"/>
+          </w:tcPr>
+          <w:p>
+            <w:r>
+              <w:t>4,654</w:t>
+            </w:r>
+          </w:p>
+        </w:tc>
+        <w:tc>
+          <w:tcPr>
+            <w:tcW w:type="dxa" w:w="1425"/>
+          </w:tcPr>
+          <w:p>
+            <w:r>
+              <w:t>108,667,043</w:t>
+            </w:r>
+          </w:p>
+        </w:tc>
+      </w:tr>
+      <w:tr>
+        <w:tc>
+          <w:tcPr>
+            <w:tcW w:type="dxa" w:w="1425"/>
+          </w:tcPr>
+          <w:p>
+            <w:r>
+              <w:t>3</w:t>
+            </w:r>
+          </w:p>
+        </w:tc>
+        <w:tc>
+          <w:tcPr>
+            <w:tcW w:type="dxa" w:w="1425"/>
+          </w:tcPr>
+          <w:p>
+            <w:r>
+              <w:t>5,225</w:t>
+            </w:r>
+          </w:p>
+        </w:tc>
+        <w:tc>
+          <w:tcPr>
+            <w:tcW w:type="dxa" w:w="1425"/>
+          </w:tcPr>
+          <w:p>
+            <w:r>
+              <w:t>0.503</w:t>
+            </w:r>
+          </w:p>
+        </w:tc>
+        <w:tc>
+          <w:tcPr>
+            <w:tcW w:type="dxa" w:w="1425"/>
+          </w:tcPr>
+          <w:p>
+            <w:r>
+              <w:t>1.253</w:t>
+            </w:r>
+          </w:p>
+        </w:tc>
+        <w:tc>
+          <w:tcPr>
+            <w:tcW w:type="dxa" w:w="1425"/>
+          </w:tcPr>
+          <w:p>
+            <w:r>
+              <w:t>4,170</w:t>
+            </w:r>
+          </w:p>
+        </w:tc>
+        <w:tc>
+          <w:tcPr>
+            <w:tcW w:type="dxa" w:w="1425"/>
+          </w:tcPr>
+          <w:p>
+            <w:r>
+              <w:t>4,170</w:t>
+            </w:r>
+          </w:p>
+        </w:tc>
+        <w:tc>
+          <w:tcPr>
+            <w:tcW w:type="dxa" w:w="1425"/>
+          </w:tcPr>
+          <w:p>
+            <w:r>
+              <w:t>108,667,043</w:t>
+            </w:r>
+          </w:p>
+        </w:tc>
+      </w:tr>
+      <w:tr>
+        <w:tc>
+          <w:tcPr>
+            <w:tcW w:type="dxa" w:w="1425"/>
+          </w:tcPr>
+          <w:p>
+            <w:r>
+              <w:t>4</w:t>
+            </w:r>
+          </w:p>
+        </w:tc>
+        <w:tc>
+          <w:tcPr>
+            <w:tcW w:type="dxa" w:w="1425"/>
+          </w:tcPr>
+          <w:p>
+            <w:r>
+              <w:t>5,572</w:t>
+            </w:r>
+          </w:p>
+        </w:tc>
+        <w:tc>
+          <w:tcPr>
+            <w:tcW w:type="dxa" w:w="1425"/>
+          </w:tcPr>
+          <w:p>
+            <w:r>
+              <w:t>0.431</w:t>
+            </w:r>
+          </w:p>
+        </w:tc>
+        <w:tc>
+          <w:tcPr>
+            <w:tcW w:type="dxa" w:w="1425"/>
+          </w:tcPr>
+          <w:p>
+            <w:r>
+              <w:t>1.186</w:t>
+            </w:r>
+          </w:p>
+        </w:tc>
+        <w:tc>
+          <w:tcPr>
+            <w:tcW w:type="dxa" w:w="1425"/>
+          </w:tcPr>
+          <w:p>
+            <w:r>
+              <w:t>4,698</w:t>
+            </w:r>
+          </w:p>
+        </w:tc>
+        <w:tc>
+          <w:tcPr>
+            <w:tcW w:type="dxa" w:w="1425"/>
+          </w:tcPr>
+          <w:p>
+            <w:r>
+              <w:t>4,698</w:t>
+            </w:r>
+          </w:p>
+        </w:tc>
+        <w:tc>
+          <w:tcPr>
+            <w:tcW w:type="dxa" w:w="1425"/>
+          </w:tcPr>
+          <w:p>
+            <w:r>
+              <w:t>108,667,042</w:t>
+            </w:r>
+          </w:p>
+        </w:tc>
+      </w:tr>
+      <w:tr>
+        <w:tc>
+          <w:tcPr>
+            <w:tcW w:type="dxa" w:w="1425"/>
+          </w:tcPr>
+          <w:p>
+            <w:r>
+              <w:t>5</w:t>
+            </w:r>
+          </w:p>
+        </w:tc>
+        <w:tc>
+          <w:tcPr>
+            <w:tcW w:type="dxa" w:w="1425"/>
+          </w:tcPr>
+          <w:p>
+            <w:r>
+              <w:t>5,347</w:t>
+            </w:r>
+          </w:p>
+        </w:tc>
+        <w:tc>
+          <w:tcPr>
+            <w:tcW w:type="dxa" w:w="1425"/>
+          </w:tcPr>
+          <w:p>
+            <w:r>
+              <w:t>0.450</w:t>
+            </w:r>
+          </w:p>
+        </w:tc>
+        <w:tc>
+          <w:tcPr>
+            <w:tcW w:type="dxa" w:w="1425"/>
+          </w:tcPr>
+          <w:p>
+            <w:r>
+              <w:t>1.202</w:t>
+            </w:r>
+          </w:p>
+        </w:tc>
+        <w:tc>
+          <w:tcPr>
+            <w:tcW w:type="dxa" w:w="1425"/>
+          </w:tcPr>
+          <w:p>
+            <w:r>
+              <w:t>4,447</w:t>
+            </w:r>
+          </w:p>
+        </w:tc>
+        <w:tc>
+          <w:tcPr>
+            <w:tcW w:type="dxa" w:w="1425"/>
+          </w:tcPr>
+          <w:p>
+            <w:r>
+              <w:t>4,447</w:t>
+            </w:r>
+          </w:p>
+        </w:tc>
+        <w:tc>
+          <w:tcPr>
+            <w:tcW w:type="dxa" w:w="1425"/>
+          </w:tcPr>
+          <w:p>
+            <w:r>
+              <w:t>108,667,043</w:t>
+            </w:r>
+          </w:p>
+        </w:tc>
+      </w:tr>
+      <w:tr>
+        <w:tc>
+          <w:tcPr>
+            <w:tcW w:type="dxa" w:w="1425"/>
+          </w:tcPr>
+          <w:p>
+            <w:r>
+              <w:t>6</w:t>
+            </w:r>
+          </w:p>
+        </w:tc>
+        <w:tc>
+          <w:tcPr>
+            <w:tcW w:type="dxa" w:w="1425"/>
+          </w:tcPr>
+          <w:p>
+            <w:r>
+              <w:t>5,261</w:t>
+            </w:r>
+          </w:p>
+        </w:tc>
+        <w:tc>
+          <w:tcPr>
+            <w:tcW w:type="dxa" w:w="1425"/>
+          </w:tcPr>
+          <w:p>
+            <w:r>
+              <w:t>0.432</w:t>
+            </w:r>
+          </w:p>
+        </w:tc>
+        <w:tc>
+          <w:tcPr>
+            <w:tcW w:type="dxa" w:w="1425"/>
+          </w:tcPr>
+          <w:p>
+            <w:r>
+              <w:t>1.187</w:t>
+            </w:r>
+          </w:p>
+        </w:tc>
+        <w:tc>
+          <w:tcPr>
+            <w:tcW w:type="dxa" w:w="1425"/>
+          </w:tcPr>
+          <w:p>
+            <w:r>
+              <w:t>4,434</w:t>
+            </w:r>
+          </w:p>
+        </w:tc>
+        <w:tc>
+          <w:tcPr>
+            <w:tcW w:type="dxa" w:w="1425"/>
+          </w:tcPr>
+          <w:p>
+            <w:r>
+              <w:t>4,434</w:t>
+            </w:r>
+          </w:p>
+        </w:tc>
+        <w:tc>
+          <w:tcPr>
+            <w:tcW w:type="dxa" w:w="1425"/>
+          </w:tcPr>
+          <w:p>
+            <w:r>
+              <w:t>108,667,043</w:t>
+            </w:r>
+          </w:p>
+        </w:tc>
+      </w:tr>
+      <w:tr>
+        <w:tc>
+          <w:tcPr>
+            <w:tcW w:type="dxa" w:w="1425"/>
+          </w:tcPr>
+          <w:p>
+            <w:r>
+              <w:t>7</w:t>
+            </w:r>
+          </w:p>
+        </w:tc>
+        <w:tc>
+          <w:tcPr>
+            <w:tcW w:type="dxa" w:w="1425"/>
+          </w:tcPr>
+          <w:p>
+            <w:r>
+              <w:t>5,046</w:t>
+            </w:r>
+          </w:p>
+        </w:tc>
+        <w:tc>
+          <w:tcPr>
+            <w:tcW w:type="dxa" w:w="1425"/>
+          </w:tcPr>
+          <w:p>
+            <w:r>
+              <w:t>0.449</w:t>
+            </w:r>
+          </w:p>
+        </w:tc>
+        <w:tc>
+          <w:tcPr>
+            <w:tcW w:type="dxa" w:w="1425"/>
+          </w:tcPr>
+          <w:p>
+            <w:r>
+              <w:t>1.202</w:t>
+            </w:r>
+          </w:p>
+        </w:tc>
+        <w:tc>
+          <w:tcPr>
+            <w:tcW w:type="dxa" w:w="1425"/>
+          </w:tcPr>
+          <w:p>
+            <w:r>
+              <w:t>4,199</w:t>
+            </w:r>
+          </w:p>
+        </w:tc>
+        <w:tc>
+          <w:tcPr>
+            <w:tcW w:type="dxa" w:w="1425"/>
+          </w:tcPr>
+          <w:p>
+            <w:r>
+              <w:t>4,199</w:t>
+            </w:r>
+          </w:p>
+        </w:tc>
+        <w:tc>
+          <w:tcPr>
+            <w:tcW w:type="dxa" w:w="1425"/>
+          </w:tcPr>
+          <w:p>
+            <w:r>
+              <w:t>108,667,043</w:t>
+            </w:r>
+          </w:p>
+        </w:tc>
+      </w:tr>
+      <w:tr>
+        <w:tc>
+          <w:tcPr>
+            <w:tcW w:type="dxa" w:w="1425"/>
+          </w:tcPr>
+          <w:p>
+            <w:r>
+              <w:t>8</w:t>
+            </w:r>
+          </w:p>
+        </w:tc>
+        <w:tc>
+          <w:tcPr>
+            <w:tcW w:type="dxa" w:w="1425"/>
+          </w:tcPr>
+          <w:p>
+            <w:r>
+              <w:t>5,013</w:t>
+            </w:r>
+          </w:p>
+        </w:tc>
+        <w:tc>
+          <w:tcPr>
+            <w:tcW w:type="dxa" w:w="1425"/>
+          </w:tcPr>
+          <w:p>
+            <w:r>
+              <w:t>0.488</w:t>
+            </w:r>
+          </w:p>
+        </w:tc>
+        <w:tc>
+          <w:tcPr>
+            <w:tcW w:type="dxa" w:w="1425"/>
+          </w:tcPr>
+          <w:p>
+            <w:r>
+              <w:t>1.239</w:t>
+            </w:r>
+          </w:p>
+        </w:tc>
+        <w:tc>
+          <w:tcPr>
+            <w:tcW w:type="dxa" w:w="1425"/>
+          </w:tcPr>
+          <w:p>
+            <w:r>
+              <w:t>4,047</w:t>
+            </w:r>
+          </w:p>
+        </w:tc>
+        <w:tc>
+          <w:tcPr>
+            <w:tcW w:type="dxa" w:w="1425"/>
+          </w:tcPr>
+          <w:p>
+            <w:r>
+              <w:t>4,047</w:t>
+            </w:r>
+          </w:p>
+        </w:tc>
+        <w:tc>
+          <w:tcPr>
+            <w:tcW w:type="dxa" w:w="1425"/>
+          </w:tcPr>
+          <w:p>
+            <w:r>
+              <w:t>108,667,043</w:t>
+            </w:r>
+          </w:p>
+        </w:tc>
+      </w:tr>
+    </w:tbl>
+    <w:p>
+      <w:pPr>
+        <w:pStyle w:val="Heading2"/>
+      </w:pPr>
+      <w:r>
+        <w:t>CATI panel: household and population weight by round</w:t>
+      </w:r>
+    </w:p>
+    <w:tbl>
+      <w:tblPr>
+        <w:tblStyle w:val="TableGrid"/>
+        <w:tblW w:type="auto" w:w="0"/>
+        <w:tblLook w:firstColumn="1" w:firstRow="1" w:lastColumn="0" w:lastRow="0" w:noHBand="0" w:noVBand="1" w:val="04A0"/>
+      </w:tblPr>
+      <w:tblGrid>
+        <w:gridCol w:w="1425"/>
+        <w:gridCol w:w="1425"/>
+        <w:gridCol w:w="1425"/>
+        <w:gridCol w:w="1425"/>
+        <w:gridCol w:w="1425"/>
+        <w:gridCol w:w="1425"/>
+        <w:gridCol w:w="1425"/>
+      </w:tblGrid>
+      <w:tr>
+        <w:tc>
+          <w:tcPr>
+            <w:tcW w:type="dxa" w:w="1425"/>
+          </w:tcPr>
+          <w:p>
+            <w:r>
+              <w:t>round</w:t>
+            </w:r>
+          </w:p>
+        </w:tc>
+        <w:tc>
+          <w:tcPr>
+            <w:tcW w:type="dxa" w:w="1425"/>
+          </w:tcPr>
+          <w:p>
+            <w:r>
+              <w:t>N_hh</w:t>
+            </w:r>
+          </w:p>
+        </w:tc>
+        <w:tc>
+          <w:tcPr>
+            <w:tcW w:type="dxa" w:w="1425"/>
+          </w:tcPr>
+          <w:p>
+            <w:r>
+              <w:t>CV_hhw</w:t>
+            </w:r>
+          </w:p>
+        </w:tc>
+        <w:tc>
+          <w:tcPr>
+            <w:tcW w:type="dxa" w:w="1425"/>
+          </w:tcPr>
+          <w:p>
+            <w:r>
+              <w:t>DEFFw_hhw</w:t>
+            </w:r>
+          </w:p>
+        </w:tc>
+        <w:tc>
+          <w:tcPr>
+            <w:tcW w:type="dxa" w:w="1425"/>
+          </w:tcPr>
+          <w:p>
+            <w:r>
+              <w:t>ESS_hhw</w:t>
+            </w:r>
+          </w:p>
+        </w:tc>
+        <w:tc>
+          <w:tcPr>
+            <w:tcW w:type="dxa" w:w="1425"/>
+          </w:tcPr>
+          <w:p>
+            <w:r>
+              <w:t>CV_popw</w:t>
+            </w:r>
+          </w:p>
+        </w:tc>
+        <w:tc>
+          <w:tcPr>
+            <w:tcW w:type="dxa" w:w="1425"/>
+          </w:tcPr>
+          <w:p>
+            <w:r>
+              <w:t>ESS_popw</w:t>
+            </w:r>
+          </w:p>
+        </w:tc>
+      </w:tr>
+      <w:tr>
+        <w:tc>
+          <w:tcPr>
+            <w:tcW w:type="dxa" w:w="1425"/>
+          </w:tcPr>
+          <w:p>
+            <w:r>
+              <w:t>1</w:t>
+            </w:r>
+          </w:p>
+        </w:tc>
+        <w:tc>
+          <w:tcPr>
+            <w:tcW w:type="dxa" w:w="1425"/>
+          </w:tcPr>
+          <w:p>
+            <w:r>
+              <w:t>1,239</w:t>
+            </w:r>
+          </w:p>
+        </w:tc>
+        <w:tc>
+          <w:tcPr>
+            <w:tcW w:type="dxa" w:w="1425"/>
+          </w:tcPr>
+          <w:p>
+            <w:r>
+              <w:t>0.346</w:t>
+            </w:r>
+          </w:p>
+        </w:tc>
+        <w:tc>
+          <w:tcPr>
+            <w:tcW w:type="dxa" w:w="1425"/>
+          </w:tcPr>
+          <w:p>
+            <w:r>
+              <w:t>1.120</w:t>
+            </w:r>
+          </w:p>
+        </w:tc>
+        <w:tc>
+          <w:tcPr>
+            <w:tcW w:type="dxa" w:w="1425"/>
+          </w:tcPr>
+          <w:p>
+            <w:r>
+              <w:t>1,107</w:t>
+            </w:r>
+          </w:p>
+        </w:tc>
+        <w:tc>
+          <w:tcPr>
+            <w:tcW w:type="dxa" w:w="1425"/>
+          </w:tcPr>
+          <w:p>
+            <w:r>
+              <w:t>0.631</w:t>
+            </w:r>
+          </w:p>
+        </w:tc>
+        <w:tc>
+          <w:tcPr>
+            <w:tcW w:type="dxa" w:w="1425"/>
+          </w:tcPr>
+          <w:p>
+            <w:r>
+              <w:t>886</w:t>
+            </w:r>
+          </w:p>
+        </w:tc>
+      </w:tr>
+      <w:tr>
+        <w:tc>
+          <w:tcPr>
+            <w:tcW w:type="dxa" w:w="1425"/>
+          </w:tcPr>
+          <w:p>
+            <w:r>
+              <w:t>2</w:t>
+            </w:r>
+          </w:p>
+        </w:tc>
+        <w:tc>
+          <w:tcPr>
+            <w:tcW w:type="dxa" w:w="1425"/>
+          </w:tcPr>
+          <w:p>
+            <w:r>
+              <w:t>1,193</w:t>
+            </w:r>
+          </w:p>
+        </w:tc>
+        <w:tc>
+          <w:tcPr>
+            <w:tcW w:type="dxa" w:w="1425"/>
+          </w:tcPr>
+          <w:p>
+            <w:r>
+              <w:t>0.305</w:t>
+            </w:r>
+          </w:p>
+        </w:tc>
+        <w:tc>
+          <w:tcPr>
+            <w:tcW w:type="dxa" w:w="1425"/>
+          </w:tcPr>
+          <w:p>
+            <w:r>
+              <w:t>1.093</w:t>
+            </w:r>
+          </w:p>
+        </w:tc>
+        <w:tc>
+          <w:tcPr>
+            <w:tcW w:type="dxa" w:w="1425"/>
+          </w:tcPr>
+          <w:p>
+            <w:r>
+              <w:t>1,091</w:t>
+            </w:r>
+          </w:p>
+        </w:tc>
+        <w:tc>
+          <w:tcPr>
+            <w:tcW w:type="dxa" w:w="1425"/>
+          </w:tcPr>
+          <w:p>
+            <w:r>
+              <w:t>0.567</w:t>
+            </w:r>
+          </w:p>
+        </w:tc>
+        <w:tc>
+          <w:tcPr>
+            <w:tcW w:type="dxa" w:w="1425"/>
+          </w:tcPr>
+          <w:p>
+            <w:r>
+              <w:t>902</w:t>
+            </w:r>
+          </w:p>
+        </w:tc>
+      </w:tr>
+      <w:tr>
+        <w:tc>
+          <w:tcPr>
+            <w:tcW w:type="dxa" w:w="1425"/>
+          </w:tcPr>
+          <w:p>
+            <w:r>
+              <w:t>3</w:t>
+            </w:r>
+          </w:p>
+        </w:tc>
+        <w:tc>
+          <w:tcPr>
+            <w:tcW w:type="dxa" w:w="1425"/>
+          </w:tcPr>
+          <w:p>
+            <w:r>
+              <w:t>1,174</w:t>
+            </w:r>
+          </w:p>
+        </w:tc>
+        <w:tc>
+          <w:tcPr>
+            <w:tcW w:type="dxa" w:w="1425"/>
+          </w:tcPr>
+          <w:p>
+            <w:r>
+              <w:t>0.433</w:t>
+            </w:r>
+          </w:p>
+        </w:tc>
+        <w:tc>
+          <w:tcPr>
+            <w:tcW w:type="dxa" w:w="1425"/>
+          </w:tcPr>
+          <w:p>
+            <w:r>
+              <w:t>1.187</w:t>
+            </w:r>
+          </w:p>
+        </w:tc>
+        <w:tc>
+          <w:tcPr>
+            <w:tcW w:type="dxa" w:w="1425"/>
+          </w:tcPr>
+          <w:p>
+            <w:r>
+              <w:t>989</w:t>
+            </w:r>
+          </w:p>
+        </w:tc>
+        <w:tc>
+          <w:tcPr>
+            <w:tcW w:type="dxa" w:w="1425"/>
+          </w:tcPr>
+          <w:p>
+            <w:r>
+              <w:t>0.667</w:t>
+            </w:r>
+          </w:p>
+        </w:tc>
+        <w:tc>
+          <w:tcPr>
+            <w:tcW w:type="dxa" w:w="1425"/>
+          </w:tcPr>
+          <w:p>
+            <w:r>
+              <w:t>813</w:t>
+            </w:r>
+          </w:p>
+        </w:tc>
+      </w:tr>
+      <w:tr>
+        <w:tc>
+          <w:tcPr>
+            <w:tcW w:type="dxa" w:w="1425"/>
+          </w:tcPr>
+          <w:p>
+            <w:r>
+              <w:t>4</w:t>
+            </w:r>
+          </w:p>
+        </w:tc>
+        <w:tc>
+          <w:tcPr>
+            <w:tcW w:type="dxa" w:w="1425"/>
+          </w:tcPr>
+          <w:p>
+            <w:r>
+              <w:t>1,243</w:t>
+            </w:r>
+          </w:p>
+        </w:tc>
+        <w:tc>
+          <w:tcPr>
+            <w:tcW w:type="dxa" w:w="1425"/>
+          </w:tcPr>
+          <w:p>
+            <w:r>
+              <w:t>0.362</w:t>
+            </w:r>
+          </w:p>
+        </w:tc>
+        <w:tc>
+          <w:tcPr>
+            <w:tcW w:type="dxa" w:w="1425"/>
+          </w:tcPr>
+          <w:p>
+            <w:r>
+              <w:t>1.131</w:t>
+            </w:r>
+          </w:p>
+        </w:tc>
+        <w:tc>
+          <w:tcPr>
+            <w:tcW w:type="dxa" w:w="1425"/>
+          </w:tcPr>
+          <w:p>
+            <w:r>
+              <w:t>1,099</w:t>
+            </w:r>
+          </w:p>
+        </w:tc>
+        <w:tc>
+          <w:tcPr>
+            <w:tcW w:type="dxa" w:w="1425"/>
+          </w:tcPr>
+          <w:p>
+            <w:r>
+              <w:t>0.613</w:t>
+            </w:r>
+          </w:p>
+        </w:tc>
+        <w:tc>
+          <w:tcPr>
+            <w:tcW w:type="dxa" w:w="1425"/>
+          </w:tcPr>
+          <w:p>
+            <w:r>
+              <w:t>903</w:t>
+            </w:r>
+          </w:p>
+        </w:tc>
+      </w:tr>
+      <w:tr>
+        <w:tc>
+          <w:tcPr>
+            <w:tcW w:type="dxa" w:w="1425"/>
+          </w:tcPr>
+          <w:p>
+            <w:r>
+              <w:t>5</w:t>
+            </w:r>
+          </w:p>
+        </w:tc>
+        <w:tc>
+          <w:tcPr>
+            <w:tcW w:type="dxa" w:w="1425"/>
+          </w:tcPr>
+          <w:p>
+            <w:r>
+              <w:t>1,184</w:t>
+            </w:r>
+          </w:p>
+        </w:tc>
+        <w:tc>
+          <w:tcPr>
+            <w:tcW w:type="dxa" w:w="1425"/>
+          </w:tcPr>
+          <w:p>
+            <w:r>
+              <w:t>0.362</w:t>
+            </w:r>
+          </w:p>
+        </w:tc>
+        <w:tc>
+          <w:tcPr>
+            <w:tcW w:type="dxa" w:w="1425"/>
+          </w:tcPr>
+          <w:p>
+            <w:r>
+              <w:t>1.131</w:t>
+            </w:r>
+          </w:p>
+        </w:tc>
+        <w:tc>
+          <w:tcPr>
+            <w:tcW w:type="dxa" w:w="1425"/>
+          </w:tcPr>
+          <w:p>
+            <w:r>
+              <w:t>1,047</w:t>
+            </w:r>
+          </w:p>
+        </w:tc>
+        <w:tc>
+          <w:tcPr>
+            <w:tcW w:type="dxa" w:w="1425"/>
+          </w:tcPr>
+          <w:p>
+            <w:r>
+              <w:t>0.611</w:t>
+            </w:r>
+          </w:p>
+        </w:tc>
+        <w:tc>
+          <w:tcPr>
+            <w:tcW w:type="dxa" w:w="1425"/>
+          </w:tcPr>
+          <w:p>
+            <w:r>
+              <w:t>862</w:t>
+            </w:r>
+          </w:p>
+        </w:tc>
+      </w:tr>
+      <w:tr>
+        <w:tc>
+          <w:tcPr>
+            <w:tcW w:type="dxa" w:w="1425"/>
+          </w:tcPr>
+          <w:p>
+            <w:r>
+              <w:t>6</w:t>
+            </w:r>
+          </w:p>
+        </w:tc>
+        <w:tc>
+          <w:tcPr>
+            <w:tcW w:type="dxa" w:w="1425"/>
+          </w:tcPr>
+          <w:p>
+            <w:r>
+              <w:t>1,157</w:t>
+            </w:r>
+          </w:p>
+        </w:tc>
+        <w:tc>
+          <w:tcPr>
+            <w:tcW w:type="dxa" w:w="1425"/>
+          </w:tcPr>
+          <w:p>
+            <w:r>
+              <w:t>0.352</w:t>
+            </w:r>
+          </w:p>
+        </w:tc>
+        <w:tc>
+          <w:tcPr>
+            <w:tcW w:type="dxa" w:w="1425"/>
+          </w:tcPr>
+          <w:p>
+            <w:r>
+              <w:t>1.124</w:t>
+            </w:r>
+          </w:p>
+        </w:tc>
+        <w:tc>
+          <w:tcPr>
+            <w:tcW w:type="dxa" w:w="1425"/>
+          </w:tcPr>
+          <w:p>
+            <w:r>
+              <w:t>1,029</w:t>
+            </w:r>
+          </w:p>
+        </w:tc>
+        <w:tc>
+          <w:tcPr>
+            <w:tcW w:type="dxa" w:w="1425"/>
+          </w:tcPr>
+          <w:p>
+            <w:r>
+              <w:t>0.602</w:t>
+            </w:r>
+          </w:p>
+        </w:tc>
+        <w:tc>
+          <w:tcPr>
+            <w:tcW w:type="dxa" w:w="1425"/>
+          </w:tcPr>
+          <w:p>
+            <w:r>
+              <w:t>849</w:t>
+            </w:r>
+          </w:p>
+        </w:tc>
+      </w:tr>
+      <w:tr>
+        <w:tc>
+          <w:tcPr>
+            <w:tcW w:type="dxa" w:w="1425"/>
+          </w:tcPr>
+          <w:p>
+            <w:r>
+              <w:t>7</w:t>
+            </w:r>
+          </w:p>
+        </w:tc>
+        <w:tc>
+          <w:tcPr>
+            <w:tcW w:type="dxa" w:w="1425"/>
+          </w:tcPr>
+          <w:p>
+            <w:r>
+              <w:t>1,112</w:t>
+            </w:r>
+          </w:p>
+        </w:tc>
+        <w:tc>
+          <w:tcPr>
+            <w:tcW w:type="dxa" w:w="1425"/>
+          </w:tcPr>
+          <w:p>
+            <w:r>
+              <w:t>0.354</w:t>
+            </w:r>
+          </w:p>
+        </w:tc>
+        <w:tc>
+          <w:tcPr>
+            <w:tcW w:type="dxa" w:w="1425"/>
+          </w:tcPr>
+          <w:p>
+            <w:r>
+              <w:t>1.125</w:t>
+            </w:r>
+          </w:p>
+        </w:tc>
+        <w:tc>
+          <w:tcPr>
+            <w:tcW w:type="dxa" w:w="1425"/>
+          </w:tcPr>
+          <w:p>
+            <w:r>
+              <w:t>988</w:t>
+            </w:r>
+          </w:p>
+        </w:tc>
+        <w:tc>
+          <w:tcPr>
+            <w:tcW w:type="dxa" w:w="1425"/>
+          </w:tcPr>
+          <w:p>
+            <w:r>
+              <w:t>0.597</w:t>
+            </w:r>
+          </w:p>
+        </w:tc>
+        <w:tc>
+          <w:tcPr>
+            <w:tcW w:type="dxa" w:w="1425"/>
+          </w:tcPr>
+          <w:p>
+            <w:r>
+              <w:t>820</w:t>
+            </w:r>
+          </w:p>
+        </w:tc>
+      </w:tr>
+      <w:tr>
+        <w:tc>
+          <w:tcPr>
+            <w:tcW w:type="dxa" w:w="1425"/>
+          </w:tcPr>
+          <w:p>
+            <w:r>
+              <w:t>8</w:t>
+            </w:r>
+          </w:p>
+        </w:tc>
+        <w:tc>
+          <w:tcPr>
+            <w:tcW w:type="dxa" w:w="1425"/>
+          </w:tcPr>
+          <w:p>
+            <w:r>
+              <w:t>1,115</w:t>
+            </w:r>
+          </w:p>
+        </w:tc>
+        <w:tc>
+          <w:tcPr>
+            <w:tcW w:type="dxa" w:w="1425"/>
+          </w:tcPr>
+          <w:p>
+            <w:r>
+              <w:t>0.359</w:t>
+            </w:r>
+          </w:p>
+        </w:tc>
+        <w:tc>
+          <w:tcPr>
+            <w:tcW w:type="dxa" w:w="1425"/>
+          </w:tcPr>
+          <w:p>
+            <w:r>
+              <w:t>1.129</w:t>
+            </w:r>
+          </w:p>
+        </w:tc>
+        <w:tc>
+          <w:tcPr>
+            <w:tcW w:type="dxa" w:w="1425"/>
+          </w:tcPr>
+          <w:p>
+            <w:r>
+              <w:t>988</w:t>
+            </w:r>
+          </w:p>
+        </w:tc>
+        <w:tc>
+          <w:tcPr>
+            <w:tcW w:type="dxa" w:w="1425"/>
+          </w:tcPr>
+          <w:p>
+            <w:r>
+              <w:t>0.613</w:t>
+            </w:r>
+          </w:p>
+        </w:tc>
+        <w:tc>
+          <w:tcPr>
+            <w:tcW w:type="dxa" w:w="1425"/>
+          </w:tcPr>
+          <w:p>
+            <w:r>
+              <w:t>811</w:t>
+            </w:r>
+          </w:p>
+        </w:tc>
+      </w:tr>
+    </w:tbl>
+    <w:p>
+      <w:pPr>
+        <w:pStyle w:val="Heading2"/>
+      </w:pPr>
+      <w:r>
+        <w:t>CATI panel: composition stability by round</w:t>
+      </w:r>
+    </w:p>
+    <w:tbl>
+      <w:tblPr>
+        <w:tblStyle w:val="TableGrid"/>
+        <w:tblW w:type="auto" w:w="0"/>
+        <w:tblLook w:firstColumn="1" w:firstRow="1" w:lastColumn="0" w:lastRow="0" w:noHBand="0" w:noVBand="1" w:val="04A0"/>
+      </w:tblPr>
+      <w:tblGrid>
+        <w:gridCol w:w="1994"/>
+        <w:gridCol w:w="1994"/>
+        <w:gridCol w:w="1994"/>
+        <w:gridCol w:w="1994"/>
+        <w:gridCol w:w="1994"/>
+      </w:tblGrid>
+      <w:tr>
+        <w:tc>
+          <w:tcPr>
+            <w:tcW w:type="dxa" w:w="1994"/>
+          </w:tcPr>
+          <w:p>
+            <w:r>
+              <w:t>round</w:t>
+            </w:r>
+          </w:p>
+        </w:tc>
+        <w:tc>
+          <w:tcPr>
+            <w:tcW w:type="dxa" w:w="1994"/>
+          </w:tcPr>
+          <w:p>
+            <w:r>
+              <w:t>n_hh</w:t>
+            </w:r>
+          </w:p>
+        </w:tc>
+        <w:tc>
+          <w:tcPr>
+            <w:tcW w:type="dxa" w:w="1994"/>
+          </w:tcPr>
+          <w:p>
+            <w:r>
+              <w:t>urban_share</w:t>
+            </w:r>
+          </w:p>
+        </w:tc>
+        <w:tc>
+          <w:tcPr>
+            <w:tcW w:type="dxa" w:w="1994"/>
+          </w:tcPr>
+          <w:p>
+            <w:r>
+              <w:t>q1_share</w:t>
+            </w:r>
+          </w:p>
+        </w:tc>
+        <w:tc>
+          <w:tcPr>
+            <w:tcW w:type="dxa" w:w="1994"/>
+          </w:tcPr>
+          <w:p>
+            <w:r>
+              <w:t>q5_share</w:t>
+            </w:r>
+          </w:p>
+        </w:tc>
+      </w:tr>
+      <w:tr>
+        <w:tc>
+          <w:tcPr>
+            <w:tcW w:type="dxa" w:w="1994"/>
+          </w:tcPr>
+          <w:p>
+            <w:r>
+              <w:t>1</w:t>
+            </w:r>
+          </w:p>
+        </w:tc>
+        <w:tc>
+          <w:tcPr>
+            <w:tcW w:type="dxa" w:w="1994"/>
+          </w:tcPr>
+          <w:p>
+            <w:r>
+              <w:t>1,239</w:t>
+            </w:r>
+          </w:p>
+        </w:tc>
+        <w:tc>
+          <w:tcPr>
+            <w:tcW w:type="dxa" w:w="1994"/>
+          </w:tcPr>
+          <w:p>
+            <w:r>
+              <w:t>0.552</w:t>
+            </w:r>
+          </w:p>
+        </w:tc>
+        <w:tc>
+          <w:tcPr>
+            <w:tcW w:type="dxa" w:w="1994"/>
+          </w:tcPr>
+          <w:p>
+            <w:r>
+              <w:t>0.220</w:t>
+            </w:r>
+          </w:p>
+        </w:tc>
+        <w:tc>
+          <w:tcPr>
+            <w:tcW w:type="dxa" w:w="1994"/>
+          </w:tcPr>
+          <w:p>
+            <w:r>
+              <w:t>0.176</w:t>
+            </w:r>
+          </w:p>
+        </w:tc>
+      </w:tr>
+      <w:tr>
+        <w:tc>
+          <w:tcPr>
+            <w:tcW w:type="dxa" w:w="1994"/>
+          </w:tcPr>
+          <w:p>
+            <w:r>
+              <w:t>2</w:t>
+            </w:r>
+          </w:p>
+        </w:tc>
+        <w:tc>
+          <w:tcPr>
+            <w:tcW w:type="dxa" w:w="1994"/>
+          </w:tcPr>
+          <w:p>
+            <w:r>
+              <w:t>1,193</w:t>
+            </w:r>
+          </w:p>
+        </w:tc>
+        <w:tc>
+          <w:tcPr>
+            <w:tcW w:type="dxa" w:w="1994"/>
+          </w:tcPr>
+          <w:p>
+            <w:r>
+              <w:t>0.552</w:t>
+            </w:r>
+          </w:p>
+        </w:tc>
+        <w:tc>
+          <w:tcPr>
+            <w:tcW w:type="dxa" w:w="1994"/>
+          </w:tcPr>
+          <w:p>
+            <w:r>
+              <w:t>0.222</w:t>
+            </w:r>
+          </w:p>
+        </w:tc>
+        <w:tc>
+          <w:tcPr>
+            <w:tcW w:type="dxa" w:w="1994"/>
+          </w:tcPr>
+          <w:p>
+            <w:r>
+              <w:t>0.183</w:t>
+            </w:r>
+          </w:p>
+        </w:tc>
+      </w:tr>
+      <w:tr>
+        <w:tc>
+          <w:tcPr>
+            <w:tcW w:type="dxa" w:w="1994"/>
+          </w:tcPr>
+          <w:p>
+            <w:r>
+              <w:t>3</w:t>
+            </w:r>
+          </w:p>
+        </w:tc>
+        <w:tc>
+          <w:tcPr>
+            <w:tcW w:type="dxa" w:w="1994"/>
+          </w:tcPr>
+          <w:p>
+            <w:r>
+              <w:t>1,174</w:t>
+            </w:r>
+          </w:p>
+        </w:tc>
+        <w:tc>
+          <w:tcPr>
+            <w:tcW w:type="dxa" w:w="1994"/>
+          </w:tcPr>
+          <w:p>
+            <w:r>
+              <w:t>0.552</w:t>
+            </w:r>
+          </w:p>
+        </w:tc>
+        <w:tc>
+          <w:tcPr>
+            <w:tcW w:type="dxa" w:w="1994"/>
+          </w:tcPr>
+          <w:p>
+            <w:r>
+              <w:t>0.224</w:t>
+            </w:r>
+          </w:p>
+        </w:tc>
+        <w:tc>
+          <w:tcPr>
+            <w:tcW w:type="dxa" w:w="1994"/>
+          </w:tcPr>
+          <w:p>
+            <w:r>
+              <w:t>0.179</w:t>
+            </w:r>
+          </w:p>
+        </w:tc>
+      </w:tr>
+      <w:tr>
+        <w:tc>
+          <w:tcPr>
+            <w:tcW w:type="dxa" w:w="1994"/>
+          </w:tcPr>
+          <w:p>
+            <w:r>
+              <w:t>4</w:t>
+            </w:r>
+          </w:p>
+        </w:tc>
+        <w:tc>
+          <w:tcPr>
+            <w:tcW w:type="dxa" w:w="1994"/>
+          </w:tcPr>
+          <w:p>
+            <w:r>
+              <w:t>1,243</w:t>
+            </w:r>
+          </w:p>
+        </w:tc>
+        <w:tc>
+          <w:tcPr>
+            <w:tcW w:type="dxa" w:w="1994"/>
+          </w:tcPr>
+          <w:p>
+            <w:r>
+              <w:t>0.552</w:t>
+            </w:r>
+          </w:p>
+        </w:tc>
+        <w:tc>
+          <w:tcPr>
+            <w:tcW w:type="dxa" w:w="1994"/>
+          </w:tcPr>
+          <w:p>
+            <w:r>
+              <w:t>0.231</w:t>
+            </w:r>
+          </w:p>
+        </w:tc>
+        <w:tc>
+          <w:tcPr>
+            <w:tcW w:type="dxa" w:w="1994"/>
+          </w:tcPr>
+          <w:p>
+            <w:r>
+              <w:t>0.179</w:t>
+            </w:r>
+          </w:p>
+        </w:tc>
+      </w:tr>
+      <w:tr>
+        <w:tc>
+          <w:tcPr>
+            <w:tcW w:type="dxa" w:w="1994"/>
+          </w:tcPr>
+          <w:p>
+            <w:r>
+              <w:t>5</w:t>
+            </w:r>
+          </w:p>
+        </w:tc>
+        <w:tc>
+          <w:tcPr>
+            <w:tcW w:type="dxa" w:w="1994"/>
+          </w:tcPr>
+          <w:p>
+            <w:r>
+              <w:t>1,184</w:t>
+            </w:r>
+          </w:p>
+        </w:tc>
+        <w:tc>
+          <w:tcPr>
+            <w:tcW w:type="dxa" w:w="1994"/>
+          </w:tcPr>
+          <w:p>
+            <w:r>
+              <w:t>0.552</w:t>
+            </w:r>
+          </w:p>
+        </w:tc>
+        <w:tc>
+          <w:tcPr>
+            <w:tcW w:type="dxa" w:w="1994"/>
+          </w:tcPr>
+          <w:p>
+            <w:r>
+              <w:t>0.221</w:t>
+            </w:r>
+          </w:p>
+        </w:tc>
+        <w:tc>
+          <w:tcPr>
+            <w:tcW w:type="dxa" w:w="1994"/>
+          </w:tcPr>
+          <w:p>
+            <w:r>
+              <w:t>0.186</w:t>
+            </w:r>
+          </w:p>
+        </w:tc>
+      </w:tr>
+      <w:tr>
+        <w:tc>
+          <w:tcPr>
+            <w:tcW w:type="dxa" w:w="1994"/>
+          </w:tcPr>
+          <w:p>
+            <w:r>
+              <w:t>6</w:t>
+            </w:r>
+          </w:p>
+        </w:tc>
+        <w:tc>
+          <w:tcPr>
+            <w:tcW w:type="dxa" w:w="1994"/>
+          </w:tcPr>
+          <w:p>
+            <w:r>
+              <w:t>1,157</w:t>
+            </w:r>
+          </w:p>
+        </w:tc>
+        <w:tc>
+          <w:tcPr>
+            <w:tcW w:type="dxa" w:w="1994"/>
+          </w:tcPr>
+          <w:p>
+            <w:r>
+              <w:t>0.552</w:t>
+            </w:r>
+          </w:p>
+        </w:tc>
+        <w:tc>
+          <w:tcPr>
+            <w:tcW w:type="dxa" w:w="1994"/>
+          </w:tcPr>
+          <w:p>
+            <w:r>
+              <w:t>0.230</w:t>
+            </w:r>
+          </w:p>
+        </w:tc>
+        <w:tc>
+          <w:tcPr>
+            <w:tcW w:type="dxa" w:w="1994"/>
+          </w:tcPr>
+          <w:p>
+            <w:r>
+              <w:t>0.184</w:t>
+            </w:r>
+          </w:p>
+        </w:tc>
+      </w:tr>
+      <w:tr>
+        <w:tc>
+          <w:tcPr>
+            <w:tcW w:type="dxa" w:w="1994"/>
+          </w:tcPr>
+          <w:p>
+            <w:r>
+              <w:t>7</w:t>
+            </w:r>
+          </w:p>
+        </w:tc>
+        <w:tc>
+          <w:tcPr>
+            <w:tcW w:type="dxa" w:w="1994"/>
+          </w:tcPr>
+          <w:p>
+            <w:r>
+              <w:t>1,112</w:t>
+            </w:r>
+          </w:p>
+        </w:tc>
+        <w:tc>
+          <w:tcPr>
+            <w:tcW w:type="dxa" w:w="1994"/>
+          </w:tcPr>
+          <w:p>
+            <w:r>
+              <w:t>0.552</w:t>
+            </w:r>
+          </w:p>
+        </w:tc>
+        <w:tc>
+          <w:tcPr>
+            <w:tcW w:type="dxa" w:w="1994"/>
+          </w:tcPr>
+          <w:p>
+            <w:r>
+              <w:t>0.231</w:t>
+            </w:r>
+          </w:p>
+        </w:tc>
+        <w:tc>
+          <w:tcPr>
+            <w:tcW w:type="dxa" w:w="1994"/>
+          </w:tcPr>
+          <w:p>
+            <w:r>
+              <w:t>0.179</w:t>
+            </w:r>
+          </w:p>
+        </w:tc>
+      </w:tr>
+      <w:tr>
+        <w:tc>
+          <w:tcPr>
+            <w:tcW w:type="dxa" w:w="1994"/>
+          </w:tcPr>
+          <w:p>
+            <w:r>
+              <w:t>8</w:t>
+            </w:r>
+          </w:p>
+        </w:tc>
+        <w:tc>
+          <w:tcPr>
+            <w:tcW w:type="dxa" w:w="1994"/>
+          </w:tcPr>
+          <w:p>
+            <w:r>
+              <w:t>1,115</w:t>
+            </w:r>
+          </w:p>
+        </w:tc>
+        <w:tc>
+          <w:tcPr>
+            <w:tcW w:type="dxa" w:w="1994"/>
+          </w:tcPr>
+          <w:p>
+            <w:r>
+              <w:t>0.552</w:t>
+            </w:r>
+          </w:p>
+        </w:tc>
+        <w:tc>
+          <w:tcPr>
+            <w:tcW w:type="dxa" w:w="1994"/>
+          </w:tcPr>
+          <w:p>
+            <w:r>
+              <w:t>0.219</w:t>
+            </w:r>
+          </w:p>
+        </w:tc>
+        <w:tc>
+          <w:tcPr>
+            <w:tcW w:type="dxa" w:w="1994"/>
+          </w:tcPr>
+          <w:p>
+            <w:r>
+              <w:t>0.195</w:t>
+            </w:r>
+          </w:p>
+        </w:tc>
+      </w:tr>
+    </w:tbl>
     <w:p>
       <w:pPr>
         <w:pStyle w:val="Heading1"/>

</xml_diff>

<commit_message>
note: correct strata count (39 = 17 regions x urban/rural + 5 special areas); prose polish
</commit_message>
<xml_diff>
--- a/CAPI/Analysis/SL/doc/L2PHL_WEIGHTING_TECHNICAL_NOTE.docx
+++ b/CAPI/Analysis/SL/doc/L2PHL_WEIGHTING_TECHNICAL_NOTE.docx
@@ -406,7 +406,7 @@
     <w:p>
       <w:pPr/>
       <w:r>
-        <w:t>The population weight popw is the World Bank convention for welfare and SDG reporting, because larger households — which are often poorer — then carry weight in proportion to the people who live in them.</w:t>
+        <w:t>The population weight popw is the World Bank convention for welfare and SDG reporting, because larger households, which are often poorer, carry weight in proportion to the people who live in them.</w:t>
       </w:r>
     </w:p>
     <w:p>
@@ -420,7 +420,7 @@
     <w:p>
       <w:pPr/>
       <w:r>
-        <w:t>The baseline uses a two-stage stratified cluster design. Strata are defined by region crossed with urban/rural residence, so that each region contributes both an urban and a rural stratum.</w:t>
+        <w:t>The baseline uses a two-stage stratified cluster design. Strata are defined by region crossed with urban/rural residence, so most regions contribute an urban and a rural stratum. Five special geographic areas enter as a single stratum each, so the design comprises 39 strata in total.</w:t>
       </w:r>
     </w:p>
     <w:p>
@@ -490,7 +490,7 @@
     <w:p>
       <w:pPr/>
       <w:r>
-        <w:t>The individual weight is rescaled cell by cell, so that each census age-by-sex-by-stratum cell sums to its census population for the round. In notation, indw equals the baseline individual weight times the ratio of the cell’s census population to the current weighted cell sum. Age is grouped into 0–17, 18–45, and 46-plus, crossed with sex and stratum.</w:t>
+        <w:t>The individual weight is rescaled cell by cell, so that each census age-by-sex-by-stratum cell sums to its census population for the round. In notation, indw equals the baseline individual weight times the ratio of the cell’s census population to the current weighted cell sum. Age is grouped into 0–17, 18–45, and 46 and older, crossed with sex and stratum.</w:t>
       </w:r>
     </w:p>
     <w:p>

</xml_diff>

<commit_message>
note: add author byline (Avralt-Od Purevjav) and date to title block
</commit_message>
<xml_diff>
--- a/CAPI/Analysis/SL/doc/L2PHL_WEIGHTING_TECHNICAL_NOTE.docx
+++ b/CAPI/Analysis/SL/doc/L2PHL_WEIGHTING_TECHNICAL_NOTE.docx
@@ -169,6 +169,39 @@
           <w:szCs w:val="40"/>
         </w:rPr>
         <w:t>Philippines</w:t>
+      </w:r>
+    </w:p>
+    <w:p>
+      <w:pPr>
+        <w:jc w:val="center"/>
+      </w:pPr>
+      <w:r>
+        <w:rPr>
+          <w:b/>
+        </w:rPr>
+        <w:t>Avralt-Od Purevjav</w:t>
+      </w:r>
+    </w:p>
+    <w:p>
+      <w:pPr>
+        <w:jc w:val="center"/>
+      </w:pPr>
+      <w:r>
+        <w:rPr>
+          <w:b w:val="0"/>
+        </w:rPr>
+        <w:t>World Bank Group · Poverty and Equity Global Practice · East Asia and Pacific</w:t>
+      </w:r>
+    </w:p>
+    <w:p>
+      <w:pPr>
+        <w:jc w:val="center"/>
+      </w:pPr>
+      <w:r>
+        <w:rPr>
+          <w:b w:val="0"/>
+        </w:rPr>
+        <w:t>July 2, 2026</w:t>
       </w:r>
     </w:p>
     <w:p>

</xml_diff>

<commit_message>
note: add formal equations to CATI re-weighting section (cell recalibration, popw/hhw, PSU smoothing, stratum calibration)
</commit_message>
<xml_diff>
--- a/CAPI/Analysis/SL/doc/L2PHL_WEIGHTING_TECHNICAL_NOTE.docx
+++ b/CAPI/Analysis/SL/doc/L2PHL_WEIGHTING_TECHNICAL_NOTE.docx
@@ -6201,6 +6201,1273 @@
       <w:pPr/>
       <w:r>
         <w:t>Re-anchoring to census margins each round is what absorbs panel attrition and non-response, because the weighted cell totals are forced back to the census population every round. A round with fewer completed interviews in a cell simply carries larger weights there, and each round remains nationally representative on the age, sex, and geographic margins.</w:t>
+      </w:r>
+    </w:p>
+    <w:p>
+      <w:pPr>
+        <w:pStyle w:val="Heading2"/>
+      </w:pPr>
+      <w:r>
+        <w:t xml:space="preserve">Formal statement of the re-weighting</w:t>
+      </w:r>
+    </w:p>
+    <w:p>
+      <w:pPr/>
+      <w:r>
+        <w:t xml:space="preserve">Cell recalibration of the individual weight. For round</w:t>
+      </w:r>
+      <w:r>
+        <w:t xml:space="preserve"> </w:t>
+      </w:r>
+      <m:oMath>
+        <m:r>
+          <m:t>r</m:t>
+        </m:r>
+      </m:oMath>
+      <w:r>
+        <w:t xml:space="preserve">, with cells</w:t>
+      </w:r>
+      <w:r>
+        <w:t xml:space="preserve"> </w:t>
+      </w:r>
+      <m:oMath>
+        <m:r>
+          <m:t>c</m:t>
+        </m:r>
+      </m:oMath>
+      <w:r>
+        <w:t xml:space="preserve"> </w:t>
+      </w:r>
+      <w:r>
+        <w:t xml:space="preserve">defined by stratum, age group, and sex, the frozen baseline individual weight is scaled so each cell sums to its census population:</w:t>
+      </w:r>
+    </w:p>
+    <w:p>
+      <w:pPr/>
+      <m:oMathPara>
+        <m:oMathParaPr>
+          <m:jc m:val="center"/>
+        </m:oMathParaPr>
+        <m:oMath>
+          <m:sSub>
+            <m:e>
+              <m:r>
+                <m:rPr>
+                  <m:sty m:val="p"/>
+                </m:rPr>
+                <m:t>i</m:t>
+              </m:r>
+              <m:r>
+                <m:rPr>
+                  <m:sty m:val="p"/>
+                </m:rPr>
+                <m:t>n</m:t>
+              </m:r>
+              <m:r>
+                <m:rPr>
+                  <m:sty m:val="p"/>
+                </m:rPr>
+                <m:t>d</m:t>
+              </m:r>
+              <m:r>
+                <m:rPr>
+                  <m:sty m:val="p"/>
+                </m:rPr>
+                <m:t>w</m:t>
+              </m:r>
+            </m:e>
+            <m:sub>
+              <m:r>
+                <m:t>i</m:t>
+              </m:r>
+              <m:r>
+                <m:rPr>
+                  <m:sty m:val="p"/>
+                </m:rPr>
+                <m:t>,</m:t>
+              </m:r>
+              <m:r>
+                <m:t>r</m:t>
+              </m:r>
+            </m:sub>
+          </m:sSub>
+          <m:r>
+            <m:rPr>
+              <m:sty m:val="p"/>
+            </m:rPr>
+            <m:t>=</m:t>
+          </m:r>
+          <m:sSubSup>
+            <m:e>
+              <m:r>
+                <m:t>w</m:t>
+              </m:r>
+            </m:e>
+            <m:sub>
+              <m:r>
+                <m:t>i</m:t>
+              </m:r>
+            </m:sub>
+            <m:sup>
+              <m:r>
+                <m:rPr>
+                  <m:sty m:val="p"/>
+                </m:rPr>
+                <m:t>b</m:t>
+              </m:r>
+              <m:r>
+                <m:rPr>
+                  <m:sty m:val="p"/>
+                </m:rPr>
+                <m:t>a</m:t>
+              </m:r>
+              <m:r>
+                <m:rPr>
+                  <m:sty m:val="p"/>
+                </m:rPr>
+                <m:t>s</m:t>
+              </m:r>
+              <m:r>
+                <m:rPr>
+                  <m:sty m:val="p"/>
+                </m:rPr>
+                <m:t>e</m:t>
+              </m:r>
+            </m:sup>
+          </m:sSubSup>
+          <m:r>
+            <m:rPr>
+              <m:sty m:val="p"/>
+            </m:rPr>
+            <m:t>⋅</m:t>
+          </m:r>
+          <m:f>
+            <m:fPr>
+              <m:type m:val="bar"/>
+            </m:fPr>
+            <m:num>
+              <m:sSubSup>
+                <m:e>
+                  <m:r>
+                    <m:t>N</m:t>
+                  </m:r>
+                </m:e>
+                <m:sub>
+                  <m:r>
+                    <m:t>c</m:t>
+                  </m:r>
+                </m:sub>
+                <m:sup>
+                  <m:r>
+                    <m:rPr>
+                      <m:sty m:val="p"/>
+                    </m:rPr>
+                    <m:t>c</m:t>
+                  </m:r>
+                  <m:r>
+                    <m:rPr>
+                      <m:sty m:val="p"/>
+                    </m:rPr>
+                    <m:t>e</m:t>
+                  </m:r>
+                  <m:r>
+                    <m:rPr>
+                      <m:sty m:val="p"/>
+                    </m:rPr>
+                    <m:t>n</m:t>
+                  </m:r>
+                </m:sup>
+              </m:sSubSup>
+            </m:num>
+            <m:den>
+              <m:nary>
+                <m:naryPr>
+                  <m:chr m:val="∑"/>
+                  <m:limLoc m:val="undOvr"/>
+                  <m:subHide m:val="off"/>
+                  <m:supHide m:val="on"/>
+                </m:naryPr>
+                <m:sub>
+                  <m:r>
+                    <m:t>j</m:t>
+                  </m:r>
+                  <m:r>
+                    <m:rPr>
+                      <m:sty m:val="p"/>
+                    </m:rPr>
+                    <m:t>∈</m:t>
+                  </m:r>
+                  <m:r>
+                    <m:t>c</m:t>
+                  </m:r>
+                  <m:r>
+                    <m:rPr>
+                      <m:sty m:val="p"/>
+                    </m:rPr>
+                    <m:t>,</m:t>
+                  </m:r>
+                  <m:r>
+                    <m:t> </m:t>
+                  </m:r>
+                  <m:r>
+                    <m:t>r</m:t>
+                  </m:r>
+                </m:sub>
+                <m:sup>
+                  <m:r>
+                    <m:t>​</m:t>
+                  </m:r>
+                </m:sup>
+                <m:e>
+                  <m:sSubSup>
+                    <m:e>
+                      <m:r>
+                        <m:t>w</m:t>
+                      </m:r>
+                    </m:e>
+                    <m:sub>
+                      <m:r>
+                        <m:t>j</m:t>
+                      </m:r>
+                    </m:sub>
+                    <m:sup>
+                      <m:r>
+                        <m:rPr>
+                          <m:sty m:val="p"/>
+                        </m:rPr>
+                        <m:t>b</m:t>
+                      </m:r>
+                      <m:r>
+                        <m:rPr>
+                          <m:sty m:val="p"/>
+                        </m:rPr>
+                        <m:t>a</m:t>
+                      </m:r>
+                      <m:r>
+                        <m:rPr>
+                          <m:sty m:val="p"/>
+                        </m:rPr>
+                        <m:t>s</m:t>
+                      </m:r>
+                      <m:r>
+                        <m:rPr>
+                          <m:sty m:val="p"/>
+                        </m:rPr>
+                        <m:t>e</m:t>
+                      </m:r>
+                    </m:sup>
+                  </m:sSubSup>
+                </m:e>
+              </m:nary>
+            </m:den>
+          </m:f>
+        </m:oMath>
+      </m:oMathPara>
+    </w:p>
+    <w:p>
+      <w:pPr/>
+      <w:r>
+        <w:t xml:space="preserve">Household and population weights. The recalibrated person weights are summed and averaged within each household</w:t>
+      </w:r>
+      <w:r>
+        <w:t xml:space="preserve"> </w:t>
+      </w:r>
+      <m:oMath>
+        <m:r>
+          <m:t>h</m:t>
+        </m:r>
+      </m:oMath>
+      <w:r>
+        <w:t xml:space="preserve"> </w:t>
+      </w:r>
+      <w:r>
+        <w:t xml:space="preserve">of size</w:t>
+      </w:r>
+      <w:r>
+        <w:t xml:space="preserve"> </w:t>
+      </w:r>
+      <m:oMath>
+        <m:sSub>
+          <m:e>
+            <m:r>
+              <m:t>n</m:t>
+            </m:r>
+          </m:e>
+          <m:sub>
+            <m:r>
+              <m:t>h</m:t>
+            </m:r>
+          </m:sub>
+        </m:sSub>
+      </m:oMath>
+      <w:r>
+        <w:t xml:space="preserve">:</w:t>
+      </w:r>
+    </w:p>
+    <w:p>
+      <w:pPr/>
+      <m:oMathPara>
+        <m:oMathParaPr>
+          <m:jc m:val="center"/>
+        </m:oMathParaPr>
+        <m:oMath>
+          <m:sSub>
+            <m:e>
+              <m:r>
+                <m:rPr>
+                  <m:sty m:val="p"/>
+                </m:rPr>
+                <m:t>p</m:t>
+              </m:r>
+              <m:r>
+                <m:rPr>
+                  <m:sty m:val="p"/>
+                </m:rPr>
+                <m:t>o</m:t>
+              </m:r>
+              <m:r>
+                <m:rPr>
+                  <m:sty m:val="p"/>
+                </m:rPr>
+                <m:t>p</m:t>
+              </m:r>
+              <m:r>
+                <m:rPr>
+                  <m:sty m:val="p"/>
+                </m:rPr>
+                <m:t>w</m:t>
+              </m:r>
+            </m:e>
+            <m:sub>
+              <m:r>
+                <m:t>h</m:t>
+              </m:r>
+              <m:r>
+                <m:rPr>
+                  <m:sty m:val="p"/>
+                </m:rPr>
+                <m:t>,</m:t>
+              </m:r>
+              <m:r>
+                <m:t>r</m:t>
+              </m:r>
+            </m:sub>
+          </m:sSub>
+          <m:r>
+            <m:rPr>
+              <m:sty m:val="p"/>
+            </m:rPr>
+            <m:t>=</m:t>
+          </m:r>
+          <m:nary>
+            <m:naryPr>
+              <m:chr m:val="∑"/>
+              <m:limLoc m:val="undOvr"/>
+              <m:subHide m:val="off"/>
+              <m:supHide m:val="on"/>
+            </m:naryPr>
+            <m:sub>
+              <m:r>
+                <m:t>i</m:t>
+              </m:r>
+              <m:r>
+                <m:rPr>
+                  <m:sty m:val="p"/>
+                </m:rPr>
+                <m:t>∈</m:t>
+              </m:r>
+              <m:r>
+                <m:t>h</m:t>
+              </m:r>
+            </m:sub>
+            <m:sup>
+              <m:r>
+                <m:t>​</m:t>
+              </m:r>
+            </m:sup>
+            <m:e>
+              <m:sSub>
+                <m:e>
+                  <m:r>
+                    <m:rPr>
+                      <m:sty m:val="p"/>
+                    </m:rPr>
+                    <m:t>i</m:t>
+                  </m:r>
+                  <m:r>
+                    <m:rPr>
+                      <m:sty m:val="p"/>
+                    </m:rPr>
+                    <m:t>n</m:t>
+                  </m:r>
+                  <m:r>
+                    <m:rPr>
+                      <m:sty m:val="p"/>
+                    </m:rPr>
+                    <m:t>d</m:t>
+                  </m:r>
+                  <m:r>
+                    <m:rPr>
+                      <m:sty m:val="p"/>
+                    </m:rPr>
+                    <m:t>w</m:t>
+                  </m:r>
+                </m:e>
+                <m:sub>
+                  <m:r>
+                    <m:t>i</m:t>
+                  </m:r>
+                  <m:r>
+                    <m:rPr>
+                      <m:sty m:val="p"/>
+                    </m:rPr>
+                    <m:t>,</m:t>
+                  </m:r>
+                  <m:r>
+                    <m:t>r</m:t>
+                  </m:r>
+                </m:sub>
+              </m:sSub>
+            </m:e>
+          </m:nary>
+          <m:r>
+            <m:rPr>
+              <m:sty m:val="p"/>
+            </m:rPr>
+            <m:t>,</m:t>
+          </m:r>
+          <m:r>
+            <m:t>  </m:t>
+          </m:r>
+          <m:sSub>
+            <m:e>
+              <m:acc>
+                <m:accPr>
+                  <m:chr m:val="̃"/>
+                </m:accPr>
+                <m:e>
+                  <m:r>
+                    <m:t>h</m:t>
+                  </m:r>
+                </m:e>
+              </m:acc>
+            </m:e>
+            <m:sub>
+              <m:r>
+                <m:t>h</m:t>
+              </m:r>
+              <m:r>
+                <m:rPr>
+                  <m:sty m:val="p"/>
+                </m:rPr>
+                <m:t>,</m:t>
+              </m:r>
+              <m:r>
+                <m:t>r</m:t>
+              </m:r>
+            </m:sub>
+          </m:sSub>
+          <m:r>
+            <m:rPr>
+              <m:sty m:val="p"/>
+            </m:rPr>
+            <m:t>=</m:t>
+          </m:r>
+          <m:f>
+            <m:fPr>
+              <m:type m:val="bar"/>
+            </m:fPr>
+            <m:num>
+              <m:r>
+                <m:t>1</m:t>
+              </m:r>
+            </m:num>
+            <m:den>
+              <m:sSub>
+                <m:e>
+                  <m:r>
+                    <m:t>n</m:t>
+                  </m:r>
+                </m:e>
+                <m:sub>
+                  <m:r>
+                    <m:t>h</m:t>
+                  </m:r>
+                </m:sub>
+              </m:sSub>
+            </m:den>
+          </m:f>
+          <m:nary>
+            <m:naryPr>
+              <m:chr m:val="∑"/>
+              <m:limLoc m:val="undOvr"/>
+              <m:subHide m:val="off"/>
+              <m:supHide m:val="on"/>
+            </m:naryPr>
+            <m:sub>
+              <m:r>
+                <m:t>i</m:t>
+              </m:r>
+              <m:r>
+                <m:rPr>
+                  <m:sty m:val="p"/>
+                </m:rPr>
+                <m:t>∈</m:t>
+              </m:r>
+              <m:r>
+                <m:t>h</m:t>
+              </m:r>
+            </m:sub>
+            <m:sup>
+              <m:r>
+                <m:t>​</m:t>
+              </m:r>
+            </m:sup>
+            <m:e>
+              <m:sSub>
+                <m:e>
+                  <m:r>
+                    <m:rPr>
+                      <m:sty m:val="p"/>
+                    </m:rPr>
+                    <m:t>i</m:t>
+                  </m:r>
+                  <m:r>
+                    <m:rPr>
+                      <m:sty m:val="p"/>
+                    </m:rPr>
+                    <m:t>n</m:t>
+                  </m:r>
+                  <m:r>
+                    <m:rPr>
+                      <m:sty m:val="p"/>
+                    </m:rPr>
+                    <m:t>d</m:t>
+                  </m:r>
+                  <m:r>
+                    <m:rPr>
+                      <m:sty m:val="p"/>
+                    </m:rPr>
+                    <m:t>w</m:t>
+                  </m:r>
+                </m:e>
+                <m:sub>
+                  <m:r>
+                    <m:t>i</m:t>
+                  </m:r>
+                  <m:r>
+                    <m:rPr>
+                      <m:sty m:val="p"/>
+                    </m:rPr>
+                    <m:t>,</m:t>
+                  </m:r>
+                  <m:r>
+                    <m:t>r</m:t>
+                  </m:r>
+                </m:sub>
+              </m:sSub>
+            </m:e>
+          </m:nary>
+          <m:r>
+            <m:rPr>
+              <m:sty m:val="p"/>
+            </m:rPr>
+            <m:t>=</m:t>
+          </m:r>
+          <m:f>
+            <m:fPr>
+              <m:type m:val="bar"/>
+            </m:fPr>
+            <m:num>
+              <m:sSub>
+                <m:e>
+                  <m:r>
+                    <m:rPr>
+                      <m:sty m:val="p"/>
+                    </m:rPr>
+                    <m:t>p</m:t>
+                  </m:r>
+                  <m:r>
+                    <m:rPr>
+                      <m:sty m:val="p"/>
+                    </m:rPr>
+                    <m:t>o</m:t>
+                  </m:r>
+                  <m:r>
+                    <m:rPr>
+                      <m:sty m:val="p"/>
+                    </m:rPr>
+                    <m:t>p</m:t>
+                  </m:r>
+                  <m:r>
+                    <m:rPr>
+                      <m:sty m:val="p"/>
+                    </m:rPr>
+                    <m:t>w</m:t>
+                  </m:r>
+                </m:e>
+                <m:sub>
+                  <m:r>
+                    <m:t>h</m:t>
+                  </m:r>
+                  <m:r>
+                    <m:rPr>
+                      <m:sty m:val="p"/>
+                    </m:rPr>
+                    <m:t>,</m:t>
+                  </m:r>
+                  <m:r>
+                    <m:t>r</m:t>
+                  </m:r>
+                </m:sub>
+              </m:sSub>
+            </m:num>
+            <m:den>
+              <m:sSub>
+                <m:e>
+                  <m:r>
+                    <m:t>n</m:t>
+                  </m:r>
+                </m:e>
+                <m:sub>
+                  <m:r>
+                    <m:t>h</m:t>
+                  </m:r>
+                </m:sub>
+              </m:sSub>
+            </m:den>
+          </m:f>
+        </m:oMath>
+      </m:oMathPara>
+    </w:p>
+    <w:p>
+      <w:pPr/>
+      <w:r>
+        <w:t xml:space="preserve">PSU smoothing and stratum calibration. The household weight is averaged across households in its PSU</w:t>
+      </w:r>
+      <w:r>
+        <w:t xml:space="preserve"> </w:t>
+      </w:r>
+      <m:oMath>
+        <m:r>
+          <m:t>P</m:t>
+        </m:r>
+        <m:d>
+          <m:dPr>
+            <m:begChr m:val="("/>
+            <m:endChr m:val=")"/>
+            <m:sepChr m:val=""/>
+            <m:grow/>
+          </m:dPr>
+          <m:e>
+            <m:r>
+              <m:t>h</m:t>
+            </m:r>
+          </m:e>
+        </m:d>
+      </m:oMath>
+      <w:r>
+        <w:t xml:space="preserve"> </w:t>
+      </w:r>
+      <w:r>
+        <w:t xml:space="preserve">to damp variation, then rescaled so each stratum</w:t>
+      </w:r>
+      <w:r>
+        <w:t xml:space="preserve"> </w:t>
+      </w:r>
+      <m:oMath>
+        <m:r>
+          <m:t>s</m:t>
+        </m:r>
+      </m:oMath>
+      <w:r>
+        <w:t xml:space="preserve"> </w:t>
+      </w:r>
+      <w:r>
+        <w:t xml:space="preserve">matches its census household total:</w:t>
+      </w:r>
+    </w:p>
+    <w:p>
+      <w:pPr/>
+      <m:oMathPara>
+        <m:oMathParaPr>
+          <m:jc m:val="center"/>
+        </m:oMathParaPr>
+        <m:oMath>
+          <m:sSub>
+            <m:e>
+              <m:acc>
+                <m:accPr>
+                  <m:chr m:val="‾"/>
+                </m:accPr>
+                <m:e>
+                  <m:r>
+                    <m:t>h</m:t>
+                  </m:r>
+                </m:e>
+              </m:acc>
+            </m:e>
+            <m:sub>
+              <m:r>
+                <m:t>h</m:t>
+              </m:r>
+              <m:r>
+                <m:rPr>
+                  <m:sty m:val="p"/>
+                </m:rPr>
+                <m:t>,</m:t>
+              </m:r>
+              <m:r>
+                <m:t>r</m:t>
+              </m:r>
+            </m:sub>
+          </m:sSub>
+          <m:r>
+            <m:rPr>
+              <m:sty m:val="p"/>
+            </m:rPr>
+            <m:t>=</m:t>
+          </m:r>
+          <m:f>
+            <m:fPr>
+              <m:type m:val="bar"/>
+            </m:fPr>
+            <m:num>
+              <m:r>
+                <m:t>1</m:t>
+              </m:r>
+            </m:num>
+            <m:den>
+              <m:d>
+                <m:dPr>
+                  <m:begChr m:val="|"/>
+                  <m:endChr m:val="|"/>
+                  <m:sepChr m:val=""/>
+                  <m:grow/>
+                </m:dPr>
+                <m:e>
+                  <m:r>
+                    <m:t>P</m:t>
+                  </m:r>
+                  <m:d>
+                    <m:dPr>
+                      <m:begChr m:val="("/>
+                      <m:endChr m:val=")"/>
+                      <m:sepChr m:val=""/>
+                      <m:grow/>
+                    </m:dPr>
+                    <m:e>
+                      <m:r>
+                        <m:t>h</m:t>
+                      </m:r>
+                    </m:e>
+                  </m:d>
+                </m:e>
+              </m:d>
+            </m:den>
+          </m:f>
+          <m:nary>
+            <m:naryPr>
+              <m:chr m:val="∑"/>
+              <m:limLoc m:val="undOvr"/>
+              <m:subHide m:val="off"/>
+              <m:supHide m:val="on"/>
+            </m:naryPr>
+            <m:sub>
+              <m:r>
+                <m:t>h</m:t>
+              </m:r>
+              <m:r>
+                <m:rPr>
+                  <m:sty m:val="p"/>
+                </m:rPr>
+                <m:t>′</m:t>
+              </m:r>
+              <m:r>
+                <m:rPr>
+                  <m:sty m:val="p"/>
+                </m:rPr>
+                <m:t>∈</m:t>
+              </m:r>
+              <m:r>
+                <m:t>P</m:t>
+              </m:r>
+              <m:d>
+                <m:dPr>
+                  <m:begChr m:val="("/>
+                  <m:endChr m:val=")"/>
+                  <m:sepChr m:val=""/>
+                  <m:grow/>
+                </m:dPr>
+                <m:e>
+                  <m:r>
+                    <m:t>h</m:t>
+                  </m:r>
+                </m:e>
+              </m:d>
+            </m:sub>
+            <m:sup>
+              <m:r>
+                <m:t>​</m:t>
+              </m:r>
+            </m:sup>
+            <m:e>
+              <m:sSub>
+                <m:e>
+                  <m:acc>
+                    <m:accPr>
+                      <m:chr m:val="̃"/>
+                    </m:accPr>
+                    <m:e>
+                      <m:r>
+                        <m:t>h</m:t>
+                      </m:r>
+                    </m:e>
+                  </m:acc>
+                </m:e>
+                <m:sub>
+                  <m:r>
+                    <m:t>h</m:t>
+                  </m:r>
+                  <m:r>
+                    <m:rPr>
+                      <m:sty m:val="p"/>
+                    </m:rPr>
+                    <m:t>′</m:t>
+                  </m:r>
+                  <m:r>
+                    <m:rPr>
+                      <m:sty m:val="p"/>
+                    </m:rPr>
+                    <m:t>,</m:t>
+                  </m:r>
+                  <m:r>
+                    <m:t>r</m:t>
+                  </m:r>
+                </m:sub>
+              </m:sSub>
+            </m:e>
+          </m:nary>
+          <m:r>
+            <m:rPr>
+              <m:sty m:val="p"/>
+            </m:rPr>
+            <m:t>,</m:t>
+          </m:r>
+          <m:r>
+            <m:t>  </m:t>
+          </m:r>
+          <m:sSub>
+            <m:e>
+              <m:r>
+                <m:rPr>
+                  <m:sty m:val="p"/>
+                </m:rPr>
+                <m:t>h</m:t>
+              </m:r>
+              <m:r>
+                <m:rPr>
+                  <m:sty m:val="p"/>
+                </m:rPr>
+                <m:t>h</m:t>
+              </m:r>
+              <m:r>
+                <m:rPr>
+                  <m:sty m:val="p"/>
+                </m:rPr>
+                <m:t>w</m:t>
+              </m:r>
+            </m:e>
+            <m:sub>
+              <m:r>
+                <m:t>h</m:t>
+              </m:r>
+              <m:r>
+                <m:rPr>
+                  <m:sty m:val="p"/>
+                </m:rPr>
+                <m:t>,</m:t>
+              </m:r>
+              <m:r>
+                <m:t>r</m:t>
+              </m:r>
+            </m:sub>
+          </m:sSub>
+          <m:r>
+            <m:rPr>
+              <m:sty m:val="p"/>
+            </m:rPr>
+            <m:t>=</m:t>
+          </m:r>
+          <m:sSub>
+            <m:e>
+              <m:acc>
+                <m:accPr>
+                  <m:chr m:val="‾"/>
+                </m:accPr>
+                <m:e>
+                  <m:r>
+                    <m:t>h</m:t>
+                  </m:r>
+                </m:e>
+              </m:acc>
+            </m:e>
+            <m:sub>
+              <m:r>
+                <m:t>h</m:t>
+              </m:r>
+              <m:r>
+                <m:rPr>
+                  <m:sty m:val="p"/>
+                </m:rPr>
+                <m:t>,</m:t>
+              </m:r>
+              <m:r>
+                <m:t>r</m:t>
+              </m:r>
+            </m:sub>
+          </m:sSub>
+          <m:r>
+            <m:rPr>
+              <m:sty m:val="p"/>
+            </m:rPr>
+            <m:t>⋅</m:t>
+          </m:r>
+          <m:f>
+            <m:fPr>
+              <m:type m:val="bar"/>
+            </m:fPr>
+            <m:num>
+              <m:sSubSup>
+                <m:e>
+                  <m:r>
+                    <m:t>H</m:t>
+                  </m:r>
+                </m:e>
+                <m:sub>
+                  <m:r>
+                    <m:t>s</m:t>
+                  </m:r>
+                </m:sub>
+                <m:sup>
+                  <m:r>
+                    <m:rPr>
+                      <m:sty m:val="p"/>
+                    </m:rPr>
+                    <m:t>c</m:t>
+                  </m:r>
+                  <m:r>
+                    <m:rPr>
+                      <m:sty m:val="p"/>
+                    </m:rPr>
+                    <m:t>e</m:t>
+                  </m:r>
+                  <m:r>
+                    <m:rPr>
+                      <m:sty m:val="p"/>
+                    </m:rPr>
+                    <m:t>n</m:t>
+                  </m:r>
+                </m:sup>
+              </m:sSubSup>
+            </m:num>
+            <m:den>
+              <m:nary>
+                <m:naryPr>
+                  <m:chr m:val="∑"/>
+                  <m:limLoc m:val="undOvr"/>
+                  <m:subHide m:val="off"/>
+                  <m:supHide m:val="on"/>
+                </m:naryPr>
+                <m:sub>
+                  <m:r>
+                    <m:t>h</m:t>
+                  </m:r>
+                  <m:r>
+                    <m:rPr>
+                      <m:sty m:val="p"/>
+                    </m:rPr>
+                    <m:t>′</m:t>
+                  </m:r>
+                  <m:r>
+                    <m:rPr>
+                      <m:sty m:val="p"/>
+                    </m:rPr>
+                    <m:t>∈</m:t>
+                  </m:r>
+                  <m:r>
+                    <m:t>s</m:t>
+                  </m:r>
+                </m:sub>
+                <m:sup>
+                  <m:r>
+                    <m:t>​</m:t>
+                  </m:r>
+                </m:sup>
+                <m:e>
+                  <m:sSub>
+                    <m:e>
+                      <m:acc>
+                        <m:accPr>
+                          <m:chr m:val="‾"/>
+                        </m:accPr>
+                        <m:e>
+                          <m:r>
+                            <m:t>h</m:t>
+                          </m:r>
+                        </m:e>
+                      </m:acc>
+                    </m:e>
+                    <m:sub>
+                      <m:r>
+                        <m:t>h</m:t>
+                      </m:r>
+                      <m:r>
+                        <m:rPr>
+                          <m:sty m:val="p"/>
+                        </m:rPr>
+                        <m:t>′</m:t>
+                      </m:r>
+                      <m:r>
+                        <m:rPr>
+                          <m:sty m:val="p"/>
+                        </m:rPr>
+                        <m:t>,</m:t>
+                      </m:r>
+                      <m:r>
+                        <m:t>r</m:t>
+                      </m:r>
+                    </m:sub>
+                  </m:sSub>
+                </m:e>
+              </m:nary>
+            </m:den>
+          </m:f>
+        </m:oMath>
+      </m:oMathPara>
+    </w:p>
+    <w:p>
+      <w:pPr/>
+      <w:r>
+        <w:t xml:space="preserve">where</w:t>
+      </w:r>
+      <w:r>
+        <w:t xml:space="preserve"> </w:t>
+      </w:r>
+      <m:oMath>
+        <m:sSubSup>
+          <m:e>
+            <m:r>
+              <m:t>w</m:t>
+            </m:r>
+          </m:e>
+          <m:sub>
+            <m:r>
+              <m:t>i</m:t>
+            </m:r>
+          </m:sub>
+          <m:sup>
+            <m:r>
+              <m:rPr>
+                <m:sty m:val="p"/>
+              </m:rPr>
+              <m:t>b</m:t>
+            </m:r>
+            <m:r>
+              <m:rPr>
+                <m:sty m:val="p"/>
+              </m:rPr>
+              <m:t>a</m:t>
+            </m:r>
+            <m:r>
+              <m:rPr>
+                <m:sty m:val="p"/>
+              </m:rPr>
+              <m:t>s</m:t>
+            </m:r>
+            <m:r>
+              <m:rPr>
+                <m:sty m:val="p"/>
+              </m:rPr>
+              <m:t>e</m:t>
+            </m:r>
+          </m:sup>
+        </m:sSubSup>
+      </m:oMath>
+      <w:r>
+        <w:t xml:space="preserve"> </w:t>
+      </w:r>
+      <w:r>
+        <w:t xml:space="preserve">is the frozen baseline individual weight,</w:t>
+      </w:r>
+      <w:r>
+        <w:t xml:space="preserve"> </w:t>
+      </w:r>
+      <m:oMath>
+        <m:sSubSup>
+          <m:e>
+            <m:r>
+              <m:t>N</m:t>
+            </m:r>
+          </m:e>
+          <m:sub>
+            <m:r>
+              <m:t>c</m:t>
+            </m:r>
+          </m:sub>
+          <m:sup>
+            <m:r>
+              <m:rPr>
+                <m:sty m:val="p"/>
+              </m:rPr>
+              <m:t>c</m:t>
+            </m:r>
+            <m:r>
+              <m:rPr>
+                <m:sty m:val="p"/>
+              </m:rPr>
+              <m:t>e</m:t>
+            </m:r>
+            <m:r>
+              <m:rPr>
+                <m:sty m:val="p"/>
+              </m:rPr>
+              <m:t>n</m:t>
+            </m:r>
+          </m:sup>
+        </m:sSubSup>
+      </m:oMath>
+      <w:r>
+        <w:t xml:space="preserve"> </w:t>
+      </w:r>
+      <w:r>
+        <w:t xml:space="preserve">the census population of age-sex-stratum cell</w:t>
+      </w:r>
+      <w:r>
+        <w:t xml:space="preserve"> </w:t>
+      </w:r>
+      <m:oMath>
+        <m:r>
+          <m:t>c</m:t>
+        </m:r>
+      </m:oMath>
+      <w:r>
+        <w:t xml:space="preserve">,</w:t>
+      </w:r>
+      <w:r>
+        <w:t xml:space="preserve"> </w:t>
+      </w:r>
+      <m:oMath>
+        <m:sSub>
+          <m:e>
+            <m:r>
+              <m:t>n</m:t>
+            </m:r>
+          </m:e>
+          <m:sub>
+            <m:r>
+              <m:t>h</m:t>
+            </m:r>
+          </m:sub>
+        </m:sSub>
+      </m:oMath>
+      <w:r>
+        <w:t xml:space="preserve"> </w:t>
+      </w:r>
+      <w:r>
+        <w:t xml:space="preserve">the size of household</w:t>
+      </w:r>
+      <w:r>
+        <w:t xml:space="preserve"> </w:t>
+      </w:r>
+      <m:oMath>
+        <m:r>
+          <m:t>h</m:t>
+        </m:r>
+      </m:oMath>
+      <w:r>
+        <w:t xml:space="preserve">,</w:t>
+      </w:r>
+      <w:r>
+        <w:t xml:space="preserve"> </w:t>
+      </w:r>
+      <m:oMath>
+        <m:r>
+          <m:t>P</m:t>
+        </m:r>
+        <m:d>
+          <m:dPr>
+            <m:begChr m:val="("/>
+            <m:endChr m:val=")"/>
+            <m:sepChr m:val=""/>
+            <m:grow/>
+          </m:dPr>
+          <m:e>
+            <m:r>
+              <m:t>h</m:t>
+            </m:r>
+          </m:e>
+        </m:d>
+      </m:oMath>
+      <w:r>
+        <w:t xml:space="preserve"> </w:t>
+      </w:r>
+      <w:r>
+        <w:t xml:space="preserve">its PSU, and</w:t>
+      </w:r>
+      <w:r>
+        <w:t xml:space="preserve"> </w:t>
+      </w:r>
+      <m:oMath>
+        <m:sSubSup>
+          <m:e>
+            <m:r>
+              <m:t>H</m:t>
+            </m:r>
+          </m:e>
+          <m:sub>
+            <m:r>
+              <m:t>s</m:t>
+            </m:r>
+          </m:sub>
+          <m:sup>
+            <m:r>
+              <m:rPr>
+                <m:sty m:val="p"/>
+              </m:rPr>
+              <m:t>c</m:t>
+            </m:r>
+            <m:r>
+              <m:rPr>
+                <m:sty m:val="p"/>
+              </m:rPr>
+              <m:t>e</m:t>
+            </m:r>
+            <m:r>
+              <m:rPr>
+                <m:sty m:val="p"/>
+              </m:rPr>
+              <m:t>n</m:t>
+            </m:r>
+          </m:sup>
+        </m:sSubSup>
+      </m:oMath>
+      <w:r>
+        <w:t xml:space="preserve"> </w:t>
+      </w:r>
+      <w:r>
+        <w:t xml:space="preserve">the census household count of stratum</w:t>
+      </w:r>
+      <w:r>
+        <w:t xml:space="preserve"> </w:t>
+      </w:r>
+      <m:oMath>
+        <m:r>
+          <m:t>s</m:t>
+        </m:r>
+      </m:oMath>
+      <w:r>
+        <w:t xml:space="preserve">.</w:t>
       </w:r>
     </w:p>
     <w:p>

</xml_diff>

<commit_message>
note: add Section 6 panel attrition analysis (retention + stayers-vs-leavers bias battery); make fill script caption-anchored
</commit_message>
<xml_diff>
--- a/CAPI/Analysis/SL/doc/L2PHL_WEIGHTING_TECHNICAL_NOTE.docx
+++ b/CAPI/Analysis/SL/doc/L2PHL_WEIGHTING_TECHNICAL_NOTE.docx
@@ -7923,7 +7923,7 @@
                 <w:rFonts w:ascii="Arial Narrow" w:hAnsi="Arial Narrow"/>
                 <w:sz w:val="18"/>
               </w:rPr>
-              <w:t>0.346</w:t>
+              <w:t>0.35</w:t>
             </w:r>
           </w:p>
         </w:tc>
@@ -7940,7 +7940,7 @@
                 <w:rFonts w:ascii="Arial Narrow" w:hAnsi="Arial Narrow"/>
                 <w:sz w:val="18"/>
               </w:rPr>
-              <w:t>11.392</w:t>
+              <w:t>11.39</w:t>
             </w:r>
           </w:p>
         </w:tc>
@@ -7957,7 +7957,7 @@
                 <w:rFonts w:ascii="Arial Narrow" w:hAnsi="Arial Narrow"/>
                 <w:sz w:val="18"/>
               </w:rPr>
-              <w:t>1.120</w:t>
+              <w:t>1.12</w:t>
             </w:r>
           </w:p>
         </w:tc>
@@ -8112,7 +8112,7 @@
                 <w:rFonts w:ascii="Arial Narrow" w:hAnsi="Arial Narrow"/>
                 <w:sz w:val="18"/>
               </w:rPr>
-              <w:t>0.575</w:t>
+              <w:t>0.58</w:t>
             </w:r>
           </w:p>
         </w:tc>
@@ -8129,7 +8129,7 @@
                 <w:rFonts w:ascii="Arial Narrow" w:hAnsi="Arial Narrow"/>
                 <w:sz w:val="18"/>
               </w:rPr>
-              <w:t>60.278</w:t>
+              <w:t>60.28</w:t>
             </w:r>
           </w:p>
         </w:tc>
@@ -8146,7 +8146,7 @@
                 <w:rFonts w:ascii="Arial Narrow" w:hAnsi="Arial Narrow"/>
                 <w:sz w:val="18"/>
               </w:rPr>
-              <w:t>1.331</w:t>
+              <w:t>1.33</w:t>
             </w:r>
           </w:p>
         </w:tc>
@@ -8301,7 +8301,7 @@
                 <w:rFonts w:ascii="Arial Narrow" w:hAnsi="Arial Narrow"/>
                 <w:sz w:val="18"/>
               </w:rPr>
-              <w:t>0.265</w:t>
+              <w:t>0.26</w:t>
             </w:r>
           </w:p>
         </w:tc>
@@ -8318,7 +8318,7 @@
                 <w:rFonts w:ascii="Arial Narrow" w:hAnsi="Arial Narrow"/>
                 <w:sz w:val="18"/>
               </w:rPr>
-              <w:t>5.206</w:t>
+              <w:t>5.21</w:t>
             </w:r>
           </w:p>
         </w:tc>
@@ -8335,7 +8335,7 @@
                 <w:rFonts w:ascii="Arial Narrow" w:hAnsi="Arial Narrow"/>
                 <w:sz w:val="18"/>
               </w:rPr>
-              <w:t>1.070</w:t>
+              <w:t>1.07</w:t>
             </w:r>
           </w:p>
         </w:tc>
@@ -8541,7 +8541,7 @@
                 <w:rFonts w:ascii="Arial Narrow" w:hAnsi="Arial Narrow"/>
                 <w:sz w:val="18"/>
               </w:rPr>
-              <w:t>0.256</w:t>
+              <w:t>0.26</w:t>
             </w:r>
           </w:p>
         </w:tc>
@@ -8558,7 +8558,7 @@
                 <w:rFonts w:ascii="Arial Narrow" w:hAnsi="Arial Narrow"/>
                 <w:sz w:val="18"/>
               </w:rPr>
-              <w:t>1.066</w:t>
+              <w:t>1.07</w:t>
             </w:r>
           </w:p>
         </w:tc>
@@ -8628,7 +8628,7 @@
                 <w:rFonts w:ascii="Arial Narrow" w:hAnsi="Arial Narrow"/>
                 <w:sz w:val="18"/>
               </w:rPr>
-              <w:t>0.346</w:t>
+              <w:t>0.35</w:t>
             </w:r>
           </w:p>
         </w:tc>
@@ -8645,7 +8645,7 @@
                 <w:rFonts w:ascii="Arial Narrow" w:hAnsi="Arial Narrow"/>
                 <w:sz w:val="18"/>
               </w:rPr>
-              <w:t>1.120</w:t>
+              <w:t>1.12</w:t>
             </w:r>
           </w:p>
         </w:tc>
@@ -8715,7 +8715,7 @@
                 <w:rFonts w:ascii="Arial Narrow" w:hAnsi="Arial Narrow"/>
                 <w:sz w:val="18"/>
               </w:rPr>
-              <w:t>0.540</w:t>
+              <w:t>0.54</w:t>
             </w:r>
           </w:p>
         </w:tc>
@@ -8732,7 +8732,7 @@
                 <w:rFonts w:ascii="Arial Narrow" w:hAnsi="Arial Narrow"/>
                 <w:sz w:val="18"/>
               </w:rPr>
-              <w:t>1.292</w:t>
+              <w:t>1.29</w:t>
             </w:r>
           </w:p>
         </w:tc>
@@ -8802,7 +8802,7 @@
                 <w:rFonts w:ascii="Arial Narrow" w:hAnsi="Arial Narrow"/>
                 <w:sz w:val="18"/>
               </w:rPr>
-              <w:t>0.575</w:t>
+              <w:t>0.58</w:t>
             </w:r>
           </w:p>
         </w:tc>
@@ -8819,7 +8819,7 @@
                 <w:rFonts w:ascii="Arial Narrow" w:hAnsi="Arial Narrow"/>
                 <w:sz w:val="18"/>
               </w:rPr>
-              <w:t>1.331</w:t>
+              <w:t>1.33</w:t>
             </w:r>
           </w:p>
         </w:tc>
@@ -8889,7 +8889,7 @@
                 <w:rFonts w:ascii="Arial Narrow" w:hAnsi="Arial Narrow"/>
                 <w:sz w:val="18"/>
               </w:rPr>
-              <w:t>0.263</w:t>
+              <w:t>0.26</w:t>
             </w:r>
           </w:p>
         </w:tc>
@@ -8906,7 +8906,7 @@
                 <w:rFonts w:ascii="Arial Narrow" w:hAnsi="Arial Narrow"/>
                 <w:sz w:val="18"/>
               </w:rPr>
-              <w:t>1.069</w:t>
+              <w:t>1.07</w:t>
             </w:r>
           </w:p>
         </w:tc>
@@ -8976,7 +8976,7 @@
                 <w:rFonts w:ascii="Arial Narrow" w:hAnsi="Arial Narrow"/>
                 <w:sz w:val="18"/>
               </w:rPr>
-              <w:t>0.265</w:t>
+              <w:t>0.26</w:t>
             </w:r>
           </w:p>
         </w:tc>
@@ -8993,7 +8993,7 @@
                 <w:rFonts w:ascii="Arial Narrow" w:hAnsi="Arial Narrow"/>
                 <w:sz w:val="18"/>
               </w:rPr>
-              <w:t>1.070</w:t>
+              <w:t>1.07</w:t>
             </w:r>
           </w:p>
         </w:tc>
@@ -9215,7 +9215,7 @@
                 <w:rFonts w:ascii="Arial Narrow" w:hAnsi="Arial Narrow"/>
                 <w:sz w:val="18"/>
               </w:rPr>
-              <w:t>0.438</w:t>
+              <w:t>0.44</w:t>
             </w:r>
           </w:p>
         </w:tc>
@@ -9232,7 +9232,7 @@
                 <w:rFonts w:ascii="Arial Narrow" w:hAnsi="Arial Narrow"/>
                 <w:sz w:val="18"/>
               </w:rPr>
-              <w:t>1.192</w:t>
+              <w:t>1.19</w:t>
             </w:r>
           </w:p>
         </w:tc>
@@ -9336,7 +9336,7 @@
                 <w:rFonts w:ascii="Arial Narrow" w:hAnsi="Arial Narrow"/>
                 <w:sz w:val="18"/>
               </w:rPr>
-              <w:t>0.388</w:t>
+              <w:t>0.39</w:t>
             </w:r>
           </w:p>
         </w:tc>
@@ -9353,7 +9353,7 @@
                 <w:rFonts w:ascii="Arial Narrow" w:hAnsi="Arial Narrow"/>
                 <w:sz w:val="18"/>
               </w:rPr>
-              <w:t>1.150</w:t>
+              <w:t>1.15</w:t>
             </w:r>
           </w:p>
         </w:tc>
@@ -9457,7 +9457,7 @@
                 <w:rFonts w:ascii="Arial Narrow" w:hAnsi="Arial Narrow"/>
                 <w:sz w:val="18"/>
               </w:rPr>
-              <w:t>0.503</w:t>
+              <w:t>0.50</w:t>
             </w:r>
           </w:p>
         </w:tc>
@@ -9474,7 +9474,7 @@
                 <w:rFonts w:ascii="Arial Narrow" w:hAnsi="Arial Narrow"/>
                 <w:sz w:val="18"/>
               </w:rPr>
-              <w:t>1.253</w:t>
+              <w:t>1.25</w:t>
             </w:r>
           </w:p>
         </w:tc>
@@ -9578,7 +9578,7 @@
                 <w:rFonts w:ascii="Arial Narrow" w:hAnsi="Arial Narrow"/>
                 <w:sz w:val="18"/>
               </w:rPr>
-              <w:t>0.431</w:t>
+              <w:t>0.43</w:t>
             </w:r>
           </w:p>
         </w:tc>
@@ -9595,7 +9595,7 @@
                 <w:rFonts w:ascii="Arial Narrow" w:hAnsi="Arial Narrow"/>
                 <w:sz w:val="18"/>
               </w:rPr>
-              <w:t>1.186</w:t>
+              <w:t>1.19</w:t>
             </w:r>
           </w:p>
         </w:tc>
@@ -9699,7 +9699,7 @@
                 <w:rFonts w:ascii="Arial Narrow" w:hAnsi="Arial Narrow"/>
                 <w:sz w:val="18"/>
               </w:rPr>
-              <w:t>0.450</w:t>
+              <w:t>0.45</w:t>
             </w:r>
           </w:p>
         </w:tc>
@@ -9716,7 +9716,7 @@
                 <w:rFonts w:ascii="Arial Narrow" w:hAnsi="Arial Narrow"/>
                 <w:sz w:val="18"/>
               </w:rPr>
-              <w:t>1.202</w:t>
+              <w:t>1.20</w:t>
             </w:r>
           </w:p>
         </w:tc>
@@ -9820,7 +9820,7 @@
                 <w:rFonts w:ascii="Arial Narrow" w:hAnsi="Arial Narrow"/>
                 <w:sz w:val="18"/>
               </w:rPr>
-              <w:t>0.432</w:t>
+              <w:t>0.43</w:t>
             </w:r>
           </w:p>
         </w:tc>
@@ -9837,7 +9837,7 @@
                 <w:rFonts w:ascii="Arial Narrow" w:hAnsi="Arial Narrow"/>
                 <w:sz w:val="18"/>
               </w:rPr>
-              <w:t>1.187</w:t>
+              <w:t>1.19</w:t>
             </w:r>
           </w:p>
         </w:tc>
@@ -9941,7 +9941,7 @@
                 <w:rFonts w:ascii="Arial Narrow" w:hAnsi="Arial Narrow"/>
                 <w:sz w:val="18"/>
               </w:rPr>
-              <w:t>0.449</w:t>
+              <w:t>0.45</w:t>
             </w:r>
           </w:p>
         </w:tc>
@@ -9958,7 +9958,7 @@
                 <w:rFonts w:ascii="Arial Narrow" w:hAnsi="Arial Narrow"/>
                 <w:sz w:val="18"/>
               </w:rPr>
-              <w:t>1.202</w:t>
+              <w:t>1.20</w:t>
             </w:r>
           </w:p>
         </w:tc>
@@ -10062,7 +10062,7 @@
                 <w:rFonts w:ascii="Arial Narrow" w:hAnsi="Arial Narrow"/>
                 <w:sz w:val="18"/>
               </w:rPr>
-              <w:t>0.488</w:t>
+              <w:t>0.49</w:t>
             </w:r>
           </w:p>
         </w:tc>
@@ -10079,7 +10079,7 @@
                 <w:rFonts w:ascii="Arial Narrow" w:hAnsi="Arial Narrow"/>
                 <w:sz w:val="18"/>
               </w:rPr>
-              <w:t>1.239</w:t>
+              <w:t>1.24</w:t>
             </w:r>
           </w:p>
         </w:tc>
@@ -10335,7 +10335,7 @@
                 <w:rFonts w:ascii="Arial Narrow" w:hAnsi="Arial Narrow"/>
                 <w:sz w:val="18"/>
               </w:rPr>
-              <w:t>0.346</w:t>
+              <w:t>0.35</w:t>
             </w:r>
           </w:p>
         </w:tc>
@@ -10352,7 +10352,7 @@
                 <w:rFonts w:ascii="Arial Narrow" w:hAnsi="Arial Narrow"/>
                 <w:sz w:val="18"/>
               </w:rPr>
-              <w:t>1.120</w:t>
+              <w:t>1.12</w:t>
             </w:r>
           </w:p>
         </w:tc>
@@ -10386,7 +10386,7 @@
                 <w:rFonts w:ascii="Arial Narrow" w:hAnsi="Arial Narrow"/>
                 <w:sz w:val="18"/>
               </w:rPr>
-              <w:t>0.631</w:t>
+              <w:t>0.63</w:t>
             </w:r>
           </w:p>
         </w:tc>
@@ -10403,7 +10403,7 @@
                 <w:rFonts w:ascii="Arial Narrow" w:hAnsi="Arial Narrow"/>
                 <w:sz w:val="18"/>
               </w:rPr>
-              <w:t>886</w:t>
+              <w:t>886.3</w:t>
             </w:r>
           </w:p>
         </w:tc>
@@ -10456,7 +10456,7 @@
                 <w:rFonts w:ascii="Arial Narrow" w:hAnsi="Arial Narrow"/>
                 <w:sz w:val="18"/>
               </w:rPr>
-              <w:t>0.305</w:t>
+              <w:t>0.31</w:t>
             </w:r>
           </w:p>
         </w:tc>
@@ -10473,7 +10473,7 @@
                 <w:rFonts w:ascii="Arial Narrow" w:hAnsi="Arial Narrow"/>
                 <w:sz w:val="18"/>
               </w:rPr>
-              <w:t>1.093</w:t>
+              <w:t>1.09</w:t>
             </w:r>
           </w:p>
         </w:tc>
@@ -10507,7 +10507,7 @@
                 <w:rFonts w:ascii="Arial Narrow" w:hAnsi="Arial Narrow"/>
                 <w:sz w:val="18"/>
               </w:rPr>
-              <w:t>0.567</w:t>
+              <w:t>0.57</w:t>
             </w:r>
           </w:p>
         </w:tc>
@@ -10524,7 +10524,7 @@
                 <w:rFonts w:ascii="Arial Narrow" w:hAnsi="Arial Narrow"/>
                 <w:sz w:val="18"/>
               </w:rPr>
-              <w:t>902</w:t>
+              <w:t>902.5</w:t>
             </w:r>
           </w:p>
         </w:tc>
@@ -10577,7 +10577,7 @@
                 <w:rFonts w:ascii="Arial Narrow" w:hAnsi="Arial Narrow"/>
                 <w:sz w:val="18"/>
               </w:rPr>
-              <w:t>0.433</w:t>
+              <w:t>0.43</w:t>
             </w:r>
           </w:p>
         </w:tc>
@@ -10594,7 +10594,7 @@
                 <w:rFonts w:ascii="Arial Narrow" w:hAnsi="Arial Narrow"/>
                 <w:sz w:val="18"/>
               </w:rPr>
-              <w:t>1.187</w:t>
+              <w:t>1.19</w:t>
             </w:r>
           </w:p>
         </w:tc>
@@ -10611,7 +10611,7 @@
                 <w:rFonts w:ascii="Arial Narrow" w:hAnsi="Arial Narrow"/>
                 <w:sz w:val="18"/>
               </w:rPr>
-              <w:t>989</w:t>
+              <w:t>988.8</w:t>
             </w:r>
           </w:p>
         </w:tc>
@@ -10628,7 +10628,7 @@
                 <w:rFonts w:ascii="Arial Narrow" w:hAnsi="Arial Narrow"/>
                 <w:sz w:val="18"/>
               </w:rPr>
-              <w:t>0.667</w:t>
+              <w:t>0.67</w:t>
             </w:r>
           </w:p>
         </w:tc>
@@ -10645,7 +10645,7 @@
                 <w:rFonts w:ascii="Arial Narrow" w:hAnsi="Arial Narrow"/>
                 <w:sz w:val="18"/>
               </w:rPr>
-              <w:t>813</w:t>
+              <w:t>812.8</w:t>
             </w:r>
           </w:p>
         </w:tc>
@@ -10698,7 +10698,7 @@
                 <w:rFonts w:ascii="Arial Narrow" w:hAnsi="Arial Narrow"/>
                 <w:sz w:val="18"/>
               </w:rPr>
-              <w:t>0.362</w:t>
+              <w:t>0.36</w:t>
             </w:r>
           </w:p>
         </w:tc>
@@ -10715,7 +10715,7 @@
                 <w:rFonts w:ascii="Arial Narrow" w:hAnsi="Arial Narrow"/>
                 <w:sz w:val="18"/>
               </w:rPr>
-              <w:t>1.131</w:t>
+              <w:t>1.13</w:t>
             </w:r>
           </w:p>
         </w:tc>
@@ -10749,7 +10749,7 @@
                 <w:rFonts w:ascii="Arial Narrow" w:hAnsi="Arial Narrow"/>
                 <w:sz w:val="18"/>
               </w:rPr>
-              <w:t>0.613</w:t>
+              <w:t>0.61</w:t>
             </w:r>
           </w:p>
         </w:tc>
@@ -10766,7 +10766,7 @@
                 <w:rFonts w:ascii="Arial Narrow" w:hAnsi="Arial Narrow"/>
                 <w:sz w:val="18"/>
               </w:rPr>
-              <w:t>903</w:t>
+              <w:t>903.3</w:t>
             </w:r>
           </w:p>
         </w:tc>
@@ -10819,7 +10819,7 @@
                 <w:rFonts w:ascii="Arial Narrow" w:hAnsi="Arial Narrow"/>
                 <w:sz w:val="18"/>
               </w:rPr>
-              <w:t>0.362</w:t>
+              <w:t>0.36</w:t>
             </w:r>
           </w:p>
         </w:tc>
@@ -10836,7 +10836,7 @@
                 <w:rFonts w:ascii="Arial Narrow" w:hAnsi="Arial Narrow"/>
                 <w:sz w:val="18"/>
               </w:rPr>
-              <w:t>1.131</w:t>
+              <w:t>1.13</w:t>
             </w:r>
           </w:p>
         </w:tc>
@@ -10870,7 +10870,7 @@
                 <w:rFonts w:ascii="Arial Narrow" w:hAnsi="Arial Narrow"/>
                 <w:sz w:val="18"/>
               </w:rPr>
-              <w:t>0.611</w:t>
+              <w:t>0.61</w:t>
             </w:r>
           </w:p>
         </w:tc>
@@ -10887,7 +10887,7 @@
                 <w:rFonts w:ascii="Arial Narrow" w:hAnsi="Arial Narrow"/>
                 <w:sz w:val="18"/>
               </w:rPr>
-              <w:t>862</w:t>
+              <w:t>861.9</w:t>
             </w:r>
           </w:p>
         </w:tc>
@@ -10940,7 +10940,7 @@
                 <w:rFonts w:ascii="Arial Narrow" w:hAnsi="Arial Narrow"/>
                 <w:sz w:val="18"/>
               </w:rPr>
-              <w:t>0.352</w:t>
+              <w:t>0.35</w:t>
             </w:r>
           </w:p>
         </w:tc>
@@ -10957,7 +10957,7 @@
                 <w:rFonts w:ascii="Arial Narrow" w:hAnsi="Arial Narrow"/>
                 <w:sz w:val="18"/>
               </w:rPr>
-              <w:t>1.124</w:t>
+              <w:t>1.12</w:t>
             </w:r>
           </w:p>
         </w:tc>
@@ -10991,7 +10991,7 @@
                 <w:rFonts w:ascii="Arial Narrow" w:hAnsi="Arial Narrow"/>
                 <w:sz w:val="18"/>
               </w:rPr>
-              <w:t>0.602</w:t>
+              <w:t>0.60</w:t>
             </w:r>
           </w:p>
         </w:tc>
@@ -11008,7 +11008,7 @@
                 <w:rFonts w:ascii="Arial Narrow" w:hAnsi="Arial Narrow"/>
                 <w:sz w:val="18"/>
               </w:rPr>
-              <w:t>849</w:t>
+              <w:t>848.9</w:t>
             </w:r>
           </w:p>
         </w:tc>
@@ -11061,7 +11061,7 @@
                 <w:rFonts w:ascii="Arial Narrow" w:hAnsi="Arial Narrow"/>
                 <w:sz w:val="18"/>
               </w:rPr>
-              <w:t>0.354</w:t>
+              <w:t>0.35</w:t>
             </w:r>
           </w:p>
         </w:tc>
@@ -11078,7 +11078,7 @@
                 <w:rFonts w:ascii="Arial Narrow" w:hAnsi="Arial Narrow"/>
                 <w:sz w:val="18"/>
               </w:rPr>
-              <w:t>1.125</w:t>
+              <w:t>1.13</w:t>
             </w:r>
           </w:p>
         </w:tc>
@@ -11095,7 +11095,7 @@
                 <w:rFonts w:ascii="Arial Narrow" w:hAnsi="Arial Narrow"/>
                 <w:sz w:val="18"/>
               </w:rPr>
-              <w:t>988</w:t>
+              <w:t>988.3</w:t>
             </w:r>
           </w:p>
         </w:tc>
@@ -11112,7 +11112,7 @@
                 <w:rFonts w:ascii="Arial Narrow" w:hAnsi="Arial Narrow"/>
                 <w:sz w:val="18"/>
               </w:rPr>
-              <w:t>0.597</w:t>
+              <w:t>0.60</w:t>
             </w:r>
           </w:p>
         </w:tc>
@@ -11129,7 +11129,7 @@
                 <w:rFonts w:ascii="Arial Narrow" w:hAnsi="Arial Narrow"/>
                 <w:sz w:val="18"/>
               </w:rPr>
-              <w:t>820</w:t>
+              <w:t>819.6</w:t>
             </w:r>
           </w:p>
         </w:tc>
@@ -11182,7 +11182,7 @@
                 <w:rFonts w:ascii="Arial Narrow" w:hAnsi="Arial Narrow"/>
                 <w:sz w:val="18"/>
               </w:rPr>
-              <w:t>0.359</w:t>
+              <w:t>0.36</w:t>
             </w:r>
           </w:p>
         </w:tc>
@@ -11199,7 +11199,7 @@
                 <w:rFonts w:ascii="Arial Narrow" w:hAnsi="Arial Narrow"/>
                 <w:sz w:val="18"/>
               </w:rPr>
-              <w:t>1.129</w:t>
+              <w:t>1.13</w:t>
             </w:r>
           </w:p>
         </w:tc>
@@ -11216,7 +11216,7 @@
                 <w:rFonts w:ascii="Arial Narrow" w:hAnsi="Arial Narrow"/>
                 <w:sz w:val="18"/>
               </w:rPr>
-              <w:t>988</w:t>
+              <w:t>988.0</w:t>
             </w:r>
           </w:p>
         </w:tc>
@@ -11233,7 +11233,7 @@
                 <w:rFonts w:ascii="Arial Narrow" w:hAnsi="Arial Narrow"/>
                 <w:sz w:val="18"/>
               </w:rPr>
-              <w:t>0.613</w:t>
+              <w:t>0.61</w:t>
             </w:r>
           </w:p>
         </w:tc>
@@ -11250,7 +11250,7 @@
                 <w:rFonts w:ascii="Arial Narrow" w:hAnsi="Arial Narrow"/>
                 <w:sz w:val="18"/>
               </w:rPr>
-              <w:t>811</w:t>
+              <w:t>810.6</w:t>
             </w:r>
           </w:p>
         </w:tc>
@@ -11417,7 +11417,7 @@
                 <w:rFonts w:ascii="Arial Narrow" w:hAnsi="Arial Narrow"/>
                 <w:sz w:val="18"/>
               </w:rPr>
-              <w:t>0.552</w:t>
+              <w:t>0.55</w:t>
             </w:r>
           </w:p>
         </w:tc>
@@ -11434,7 +11434,7 @@
                 <w:rFonts w:ascii="Arial Narrow" w:hAnsi="Arial Narrow"/>
                 <w:sz w:val="18"/>
               </w:rPr>
-              <w:t>0.220</w:t>
+              <w:t>0.22</w:t>
             </w:r>
           </w:p>
         </w:tc>
@@ -11451,7 +11451,7 @@
                 <w:rFonts w:ascii="Arial Narrow" w:hAnsi="Arial Narrow"/>
                 <w:sz w:val="18"/>
               </w:rPr>
-              <w:t>0.176</w:t>
+              <w:t>0.18</w:t>
             </w:r>
           </w:p>
         </w:tc>
@@ -11504,7 +11504,7 @@
                 <w:rFonts w:ascii="Arial Narrow" w:hAnsi="Arial Narrow"/>
                 <w:sz w:val="18"/>
               </w:rPr>
-              <w:t>0.552</w:t>
+              <w:t>0.55</w:t>
             </w:r>
           </w:p>
         </w:tc>
@@ -11521,7 +11521,7 @@
                 <w:rFonts w:ascii="Arial Narrow" w:hAnsi="Arial Narrow"/>
                 <w:sz w:val="18"/>
               </w:rPr>
-              <w:t>0.222</w:t>
+              <w:t>0.22</w:t>
             </w:r>
           </w:p>
         </w:tc>
@@ -11538,7 +11538,7 @@
                 <w:rFonts w:ascii="Arial Narrow" w:hAnsi="Arial Narrow"/>
                 <w:sz w:val="18"/>
               </w:rPr>
-              <w:t>0.183</w:t>
+              <w:t>0.18</w:t>
             </w:r>
           </w:p>
         </w:tc>
@@ -11591,7 +11591,7 @@
                 <w:rFonts w:ascii="Arial Narrow" w:hAnsi="Arial Narrow"/>
                 <w:sz w:val="18"/>
               </w:rPr>
-              <w:t>0.552</w:t>
+              <w:t>0.55</w:t>
             </w:r>
           </w:p>
         </w:tc>
@@ -11608,7 +11608,7 @@
                 <w:rFonts w:ascii="Arial Narrow" w:hAnsi="Arial Narrow"/>
                 <w:sz w:val="18"/>
               </w:rPr>
-              <w:t>0.224</w:t>
+              <w:t>0.22</w:t>
             </w:r>
           </w:p>
         </w:tc>
@@ -11625,7 +11625,7 @@
                 <w:rFonts w:ascii="Arial Narrow" w:hAnsi="Arial Narrow"/>
                 <w:sz w:val="18"/>
               </w:rPr>
-              <w:t>0.179</w:t>
+              <w:t>0.18</w:t>
             </w:r>
           </w:p>
         </w:tc>
@@ -11678,7 +11678,7 @@
                 <w:rFonts w:ascii="Arial Narrow" w:hAnsi="Arial Narrow"/>
                 <w:sz w:val="18"/>
               </w:rPr>
-              <w:t>0.552</w:t>
+              <w:t>0.55</w:t>
             </w:r>
           </w:p>
         </w:tc>
@@ -11695,7 +11695,7 @@
                 <w:rFonts w:ascii="Arial Narrow" w:hAnsi="Arial Narrow"/>
                 <w:sz w:val="18"/>
               </w:rPr>
-              <w:t>0.231</w:t>
+              <w:t>0.23</w:t>
             </w:r>
           </w:p>
         </w:tc>
@@ -11712,7 +11712,7 @@
                 <w:rFonts w:ascii="Arial Narrow" w:hAnsi="Arial Narrow"/>
                 <w:sz w:val="18"/>
               </w:rPr>
-              <w:t>0.179</w:t>
+              <w:t>0.18</w:t>
             </w:r>
           </w:p>
         </w:tc>
@@ -11765,7 +11765,7 @@
                 <w:rFonts w:ascii="Arial Narrow" w:hAnsi="Arial Narrow"/>
                 <w:sz w:val="18"/>
               </w:rPr>
-              <w:t>0.552</w:t>
+              <w:t>0.55</w:t>
             </w:r>
           </w:p>
         </w:tc>
@@ -11782,7 +11782,7 @@
                 <w:rFonts w:ascii="Arial Narrow" w:hAnsi="Arial Narrow"/>
                 <w:sz w:val="18"/>
               </w:rPr>
-              <w:t>0.221</w:t>
+              <w:t>0.22</w:t>
             </w:r>
           </w:p>
         </w:tc>
@@ -11799,7 +11799,7 @@
                 <w:rFonts w:ascii="Arial Narrow" w:hAnsi="Arial Narrow"/>
                 <w:sz w:val="18"/>
               </w:rPr>
-              <w:t>0.186</w:t>
+              <w:t>0.19</w:t>
             </w:r>
           </w:p>
         </w:tc>
@@ -11852,7 +11852,7 @@
                 <w:rFonts w:ascii="Arial Narrow" w:hAnsi="Arial Narrow"/>
                 <w:sz w:val="18"/>
               </w:rPr>
-              <w:t>0.552</w:t>
+              <w:t>0.55</w:t>
             </w:r>
           </w:p>
         </w:tc>
@@ -11869,7 +11869,7 @@
                 <w:rFonts w:ascii="Arial Narrow" w:hAnsi="Arial Narrow"/>
                 <w:sz w:val="18"/>
               </w:rPr>
-              <w:t>0.230</w:t>
+              <w:t>0.23</w:t>
             </w:r>
           </w:p>
         </w:tc>
@@ -11886,7 +11886,7 @@
                 <w:rFonts w:ascii="Arial Narrow" w:hAnsi="Arial Narrow"/>
                 <w:sz w:val="18"/>
               </w:rPr>
-              <w:t>0.184</w:t>
+              <w:t>0.18</w:t>
             </w:r>
           </w:p>
         </w:tc>
@@ -11939,7 +11939,7 @@
                 <w:rFonts w:ascii="Arial Narrow" w:hAnsi="Arial Narrow"/>
                 <w:sz w:val="18"/>
               </w:rPr>
-              <w:t>0.552</w:t>
+              <w:t>0.55</w:t>
             </w:r>
           </w:p>
         </w:tc>
@@ -11956,7 +11956,7 @@
                 <w:rFonts w:ascii="Arial Narrow" w:hAnsi="Arial Narrow"/>
                 <w:sz w:val="18"/>
               </w:rPr>
-              <w:t>0.231</w:t>
+              <w:t>0.23</w:t>
             </w:r>
           </w:p>
         </w:tc>
@@ -11973,7 +11973,7 @@
                 <w:rFonts w:ascii="Arial Narrow" w:hAnsi="Arial Narrow"/>
                 <w:sz w:val="18"/>
               </w:rPr>
-              <w:t>0.179</w:t>
+              <w:t>0.18</w:t>
             </w:r>
           </w:p>
         </w:tc>
@@ -12026,7 +12026,7 @@
                 <w:rFonts w:ascii="Arial Narrow" w:hAnsi="Arial Narrow"/>
                 <w:sz w:val="18"/>
               </w:rPr>
-              <w:t>0.552</w:t>
+              <w:t>0.55</w:t>
             </w:r>
           </w:p>
         </w:tc>
@@ -12043,7 +12043,7 @@
                 <w:rFonts w:ascii="Arial Narrow" w:hAnsi="Arial Narrow"/>
                 <w:sz w:val="18"/>
               </w:rPr>
-              <w:t>0.219</w:t>
+              <w:t>0.22</w:t>
             </w:r>
           </w:p>
         </w:tc>
@@ -12060,12 +12060,2133 @@
                 <w:rFonts w:ascii="Arial Narrow" w:hAnsi="Arial Narrow"/>
                 <w:sz w:val="18"/>
               </w:rPr>
-              <w:t>0.195</w:t>
+              <w:t>0.20</w:t>
             </w:r>
           </w:p>
         </w:tc>
       </w:tr>
     </w:tbl>
+    <w:p>
+      <w:pPr>
+        <w:pStyle w:val="Heading1"/>
+      </w:pPr>
+      <w:r>
+        <w:t>Panel attrition and representativeness</w:t>
+      </w:r>
+    </w:p>
+    <w:p>
+      <w:pPr/>
+      <w:r>
+        <w:t>The CATI panel is not a closed cohort. Of the 1,239 households reached in Round 1, 705 (56.9 percent) are still interviewed in Round 8, while 534 have left; each round also brings households first reached later, 410 of them by Round 8. Because the weights re-anchor the achieved sample to census margins every round, as the previous section describes, attrition on the calibrated dimensions - age, sex, stratum, and the household total - is corrected by construction. The open question is whether the households that leave differ systematically from those that stay on characteristics the calibration does not target.</w:t>
+      </w:r>
+    </w:p>
+    <w:p>
+      <w:pPr>
+        <w:pStyle w:val="Heading2"/>
+      </w:pPr>
+      <w:r>
+        <w:t>Retention by round</w:t>
+      </w:r>
+    </w:p>
+    <w:p>
+      <w:pPr/>
+      <w:r>
+        <w:t>Retention of the Round-1 cohort declines steadily and settles near 57 percent by Round 8, offset each round by newly reached households.</w:t>
+      </w:r>
+    </w:p>
+    <w:tbl>
+      <w:tblPr>
+        <w:tblStyle w:val="TableGrid"/>
+        <w:tblW w:type="auto" w:w="0"/>
+        <w:tblLook w:firstColumn="1" w:firstRow="1" w:lastColumn="0" w:lastRow="0" w:noHBand="0" w:noVBand="1" w:val="04A0"/>
+      </w:tblPr>
+      <w:tblGrid>
+        <w:gridCol w:w="1994"/>
+        <w:gridCol w:w="1994"/>
+        <w:gridCol w:w="1994"/>
+        <w:gridCol w:w="1994"/>
+        <w:gridCol w:w="1994"/>
+      </w:tblGrid>
+      <w:tr>
+        <w:tc>
+          <w:tcPr>
+            <w:tcW w:type="dxa" w:w="1994"/>
+          </w:tcPr>
+          <w:p>
+            <w:pPr>
+              <w:spacing w:before="20" w:after="20" w:line="240" w:lineRule="auto"/>
+            </w:pPr>
+            <w:r>
+              <w:rPr>
+                <w:rFonts w:ascii="Arial Narrow" w:hAnsi="Arial Narrow"/>
+                <w:b/>
+                <w:sz w:val="18"/>
+              </w:rPr>
+              <w:t>round</w:t>
+            </w:r>
+          </w:p>
+        </w:tc>
+        <w:tc>
+          <w:tcPr>
+            <w:tcW w:type="dxa" w:w="1994"/>
+          </w:tcPr>
+          <w:p>
+            <w:pPr>
+              <w:spacing w:before="20" w:after="20" w:line="240" w:lineRule="auto"/>
+            </w:pPr>
+            <w:r>
+              <w:rPr>
+                <w:rFonts w:ascii="Arial Narrow" w:hAnsi="Arial Narrow"/>
+                <w:b/>
+                <w:sz w:val="18"/>
+              </w:rPr>
+              <w:t>n_present</w:t>
+            </w:r>
+          </w:p>
+        </w:tc>
+        <w:tc>
+          <w:tcPr>
+            <w:tcW w:type="dxa" w:w="1994"/>
+          </w:tcPr>
+          <w:p>
+            <w:pPr>
+              <w:spacing w:before="20" w:after="20" w:line="240" w:lineRule="auto"/>
+            </w:pPr>
+            <w:r>
+              <w:rPr>
+                <w:rFonts w:ascii="Arial Narrow" w:hAnsi="Arial Narrow"/>
+                <w:b/>
+                <w:sz w:val="18"/>
+              </w:rPr>
+              <w:t>n_r1cohort_present</w:t>
+            </w:r>
+          </w:p>
+        </w:tc>
+        <w:tc>
+          <w:tcPr>
+            <w:tcW w:type="dxa" w:w="1994"/>
+          </w:tcPr>
+          <w:p>
+            <w:pPr>
+              <w:spacing w:before="20" w:after="20" w:line="240" w:lineRule="auto"/>
+            </w:pPr>
+            <w:r>
+              <w:rPr>
+                <w:rFonts w:ascii="Arial Narrow" w:hAnsi="Arial Narrow"/>
+                <w:b/>
+                <w:sz w:val="18"/>
+              </w:rPr>
+              <w:t>pct_r1_retained</w:t>
+            </w:r>
+          </w:p>
+        </w:tc>
+        <w:tc>
+          <w:tcPr>
+            <w:tcW w:type="dxa" w:w="1994"/>
+          </w:tcPr>
+          <w:p>
+            <w:pPr>
+              <w:spacing w:before="20" w:after="20" w:line="240" w:lineRule="auto"/>
+            </w:pPr>
+            <w:r>
+              <w:rPr>
+                <w:rFonts w:ascii="Arial Narrow" w:hAnsi="Arial Narrow"/>
+                <w:b/>
+                <w:sz w:val="18"/>
+              </w:rPr>
+              <w:t>n_new_since_r1</w:t>
+            </w:r>
+          </w:p>
+        </w:tc>
+      </w:tr>
+      <w:tr>
+        <w:tc>
+          <w:tcPr>
+            <w:tcW w:type="dxa" w:w="1994"/>
+          </w:tcPr>
+          <w:p>
+            <w:pPr>
+              <w:spacing w:before="20" w:after="20" w:line="240" w:lineRule="auto"/>
+            </w:pPr>
+            <w:r>
+              <w:rPr>
+                <w:rFonts w:ascii="Arial Narrow" w:hAnsi="Arial Narrow"/>
+                <w:sz w:val="18"/>
+              </w:rPr>
+              <w:t>1</w:t>
+            </w:r>
+          </w:p>
+        </w:tc>
+        <w:tc>
+          <w:tcPr>
+            <w:tcW w:type="dxa" w:w="1994"/>
+          </w:tcPr>
+          <w:p>
+            <w:pPr>
+              <w:spacing w:before="20" w:after="20" w:line="240" w:lineRule="auto"/>
+            </w:pPr>
+            <w:r>
+              <w:rPr>
+                <w:rFonts w:ascii="Arial Narrow" w:hAnsi="Arial Narrow"/>
+                <w:sz w:val="18"/>
+              </w:rPr>
+              <w:t>1,239</w:t>
+            </w:r>
+          </w:p>
+        </w:tc>
+        <w:tc>
+          <w:tcPr>
+            <w:tcW w:type="dxa" w:w="1994"/>
+          </w:tcPr>
+          <w:p>
+            <w:pPr>
+              <w:spacing w:before="20" w:after="20" w:line="240" w:lineRule="auto"/>
+            </w:pPr>
+            <w:r>
+              <w:rPr>
+                <w:rFonts w:ascii="Arial Narrow" w:hAnsi="Arial Narrow"/>
+                <w:sz w:val="18"/>
+              </w:rPr>
+              <w:t>1,239</w:t>
+            </w:r>
+          </w:p>
+        </w:tc>
+        <w:tc>
+          <w:tcPr>
+            <w:tcW w:type="dxa" w:w="1994"/>
+          </w:tcPr>
+          <w:p>
+            <w:pPr>
+              <w:spacing w:before="20" w:after="20" w:line="240" w:lineRule="auto"/>
+            </w:pPr>
+            <w:r>
+              <w:rPr>
+                <w:rFonts w:ascii="Arial Narrow" w:hAnsi="Arial Narrow"/>
+                <w:sz w:val="18"/>
+              </w:rPr>
+              <w:t>100</w:t>
+            </w:r>
+          </w:p>
+        </w:tc>
+        <w:tc>
+          <w:tcPr>
+            <w:tcW w:type="dxa" w:w="1994"/>
+          </w:tcPr>
+          <w:p>
+            <w:pPr>
+              <w:spacing w:before="20" w:after="20" w:line="240" w:lineRule="auto"/>
+            </w:pPr>
+            <w:r>
+              <w:rPr>
+                <w:rFonts w:ascii="Arial Narrow" w:hAnsi="Arial Narrow"/>
+                <w:sz w:val="18"/>
+              </w:rPr>
+              <w:t>0</w:t>
+            </w:r>
+          </w:p>
+        </w:tc>
+      </w:tr>
+      <w:tr>
+        <w:tc>
+          <w:tcPr>
+            <w:tcW w:type="dxa" w:w="1994"/>
+          </w:tcPr>
+          <w:p>
+            <w:pPr>
+              <w:spacing w:before="20" w:after="20" w:line="240" w:lineRule="auto"/>
+            </w:pPr>
+            <w:r>
+              <w:rPr>
+                <w:rFonts w:ascii="Arial Narrow" w:hAnsi="Arial Narrow"/>
+                <w:sz w:val="18"/>
+              </w:rPr>
+              <w:t>2</w:t>
+            </w:r>
+          </w:p>
+        </w:tc>
+        <w:tc>
+          <w:tcPr>
+            <w:tcW w:type="dxa" w:w="1994"/>
+          </w:tcPr>
+          <w:p>
+            <w:pPr>
+              <w:spacing w:before="20" w:after="20" w:line="240" w:lineRule="auto"/>
+            </w:pPr>
+            <w:r>
+              <w:rPr>
+                <w:rFonts w:ascii="Arial Narrow" w:hAnsi="Arial Narrow"/>
+                <w:sz w:val="18"/>
+              </w:rPr>
+              <w:t>1,193</w:t>
+            </w:r>
+          </w:p>
+        </w:tc>
+        <w:tc>
+          <w:tcPr>
+            <w:tcW w:type="dxa" w:w="1994"/>
+          </w:tcPr>
+          <w:p>
+            <w:pPr>
+              <w:spacing w:before="20" w:after="20" w:line="240" w:lineRule="auto"/>
+            </w:pPr>
+            <w:r>
+              <w:rPr>
+                <w:rFonts w:ascii="Arial Narrow" w:hAnsi="Arial Narrow"/>
+                <w:sz w:val="18"/>
+              </w:rPr>
+              <w:t>860</w:t>
+            </w:r>
+          </w:p>
+        </w:tc>
+        <w:tc>
+          <w:tcPr>
+            <w:tcW w:type="dxa" w:w="1994"/>
+          </w:tcPr>
+          <w:p>
+            <w:pPr>
+              <w:spacing w:before="20" w:after="20" w:line="240" w:lineRule="auto"/>
+            </w:pPr>
+            <w:r>
+              <w:rPr>
+                <w:rFonts w:ascii="Arial Narrow" w:hAnsi="Arial Narrow"/>
+                <w:sz w:val="18"/>
+              </w:rPr>
+              <w:t>69.41</w:t>
+            </w:r>
+          </w:p>
+        </w:tc>
+        <w:tc>
+          <w:tcPr>
+            <w:tcW w:type="dxa" w:w="1994"/>
+          </w:tcPr>
+          <w:p>
+            <w:pPr>
+              <w:spacing w:before="20" w:after="20" w:line="240" w:lineRule="auto"/>
+            </w:pPr>
+            <w:r>
+              <w:rPr>
+                <w:rFonts w:ascii="Arial Narrow" w:hAnsi="Arial Narrow"/>
+                <w:sz w:val="18"/>
+              </w:rPr>
+              <w:t>333</w:t>
+            </w:r>
+          </w:p>
+        </w:tc>
+      </w:tr>
+      <w:tr>
+        <w:tc>
+          <w:tcPr>
+            <w:tcW w:type="dxa" w:w="1994"/>
+          </w:tcPr>
+          <w:p>
+            <w:pPr>
+              <w:spacing w:before="20" w:after="20" w:line="240" w:lineRule="auto"/>
+            </w:pPr>
+            <w:r>
+              <w:rPr>
+                <w:rFonts w:ascii="Arial Narrow" w:hAnsi="Arial Narrow"/>
+                <w:sz w:val="18"/>
+              </w:rPr>
+              <w:t>3</w:t>
+            </w:r>
+          </w:p>
+        </w:tc>
+        <w:tc>
+          <w:tcPr>
+            <w:tcW w:type="dxa" w:w="1994"/>
+          </w:tcPr>
+          <w:p>
+            <w:pPr>
+              <w:spacing w:before="20" w:after="20" w:line="240" w:lineRule="auto"/>
+            </w:pPr>
+            <w:r>
+              <w:rPr>
+                <w:rFonts w:ascii="Arial Narrow" w:hAnsi="Arial Narrow"/>
+                <w:sz w:val="18"/>
+              </w:rPr>
+              <w:t>1,174</w:t>
+            </w:r>
+          </w:p>
+        </w:tc>
+        <w:tc>
+          <w:tcPr>
+            <w:tcW w:type="dxa" w:w="1994"/>
+          </w:tcPr>
+          <w:p>
+            <w:pPr>
+              <w:spacing w:before="20" w:after="20" w:line="240" w:lineRule="auto"/>
+            </w:pPr>
+            <w:r>
+              <w:rPr>
+                <w:rFonts w:ascii="Arial Narrow" w:hAnsi="Arial Narrow"/>
+                <w:sz w:val="18"/>
+              </w:rPr>
+              <w:t>794</w:t>
+            </w:r>
+          </w:p>
+        </w:tc>
+        <w:tc>
+          <w:tcPr>
+            <w:tcW w:type="dxa" w:w="1994"/>
+          </w:tcPr>
+          <w:p>
+            <w:pPr>
+              <w:spacing w:before="20" w:after="20" w:line="240" w:lineRule="auto"/>
+            </w:pPr>
+            <w:r>
+              <w:rPr>
+                <w:rFonts w:ascii="Arial Narrow" w:hAnsi="Arial Narrow"/>
+                <w:sz w:val="18"/>
+              </w:rPr>
+              <w:t>64.08</w:t>
+            </w:r>
+          </w:p>
+        </w:tc>
+        <w:tc>
+          <w:tcPr>
+            <w:tcW w:type="dxa" w:w="1994"/>
+          </w:tcPr>
+          <w:p>
+            <w:pPr>
+              <w:spacing w:before="20" w:after="20" w:line="240" w:lineRule="auto"/>
+            </w:pPr>
+            <w:r>
+              <w:rPr>
+                <w:rFonts w:ascii="Arial Narrow" w:hAnsi="Arial Narrow"/>
+                <w:sz w:val="18"/>
+              </w:rPr>
+              <w:t>380</w:t>
+            </w:r>
+          </w:p>
+        </w:tc>
+      </w:tr>
+      <w:tr>
+        <w:tc>
+          <w:tcPr>
+            <w:tcW w:type="dxa" w:w="1994"/>
+          </w:tcPr>
+          <w:p>
+            <w:pPr>
+              <w:spacing w:before="20" w:after="20" w:line="240" w:lineRule="auto"/>
+            </w:pPr>
+            <w:r>
+              <w:rPr>
+                <w:rFonts w:ascii="Arial Narrow" w:hAnsi="Arial Narrow"/>
+                <w:sz w:val="18"/>
+              </w:rPr>
+              <w:t>4</w:t>
+            </w:r>
+          </w:p>
+        </w:tc>
+        <w:tc>
+          <w:tcPr>
+            <w:tcW w:type="dxa" w:w="1994"/>
+          </w:tcPr>
+          <w:p>
+            <w:pPr>
+              <w:spacing w:before="20" w:after="20" w:line="240" w:lineRule="auto"/>
+            </w:pPr>
+            <w:r>
+              <w:rPr>
+                <w:rFonts w:ascii="Arial Narrow" w:hAnsi="Arial Narrow"/>
+                <w:sz w:val="18"/>
+              </w:rPr>
+              <w:t>1,243</w:t>
+            </w:r>
+          </w:p>
+        </w:tc>
+        <w:tc>
+          <w:tcPr>
+            <w:tcW w:type="dxa" w:w="1994"/>
+          </w:tcPr>
+          <w:p>
+            <w:pPr>
+              <w:spacing w:before="20" w:after="20" w:line="240" w:lineRule="auto"/>
+            </w:pPr>
+            <w:r>
+              <w:rPr>
+                <w:rFonts w:ascii="Arial Narrow" w:hAnsi="Arial Narrow"/>
+                <w:sz w:val="18"/>
+              </w:rPr>
+              <w:t>801</w:t>
+            </w:r>
+          </w:p>
+        </w:tc>
+        <w:tc>
+          <w:tcPr>
+            <w:tcW w:type="dxa" w:w="1994"/>
+          </w:tcPr>
+          <w:p>
+            <w:pPr>
+              <w:spacing w:before="20" w:after="20" w:line="240" w:lineRule="auto"/>
+            </w:pPr>
+            <w:r>
+              <w:rPr>
+                <w:rFonts w:ascii="Arial Narrow" w:hAnsi="Arial Narrow"/>
+                <w:sz w:val="18"/>
+              </w:rPr>
+              <w:t>64.65</w:t>
+            </w:r>
+          </w:p>
+        </w:tc>
+        <w:tc>
+          <w:tcPr>
+            <w:tcW w:type="dxa" w:w="1994"/>
+          </w:tcPr>
+          <w:p>
+            <w:pPr>
+              <w:spacing w:before="20" w:after="20" w:line="240" w:lineRule="auto"/>
+            </w:pPr>
+            <w:r>
+              <w:rPr>
+                <w:rFonts w:ascii="Arial Narrow" w:hAnsi="Arial Narrow"/>
+                <w:sz w:val="18"/>
+              </w:rPr>
+              <w:t>442</w:t>
+            </w:r>
+          </w:p>
+        </w:tc>
+      </w:tr>
+      <w:tr>
+        <w:tc>
+          <w:tcPr>
+            <w:tcW w:type="dxa" w:w="1994"/>
+          </w:tcPr>
+          <w:p>
+            <w:pPr>
+              <w:spacing w:before="20" w:after="20" w:line="240" w:lineRule="auto"/>
+            </w:pPr>
+            <w:r>
+              <w:rPr>
+                <w:rFonts w:ascii="Arial Narrow" w:hAnsi="Arial Narrow"/>
+                <w:sz w:val="18"/>
+              </w:rPr>
+              <w:t>5</w:t>
+            </w:r>
+          </w:p>
+        </w:tc>
+        <w:tc>
+          <w:tcPr>
+            <w:tcW w:type="dxa" w:w="1994"/>
+          </w:tcPr>
+          <w:p>
+            <w:pPr>
+              <w:spacing w:before="20" w:after="20" w:line="240" w:lineRule="auto"/>
+            </w:pPr>
+            <w:r>
+              <w:rPr>
+                <w:rFonts w:ascii="Arial Narrow" w:hAnsi="Arial Narrow"/>
+                <w:sz w:val="18"/>
+              </w:rPr>
+              <w:t>1,184</w:t>
+            </w:r>
+          </w:p>
+        </w:tc>
+        <w:tc>
+          <w:tcPr>
+            <w:tcW w:type="dxa" w:w="1994"/>
+          </w:tcPr>
+          <w:p>
+            <w:pPr>
+              <w:spacing w:before="20" w:after="20" w:line="240" w:lineRule="auto"/>
+            </w:pPr>
+            <w:r>
+              <w:rPr>
+                <w:rFonts w:ascii="Arial Narrow" w:hAnsi="Arial Narrow"/>
+                <w:sz w:val="18"/>
+              </w:rPr>
+              <w:t>767</w:t>
+            </w:r>
+          </w:p>
+        </w:tc>
+        <w:tc>
+          <w:tcPr>
+            <w:tcW w:type="dxa" w:w="1994"/>
+          </w:tcPr>
+          <w:p>
+            <w:pPr>
+              <w:spacing w:before="20" w:after="20" w:line="240" w:lineRule="auto"/>
+            </w:pPr>
+            <w:r>
+              <w:rPr>
+                <w:rFonts w:ascii="Arial Narrow" w:hAnsi="Arial Narrow"/>
+                <w:sz w:val="18"/>
+              </w:rPr>
+              <w:t>61.90</w:t>
+            </w:r>
+          </w:p>
+        </w:tc>
+        <w:tc>
+          <w:tcPr>
+            <w:tcW w:type="dxa" w:w="1994"/>
+          </w:tcPr>
+          <w:p>
+            <w:pPr>
+              <w:spacing w:before="20" w:after="20" w:line="240" w:lineRule="auto"/>
+            </w:pPr>
+            <w:r>
+              <w:rPr>
+                <w:rFonts w:ascii="Arial Narrow" w:hAnsi="Arial Narrow"/>
+                <w:sz w:val="18"/>
+              </w:rPr>
+              <w:t>417</w:t>
+            </w:r>
+          </w:p>
+        </w:tc>
+      </w:tr>
+      <w:tr>
+        <w:tc>
+          <w:tcPr>
+            <w:tcW w:type="dxa" w:w="1994"/>
+          </w:tcPr>
+          <w:p>
+            <w:pPr>
+              <w:spacing w:before="20" w:after="20" w:line="240" w:lineRule="auto"/>
+            </w:pPr>
+            <w:r>
+              <w:rPr>
+                <w:rFonts w:ascii="Arial Narrow" w:hAnsi="Arial Narrow"/>
+                <w:sz w:val="18"/>
+              </w:rPr>
+              <w:t>6</w:t>
+            </w:r>
+          </w:p>
+        </w:tc>
+        <w:tc>
+          <w:tcPr>
+            <w:tcW w:type="dxa" w:w="1994"/>
+          </w:tcPr>
+          <w:p>
+            <w:pPr>
+              <w:spacing w:before="20" w:after="20" w:line="240" w:lineRule="auto"/>
+            </w:pPr>
+            <w:r>
+              <w:rPr>
+                <w:rFonts w:ascii="Arial Narrow" w:hAnsi="Arial Narrow"/>
+                <w:sz w:val="18"/>
+              </w:rPr>
+              <w:t>1,157</w:t>
+            </w:r>
+          </w:p>
+        </w:tc>
+        <w:tc>
+          <w:tcPr>
+            <w:tcW w:type="dxa" w:w="1994"/>
+          </w:tcPr>
+          <w:p>
+            <w:pPr>
+              <w:spacing w:before="20" w:after="20" w:line="240" w:lineRule="auto"/>
+            </w:pPr>
+            <w:r>
+              <w:rPr>
+                <w:rFonts w:ascii="Arial Narrow" w:hAnsi="Arial Narrow"/>
+                <w:sz w:val="18"/>
+              </w:rPr>
+              <w:t>734</w:t>
+            </w:r>
+          </w:p>
+        </w:tc>
+        <w:tc>
+          <w:tcPr>
+            <w:tcW w:type="dxa" w:w="1994"/>
+          </w:tcPr>
+          <w:p>
+            <w:pPr>
+              <w:spacing w:before="20" w:after="20" w:line="240" w:lineRule="auto"/>
+            </w:pPr>
+            <w:r>
+              <w:rPr>
+                <w:rFonts w:ascii="Arial Narrow" w:hAnsi="Arial Narrow"/>
+                <w:sz w:val="18"/>
+              </w:rPr>
+              <w:t>59.24</w:t>
+            </w:r>
+          </w:p>
+        </w:tc>
+        <w:tc>
+          <w:tcPr>
+            <w:tcW w:type="dxa" w:w="1994"/>
+          </w:tcPr>
+          <w:p>
+            <w:pPr>
+              <w:spacing w:before="20" w:after="20" w:line="240" w:lineRule="auto"/>
+            </w:pPr>
+            <w:r>
+              <w:rPr>
+                <w:rFonts w:ascii="Arial Narrow" w:hAnsi="Arial Narrow"/>
+                <w:sz w:val="18"/>
+              </w:rPr>
+              <w:t>423</w:t>
+            </w:r>
+          </w:p>
+        </w:tc>
+      </w:tr>
+      <w:tr>
+        <w:tc>
+          <w:tcPr>
+            <w:tcW w:type="dxa" w:w="1994"/>
+          </w:tcPr>
+          <w:p>
+            <w:pPr>
+              <w:spacing w:before="20" w:after="20" w:line="240" w:lineRule="auto"/>
+            </w:pPr>
+            <w:r>
+              <w:rPr>
+                <w:rFonts w:ascii="Arial Narrow" w:hAnsi="Arial Narrow"/>
+                <w:sz w:val="18"/>
+              </w:rPr>
+              <w:t>7</w:t>
+            </w:r>
+          </w:p>
+        </w:tc>
+        <w:tc>
+          <w:tcPr>
+            <w:tcW w:type="dxa" w:w="1994"/>
+          </w:tcPr>
+          <w:p>
+            <w:pPr>
+              <w:spacing w:before="20" w:after="20" w:line="240" w:lineRule="auto"/>
+            </w:pPr>
+            <w:r>
+              <w:rPr>
+                <w:rFonts w:ascii="Arial Narrow" w:hAnsi="Arial Narrow"/>
+                <w:sz w:val="18"/>
+              </w:rPr>
+              <w:t>1,112</w:t>
+            </w:r>
+          </w:p>
+        </w:tc>
+        <w:tc>
+          <w:tcPr>
+            <w:tcW w:type="dxa" w:w="1994"/>
+          </w:tcPr>
+          <w:p>
+            <w:pPr>
+              <w:spacing w:before="20" w:after="20" w:line="240" w:lineRule="auto"/>
+            </w:pPr>
+            <w:r>
+              <w:rPr>
+                <w:rFonts w:ascii="Arial Narrow" w:hAnsi="Arial Narrow"/>
+                <w:sz w:val="18"/>
+              </w:rPr>
+              <w:t>694</w:t>
+            </w:r>
+          </w:p>
+        </w:tc>
+        <w:tc>
+          <w:tcPr>
+            <w:tcW w:type="dxa" w:w="1994"/>
+          </w:tcPr>
+          <w:p>
+            <w:pPr>
+              <w:spacing w:before="20" w:after="20" w:line="240" w:lineRule="auto"/>
+            </w:pPr>
+            <w:r>
+              <w:rPr>
+                <w:rFonts w:ascii="Arial Narrow" w:hAnsi="Arial Narrow"/>
+                <w:sz w:val="18"/>
+              </w:rPr>
+              <w:t>56.01</w:t>
+            </w:r>
+          </w:p>
+        </w:tc>
+        <w:tc>
+          <w:tcPr>
+            <w:tcW w:type="dxa" w:w="1994"/>
+          </w:tcPr>
+          <w:p>
+            <w:pPr>
+              <w:spacing w:before="20" w:after="20" w:line="240" w:lineRule="auto"/>
+            </w:pPr>
+            <w:r>
+              <w:rPr>
+                <w:rFonts w:ascii="Arial Narrow" w:hAnsi="Arial Narrow"/>
+                <w:sz w:val="18"/>
+              </w:rPr>
+              <w:t>418</w:t>
+            </w:r>
+          </w:p>
+        </w:tc>
+      </w:tr>
+      <w:tr>
+        <w:tc>
+          <w:tcPr>
+            <w:tcW w:type="dxa" w:w="1994"/>
+          </w:tcPr>
+          <w:p>
+            <w:pPr>
+              <w:spacing w:before="20" w:after="20" w:line="240" w:lineRule="auto"/>
+            </w:pPr>
+            <w:r>
+              <w:rPr>
+                <w:rFonts w:ascii="Arial Narrow" w:hAnsi="Arial Narrow"/>
+                <w:sz w:val="18"/>
+              </w:rPr>
+              <w:t>8</w:t>
+            </w:r>
+          </w:p>
+        </w:tc>
+        <w:tc>
+          <w:tcPr>
+            <w:tcW w:type="dxa" w:w="1994"/>
+          </w:tcPr>
+          <w:p>
+            <w:pPr>
+              <w:spacing w:before="20" w:after="20" w:line="240" w:lineRule="auto"/>
+            </w:pPr>
+            <w:r>
+              <w:rPr>
+                <w:rFonts w:ascii="Arial Narrow" w:hAnsi="Arial Narrow"/>
+                <w:sz w:val="18"/>
+              </w:rPr>
+              <w:t>1,115</w:t>
+            </w:r>
+          </w:p>
+        </w:tc>
+        <w:tc>
+          <w:tcPr>
+            <w:tcW w:type="dxa" w:w="1994"/>
+          </w:tcPr>
+          <w:p>
+            <w:pPr>
+              <w:spacing w:before="20" w:after="20" w:line="240" w:lineRule="auto"/>
+            </w:pPr>
+            <w:r>
+              <w:rPr>
+                <w:rFonts w:ascii="Arial Narrow" w:hAnsi="Arial Narrow"/>
+                <w:sz w:val="18"/>
+              </w:rPr>
+              <w:t>705</w:t>
+            </w:r>
+          </w:p>
+        </w:tc>
+        <w:tc>
+          <w:tcPr>
+            <w:tcW w:type="dxa" w:w="1994"/>
+          </w:tcPr>
+          <w:p>
+            <w:pPr>
+              <w:spacing w:before="20" w:after="20" w:line="240" w:lineRule="auto"/>
+            </w:pPr>
+            <w:r>
+              <w:rPr>
+                <w:rFonts w:ascii="Arial Narrow" w:hAnsi="Arial Narrow"/>
+                <w:sz w:val="18"/>
+              </w:rPr>
+              <w:t>56.90</w:t>
+            </w:r>
+          </w:p>
+        </w:tc>
+        <w:tc>
+          <w:tcPr>
+            <w:tcW w:type="dxa" w:w="1994"/>
+          </w:tcPr>
+          <w:p>
+            <w:pPr>
+              <w:spacing w:before="20" w:after="20" w:line="240" w:lineRule="auto"/>
+            </w:pPr>
+            <w:r>
+              <w:rPr>
+                <w:rFonts w:ascii="Arial Narrow" w:hAnsi="Arial Narrow"/>
+                <w:sz w:val="18"/>
+              </w:rPr>
+              <w:t>410</w:t>
+            </w:r>
+          </w:p>
+        </w:tc>
+      </w:tr>
+    </w:tbl>
+    <w:p>
+      <w:pPr>
+        <w:pStyle w:val="Heading2"/>
+      </w:pPr>
+      <w:r>
+        <w:t>Attrition: stayers versus leavers</w:t>
+      </w:r>
+    </w:p>
+    <w:p>
+      <w:pPr/>
+      <w:r>
+        <w:t>To test for selection, households present in Round 1 are split into those retained through Round 8 and those that left, and compared on their Round-1 characteristics. A significant difference means the leavers were not a random subset.</w:t>
+      </w:r>
+    </w:p>
+    <w:tbl>
+      <w:tblPr>
+        <w:tblStyle w:val="TableGrid"/>
+        <w:tblW w:type="auto" w:w="0"/>
+        <w:tblLook w:firstColumn="1" w:firstRow="1" w:lastColumn="0" w:lastRow="0" w:noHBand="0" w:noVBand="1" w:val="04A0"/>
+      </w:tblPr>
+      <w:tblGrid>
+        <w:gridCol w:w="1108"/>
+        <w:gridCol w:w="1108"/>
+        <w:gridCol w:w="1108"/>
+        <w:gridCol w:w="1108"/>
+        <w:gridCol w:w="1108"/>
+        <w:gridCol w:w="1108"/>
+        <w:gridCol w:w="1108"/>
+        <w:gridCol w:w="1108"/>
+        <w:gridCol w:w="1108"/>
+      </w:tblGrid>
+      <w:tr>
+        <w:tc>
+          <w:tcPr>
+            <w:tcW w:type="dxa" w:w="1108"/>
+          </w:tcPr>
+          <w:p>
+            <w:pPr>
+              <w:spacing w:before="20" w:after="20" w:line="240" w:lineRule="auto"/>
+            </w:pPr>
+            <w:r>
+              <w:rPr>
+                <w:rFonts w:ascii="Arial Narrow" w:hAnsi="Arial Narrow"/>
+                <w:b/>
+                <w:sz w:val="18"/>
+              </w:rPr>
+              <w:t>characteristic</w:t>
+            </w:r>
+          </w:p>
+        </w:tc>
+        <w:tc>
+          <w:tcPr>
+            <w:tcW w:type="dxa" w:w="1108"/>
+          </w:tcPr>
+          <w:p>
+            <w:pPr>
+              <w:spacing w:before="20" w:after="20" w:line="240" w:lineRule="auto"/>
+            </w:pPr>
+            <w:r>
+              <w:rPr>
+                <w:rFonts w:ascii="Arial Narrow" w:hAnsi="Arial Narrow"/>
+                <w:b/>
+                <w:sz w:val="18"/>
+              </w:rPr>
+              <w:t>stayer</w:t>
+            </w:r>
+          </w:p>
+        </w:tc>
+        <w:tc>
+          <w:tcPr>
+            <w:tcW w:type="dxa" w:w="1108"/>
+          </w:tcPr>
+          <w:p>
+            <w:pPr>
+              <w:spacing w:before="20" w:after="20" w:line="240" w:lineRule="auto"/>
+            </w:pPr>
+            <w:r>
+              <w:rPr>
+                <w:rFonts w:ascii="Arial Narrow" w:hAnsi="Arial Narrow"/>
+                <w:b/>
+                <w:sz w:val="18"/>
+              </w:rPr>
+              <w:t>attriter</w:t>
+            </w:r>
+          </w:p>
+        </w:tc>
+        <w:tc>
+          <w:tcPr>
+            <w:tcW w:type="dxa" w:w="1108"/>
+          </w:tcPr>
+          <w:p>
+            <w:pPr>
+              <w:spacing w:before="20" w:after="20" w:line="240" w:lineRule="auto"/>
+            </w:pPr>
+            <w:r>
+              <w:rPr>
+                <w:rFonts w:ascii="Arial Narrow" w:hAnsi="Arial Narrow"/>
+                <w:b/>
+                <w:sz w:val="18"/>
+              </w:rPr>
+              <w:t>difference</w:t>
+            </w:r>
+          </w:p>
+        </w:tc>
+        <w:tc>
+          <w:tcPr>
+            <w:tcW w:type="dxa" w:w="1108"/>
+          </w:tcPr>
+          <w:p>
+            <w:pPr>
+              <w:spacing w:before="20" w:after="20" w:line="240" w:lineRule="auto"/>
+            </w:pPr>
+            <w:r>
+              <w:rPr>
+                <w:rFonts w:ascii="Arial Narrow" w:hAnsi="Arial Narrow"/>
+                <w:b/>
+                <w:sz w:val="18"/>
+              </w:rPr>
+              <w:t>test</w:t>
+            </w:r>
+          </w:p>
+        </w:tc>
+        <w:tc>
+          <w:tcPr>
+            <w:tcW w:type="dxa" w:w="1108"/>
+          </w:tcPr>
+          <w:p>
+            <w:pPr>
+              <w:spacing w:before="20" w:after="20" w:line="240" w:lineRule="auto"/>
+            </w:pPr>
+            <w:r>
+              <w:rPr>
+                <w:rFonts w:ascii="Arial Narrow" w:hAnsi="Arial Narrow"/>
+                <w:b/>
+                <w:sz w:val="18"/>
+              </w:rPr>
+              <w:t>stat</w:t>
+            </w:r>
+          </w:p>
+        </w:tc>
+        <w:tc>
+          <w:tcPr>
+            <w:tcW w:type="dxa" w:w="1108"/>
+          </w:tcPr>
+          <w:p>
+            <w:pPr>
+              <w:spacing w:before="20" w:after="20" w:line="240" w:lineRule="auto"/>
+            </w:pPr>
+            <w:r>
+              <w:rPr>
+                <w:rFonts w:ascii="Arial Narrow" w:hAnsi="Arial Narrow"/>
+                <w:b/>
+                <w:sz w:val="18"/>
+              </w:rPr>
+              <w:t>p_value</w:t>
+            </w:r>
+          </w:p>
+        </w:tc>
+        <w:tc>
+          <w:tcPr>
+            <w:tcW w:type="dxa" w:w="1108"/>
+          </w:tcPr>
+          <w:p>
+            <w:pPr>
+              <w:spacing w:before="20" w:after="20" w:line="240" w:lineRule="auto"/>
+            </w:pPr>
+            <w:r>
+              <w:rPr>
+                <w:rFonts w:ascii="Arial Narrow" w:hAnsi="Arial Narrow"/>
+                <w:b/>
+                <w:sz w:val="18"/>
+              </w:rPr>
+              <w:t>sig</w:t>
+            </w:r>
+          </w:p>
+        </w:tc>
+        <w:tc>
+          <w:tcPr>
+            <w:tcW w:type="dxa" w:w="1108"/>
+          </w:tcPr>
+          <w:p>
+            <w:pPr>
+              <w:spacing w:before="20" w:after="20" w:line="240" w:lineRule="auto"/>
+            </w:pPr>
+            <w:r>
+              <w:rPr>
+                <w:rFonts w:ascii="Arial Narrow" w:hAnsi="Arial Narrow"/>
+                <w:b/>
+                <w:sz w:val="18"/>
+              </w:rPr>
+              <w:t>verdict</w:t>
+            </w:r>
+          </w:p>
+        </w:tc>
+      </w:tr>
+      <w:tr>
+        <w:tc>
+          <w:tcPr>
+            <w:tcW w:type="dxa" w:w="1108"/>
+          </w:tcPr>
+          <w:p>
+            <w:pPr>
+              <w:spacing w:before="20" w:after="20" w:line="240" w:lineRule="auto"/>
+            </w:pPr>
+            <w:r>
+              <w:rPr>
+                <w:rFonts w:ascii="Arial Narrow" w:hAnsi="Arial Narrow"/>
+                <w:sz w:val="18"/>
+              </w:rPr>
+              <w:t>urban</w:t>
+            </w:r>
+          </w:p>
+        </w:tc>
+        <w:tc>
+          <w:tcPr>
+            <w:tcW w:type="dxa" w:w="1108"/>
+          </w:tcPr>
+          <w:p>
+            <w:pPr>
+              <w:spacing w:before="20" w:after="20" w:line="240" w:lineRule="auto"/>
+            </w:pPr>
+            <w:r>
+              <w:rPr>
+                <w:rFonts w:ascii="Arial Narrow" w:hAnsi="Arial Narrow"/>
+                <w:sz w:val="18"/>
+              </w:rPr>
+              <w:t>60</w:t>
+            </w:r>
+          </w:p>
+        </w:tc>
+        <w:tc>
+          <w:tcPr>
+            <w:tcW w:type="dxa" w:w="1108"/>
+          </w:tcPr>
+          <w:p>
+            <w:pPr>
+              <w:spacing w:before="20" w:after="20" w:line="240" w:lineRule="auto"/>
+            </w:pPr>
+            <w:r>
+              <w:rPr>
+                <w:rFonts w:ascii="Arial Narrow" w:hAnsi="Arial Narrow"/>
+                <w:sz w:val="18"/>
+              </w:rPr>
+              <w:t>54.68</w:t>
+            </w:r>
+          </w:p>
+        </w:tc>
+        <w:tc>
+          <w:tcPr>
+            <w:tcW w:type="dxa" w:w="1108"/>
+          </w:tcPr>
+          <w:p>
+            <w:pPr>
+              <w:spacing w:before="20" w:after="20" w:line="240" w:lineRule="auto"/>
+            </w:pPr>
+            <w:r>
+              <w:rPr>
+                <w:rFonts w:ascii="Arial Narrow" w:hAnsi="Arial Narrow"/>
+                <w:sz w:val="18"/>
+              </w:rPr>
+              <w:t>5.32</w:t>
+            </w:r>
+          </w:p>
+        </w:tc>
+        <w:tc>
+          <w:tcPr>
+            <w:tcW w:type="dxa" w:w="1108"/>
+          </w:tcPr>
+          <w:p>
+            <w:pPr>
+              <w:spacing w:before="20" w:after="20" w:line="240" w:lineRule="auto"/>
+            </w:pPr>
+            <w:r>
+              <w:rPr>
+                <w:rFonts w:ascii="Arial Narrow" w:hAnsi="Arial Narrow"/>
+                <w:sz w:val="18"/>
+              </w:rPr>
+              <w:t>chi2</w:t>
+            </w:r>
+          </w:p>
+        </w:tc>
+        <w:tc>
+          <w:tcPr>
+            <w:tcW w:type="dxa" w:w="1108"/>
+          </w:tcPr>
+          <w:p>
+            <w:pPr>
+              <w:spacing w:before="20" w:after="20" w:line="240" w:lineRule="auto"/>
+            </w:pPr>
+            <w:r>
+              <w:rPr>
+                <w:rFonts w:ascii="Arial Narrow" w:hAnsi="Arial Narrow"/>
+                <w:sz w:val="18"/>
+              </w:rPr>
+              <w:t>3.52</w:t>
+            </w:r>
+          </w:p>
+        </w:tc>
+        <w:tc>
+          <w:tcPr>
+            <w:tcW w:type="dxa" w:w="1108"/>
+          </w:tcPr>
+          <w:p>
+            <w:pPr>
+              <w:spacing w:before="20" w:after="20" w:line="240" w:lineRule="auto"/>
+            </w:pPr>
+            <w:r>
+              <w:rPr>
+                <w:rFonts w:ascii="Arial Narrow" w:hAnsi="Arial Narrow"/>
+                <w:sz w:val="18"/>
+              </w:rPr>
+              <w:t>0.061</w:t>
+            </w:r>
+          </w:p>
+        </w:tc>
+        <w:tc>
+          <w:tcPr>
+            <w:tcW w:type="dxa" w:w="1108"/>
+          </w:tcPr>
+          <w:p>
+            <w:pPr>
+              <w:spacing w:before="20" w:after="20" w:line="240" w:lineRule="auto"/>
+            </w:pPr>
+            <w:r>
+              <w:rPr>
+                <w:rFonts w:ascii="Arial Narrow" w:hAnsi="Arial Narrow"/>
+                <w:sz w:val="18"/>
+              </w:rPr>
+              <w:t>*</w:t>
+            </w:r>
+          </w:p>
+        </w:tc>
+        <w:tc>
+          <w:tcPr>
+            <w:tcW w:type="dxa" w:w="1108"/>
+          </w:tcPr>
+          <w:p>
+            <w:pPr>
+              <w:spacing w:before="20" w:after="20" w:line="240" w:lineRule="auto"/>
+            </w:pPr>
+            <w:r>
+              <w:rPr>
+                <w:rFonts w:ascii="Arial Narrow" w:hAnsi="Arial Narrow"/>
+                <w:sz w:val="18"/>
+              </w:rPr>
+              <w:t>similar</w:t>
+            </w:r>
+          </w:p>
+        </w:tc>
+      </w:tr>
+      <w:tr>
+        <w:tc>
+          <w:tcPr>
+            <w:tcW w:type="dxa" w:w="1108"/>
+          </w:tcPr>
+          <w:p>
+            <w:pPr>
+              <w:spacing w:before="20" w:after="20" w:line="240" w:lineRule="auto"/>
+            </w:pPr>
+            <w:r>
+              <w:rPr>
+                <w:rFonts w:ascii="Arial Narrow" w:hAnsi="Arial Narrow"/>
+                <w:sz w:val="18"/>
+              </w:rPr>
+              <w:t>head_female</w:t>
+            </w:r>
+          </w:p>
+        </w:tc>
+        <w:tc>
+          <w:tcPr>
+            <w:tcW w:type="dxa" w:w="1108"/>
+          </w:tcPr>
+          <w:p>
+            <w:pPr>
+              <w:spacing w:before="20" w:after="20" w:line="240" w:lineRule="auto"/>
+            </w:pPr>
+            <w:r>
+              <w:rPr>
+                <w:rFonts w:ascii="Arial Narrow" w:hAnsi="Arial Narrow"/>
+                <w:sz w:val="18"/>
+              </w:rPr>
+              <w:t>40</w:t>
+            </w:r>
+          </w:p>
+        </w:tc>
+        <w:tc>
+          <w:tcPr>
+            <w:tcW w:type="dxa" w:w="1108"/>
+          </w:tcPr>
+          <w:p>
+            <w:pPr>
+              <w:spacing w:before="20" w:after="20" w:line="240" w:lineRule="auto"/>
+            </w:pPr>
+            <w:r>
+              <w:rPr>
+                <w:rFonts w:ascii="Arial Narrow" w:hAnsi="Arial Narrow"/>
+                <w:sz w:val="18"/>
+              </w:rPr>
+              <w:t>40.07</w:t>
+            </w:r>
+          </w:p>
+        </w:tc>
+        <w:tc>
+          <w:tcPr>
+            <w:tcW w:type="dxa" w:w="1108"/>
+          </w:tcPr>
+          <w:p>
+            <w:pPr>
+              <w:spacing w:before="20" w:after="20" w:line="240" w:lineRule="auto"/>
+            </w:pPr>
+            <w:r>
+              <w:rPr>
+                <w:rFonts w:ascii="Arial Narrow" w:hAnsi="Arial Narrow"/>
+                <w:sz w:val="18"/>
+              </w:rPr>
+              <w:t>-0.07</w:t>
+            </w:r>
+          </w:p>
+        </w:tc>
+        <w:tc>
+          <w:tcPr>
+            <w:tcW w:type="dxa" w:w="1108"/>
+          </w:tcPr>
+          <w:p>
+            <w:pPr>
+              <w:spacing w:before="20" w:after="20" w:line="240" w:lineRule="auto"/>
+            </w:pPr>
+            <w:r>
+              <w:rPr>
+                <w:rFonts w:ascii="Arial Narrow" w:hAnsi="Arial Narrow"/>
+                <w:sz w:val="18"/>
+              </w:rPr>
+              <w:t>chi2</w:t>
+            </w:r>
+          </w:p>
+        </w:tc>
+        <w:tc>
+          <w:tcPr>
+            <w:tcW w:type="dxa" w:w="1108"/>
+          </w:tcPr>
+          <w:p>
+            <w:pPr>
+              <w:spacing w:before="20" w:after="20" w:line="240" w:lineRule="auto"/>
+            </w:pPr>
+            <w:r>
+              <w:rPr>
+                <w:rFonts w:ascii="Arial Narrow" w:hAnsi="Arial Narrow"/>
+                <w:sz w:val="18"/>
+              </w:rPr>
+              <w:t>0.00</w:t>
+            </w:r>
+          </w:p>
+        </w:tc>
+        <w:tc>
+          <w:tcPr>
+            <w:tcW w:type="dxa" w:w="1108"/>
+          </w:tcPr>
+          <w:p>
+            <w:pPr>
+              <w:spacing w:before="20" w:after="20" w:line="240" w:lineRule="auto"/>
+            </w:pPr>
+            <w:r>
+              <w:rPr>
+                <w:rFonts w:ascii="Arial Narrow" w:hAnsi="Arial Narrow"/>
+                <w:sz w:val="18"/>
+              </w:rPr>
+              <w:t>0.979</w:t>
+            </w:r>
+          </w:p>
+        </w:tc>
+        <w:tc>
+          <w:tcPr>
+            <w:tcW w:type="dxa" w:w="1108"/>
+          </w:tcPr>
+          <w:p>
+            <w:pPr>
+              <w:spacing w:before="20" w:after="20" w:line="240" w:lineRule="auto"/>
+            </w:pPr>
+            <w:r>
+              <w:rPr>
+                <w:rFonts w:ascii="Arial Narrow" w:hAnsi="Arial Narrow"/>
+                <w:sz w:val="18"/>
+              </w:rPr>
+              <w:t>ns</w:t>
+            </w:r>
+          </w:p>
+        </w:tc>
+        <w:tc>
+          <w:tcPr>
+            <w:tcW w:type="dxa" w:w="1108"/>
+          </w:tcPr>
+          <w:p>
+            <w:pPr>
+              <w:spacing w:before="20" w:after="20" w:line="240" w:lineRule="auto"/>
+            </w:pPr>
+            <w:r>
+              <w:rPr>
+                <w:rFonts w:ascii="Arial Narrow" w:hAnsi="Arial Narrow"/>
+                <w:sz w:val="18"/>
+              </w:rPr>
+              <w:t>similar</w:t>
+            </w:r>
+          </w:p>
+        </w:tc>
+      </w:tr>
+      <w:tr>
+        <w:tc>
+          <w:tcPr>
+            <w:tcW w:type="dxa" w:w="1108"/>
+          </w:tcPr>
+          <w:p>
+            <w:pPr>
+              <w:spacing w:before="20" w:after="20" w:line="240" w:lineRule="auto"/>
+            </w:pPr>
+            <w:r>
+              <w:rPr>
+                <w:rFonts w:ascii="Arial Narrow" w:hAnsi="Arial Narrow"/>
+                <w:sz w:val="18"/>
+              </w:rPr>
+              <w:t>fies_modsev</w:t>
+            </w:r>
+          </w:p>
+        </w:tc>
+        <w:tc>
+          <w:tcPr>
+            <w:tcW w:type="dxa" w:w="1108"/>
+          </w:tcPr>
+          <w:p>
+            <w:pPr>
+              <w:spacing w:before="20" w:after="20" w:line="240" w:lineRule="auto"/>
+            </w:pPr>
+            <w:r>
+              <w:rPr>
+                <w:rFonts w:ascii="Arial Narrow" w:hAnsi="Arial Narrow"/>
+                <w:sz w:val="18"/>
+              </w:rPr>
+              <w:t>40.14</w:t>
+            </w:r>
+          </w:p>
+        </w:tc>
+        <w:tc>
+          <w:tcPr>
+            <w:tcW w:type="dxa" w:w="1108"/>
+          </w:tcPr>
+          <w:p>
+            <w:pPr>
+              <w:spacing w:before="20" w:after="20" w:line="240" w:lineRule="auto"/>
+            </w:pPr>
+            <w:r>
+              <w:rPr>
+                <w:rFonts w:ascii="Arial Narrow" w:hAnsi="Arial Narrow"/>
+                <w:sz w:val="18"/>
+              </w:rPr>
+              <w:t>42.70</w:t>
+            </w:r>
+          </w:p>
+        </w:tc>
+        <w:tc>
+          <w:tcPr>
+            <w:tcW w:type="dxa" w:w="1108"/>
+          </w:tcPr>
+          <w:p>
+            <w:pPr>
+              <w:spacing w:before="20" w:after="20" w:line="240" w:lineRule="auto"/>
+            </w:pPr>
+            <w:r>
+              <w:rPr>
+                <w:rFonts w:ascii="Arial Narrow" w:hAnsi="Arial Narrow"/>
+                <w:sz w:val="18"/>
+              </w:rPr>
+              <w:t>-2.55</w:t>
+            </w:r>
+          </w:p>
+        </w:tc>
+        <w:tc>
+          <w:tcPr>
+            <w:tcW w:type="dxa" w:w="1108"/>
+          </w:tcPr>
+          <w:p>
+            <w:pPr>
+              <w:spacing w:before="20" w:after="20" w:line="240" w:lineRule="auto"/>
+            </w:pPr>
+            <w:r>
+              <w:rPr>
+                <w:rFonts w:ascii="Arial Narrow" w:hAnsi="Arial Narrow"/>
+                <w:sz w:val="18"/>
+              </w:rPr>
+              <w:t>chi2</w:t>
+            </w:r>
+          </w:p>
+        </w:tc>
+        <w:tc>
+          <w:tcPr>
+            <w:tcW w:type="dxa" w:w="1108"/>
+          </w:tcPr>
+          <w:p>
+            <w:pPr>
+              <w:spacing w:before="20" w:after="20" w:line="240" w:lineRule="auto"/>
+            </w:pPr>
+            <w:r>
+              <w:rPr>
+                <w:rFonts w:ascii="Arial Narrow" w:hAnsi="Arial Narrow"/>
+                <w:sz w:val="18"/>
+              </w:rPr>
+              <w:t>0.82</w:t>
+            </w:r>
+          </w:p>
+        </w:tc>
+        <w:tc>
+          <w:tcPr>
+            <w:tcW w:type="dxa" w:w="1108"/>
+          </w:tcPr>
+          <w:p>
+            <w:pPr>
+              <w:spacing w:before="20" w:after="20" w:line="240" w:lineRule="auto"/>
+            </w:pPr>
+            <w:r>
+              <w:rPr>
+                <w:rFonts w:ascii="Arial Narrow" w:hAnsi="Arial Narrow"/>
+                <w:sz w:val="18"/>
+              </w:rPr>
+              <w:t>0.366</w:t>
+            </w:r>
+          </w:p>
+        </w:tc>
+        <w:tc>
+          <w:tcPr>
+            <w:tcW w:type="dxa" w:w="1108"/>
+          </w:tcPr>
+          <w:p>
+            <w:pPr>
+              <w:spacing w:before="20" w:after="20" w:line="240" w:lineRule="auto"/>
+            </w:pPr>
+            <w:r>
+              <w:rPr>
+                <w:rFonts w:ascii="Arial Narrow" w:hAnsi="Arial Narrow"/>
+                <w:sz w:val="18"/>
+              </w:rPr>
+              <w:t>ns</w:t>
+            </w:r>
+          </w:p>
+        </w:tc>
+        <w:tc>
+          <w:tcPr>
+            <w:tcW w:type="dxa" w:w="1108"/>
+          </w:tcPr>
+          <w:p>
+            <w:pPr>
+              <w:spacing w:before="20" w:after="20" w:line="240" w:lineRule="auto"/>
+            </w:pPr>
+            <w:r>
+              <w:rPr>
+                <w:rFonts w:ascii="Arial Narrow" w:hAnsi="Arial Narrow"/>
+                <w:sz w:val="18"/>
+              </w:rPr>
+              <w:t>similar</w:t>
+            </w:r>
+          </w:p>
+        </w:tc>
+      </w:tr>
+      <w:tr>
+        <w:tc>
+          <w:tcPr>
+            <w:tcW w:type="dxa" w:w="1108"/>
+          </w:tcPr>
+          <w:p>
+            <w:pPr>
+              <w:spacing w:before="20" w:after="20" w:line="240" w:lineRule="auto"/>
+            </w:pPr>
+            <w:r>
+              <w:rPr>
+                <w:rFonts w:ascii="Arial Narrow" w:hAnsi="Arial Narrow"/>
+                <w:sz w:val="18"/>
+              </w:rPr>
+              <w:t>hhsize</w:t>
+            </w:r>
+          </w:p>
+        </w:tc>
+        <w:tc>
+          <w:tcPr>
+            <w:tcW w:type="dxa" w:w="1108"/>
+          </w:tcPr>
+          <w:p>
+            <w:pPr>
+              <w:spacing w:before="20" w:after="20" w:line="240" w:lineRule="auto"/>
+            </w:pPr>
+            <w:r>
+              <w:rPr>
+                <w:rFonts w:ascii="Arial Narrow" w:hAnsi="Arial Narrow"/>
+                <w:sz w:val="18"/>
+              </w:rPr>
+              <w:t>4.48</w:t>
+            </w:r>
+          </w:p>
+        </w:tc>
+        <w:tc>
+          <w:tcPr>
+            <w:tcW w:type="dxa" w:w="1108"/>
+          </w:tcPr>
+          <w:p>
+            <w:pPr>
+              <w:spacing w:before="20" w:after="20" w:line="240" w:lineRule="auto"/>
+            </w:pPr>
+            <w:r>
+              <w:rPr>
+                <w:rFonts w:ascii="Arial Narrow" w:hAnsi="Arial Narrow"/>
+                <w:sz w:val="18"/>
+              </w:rPr>
+              <w:t>4.15</w:t>
+            </w:r>
+          </w:p>
+        </w:tc>
+        <w:tc>
+          <w:tcPr>
+            <w:tcW w:type="dxa" w:w="1108"/>
+          </w:tcPr>
+          <w:p>
+            <w:pPr>
+              <w:spacing w:before="20" w:after="20" w:line="240" w:lineRule="auto"/>
+            </w:pPr>
+            <w:r>
+              <w:rPr>
+                <w:rFonts w:ascii="Arial Narrow" w:hAnsi="Arial Narrow"/>
+                <w:sz w:val="18"/>
+              </w:rPr>
+              <w:t>0.33</w:t>
+            </w:r>
+          </w:p>
+        </w:tc>
+        <w:tc>
+          <w:tcPr>
+            <w:tcW w:type="dxa" w:w="1108"/>
+          </w:tcPr>
+          <w:p>
+            <w:pPr>
+              <w:spacing w:before="20" w:after="20" w:line="240" w:lineRule="auto"/>
+            </w:pPr>
+            <w:r>
+              <w:rPr>
+                <w:rFonts w:ascii="Arial Narrow" w:hAnsi="Arial Narrow"/>
+                <w:sz w:val="18"/>
+              </w:rPr>
+              <w:t>ttest</w:t>
+            </w:r>
+          </w:p>
+        </w:tc>
+        <w:tc>
+          <w:tcPr>
+            <w:tcW w:type="dxa" w:w="1108"/>
+          </w:tcPr>
+          <w:p>
+            <w:pPr>
+              <w:spacing w:before="20" w:after="20" w:line="240" w:lineRule="auto"/>
+            </w:pPr>
+            <w:r>
+              <w:rPr>
+                <w:rFonts w:ascii="Arial Narrow" w:hAnsi="Arial Narrow"/>
+                <w:sz w:val="18"/>
+              </w:rPr>
+              <w:t>-2.79</w:t>
+            </w:r>
+          </w:p>
+        </w:tc>
+        <w:tc>
+          <w:tcPr>
+            <w:tcW w:type="dxa" w:w="1108"/>
+          </w:tcPr>
+          <w:p>
+            <w:pPr>
+              <w:spacing w:before="20" w:after="20" w:line="240" w:lineRule="auto"/>
+            </w:pPr>
+            <w:r>
+              <w:rPr>
+                <w:rFonts w:ascii="Arial Narrow" w:hAnsi="Arial Narrow"/>
+                <w:sz w:val="18"/>
+              </w:rPr>
+              <w:t>0.005</w:t>
+            </w:r>
+          </w:p>
+        </w:tc>
+        <w:tc>
+          <w:tcPr>
+            <w:tcW w:type="dxa" w:w="1108"/>
+          </w:tcPr>
+          <w:p>
+            <w:pPr>
+              <w:spacing w:before="20" w:after="20" w:line="240" w:lineRule="auto"/>
+            </w:pPr>
+            <w:r>
+              <w:rPr>
+                <w:rFonts w:ascii="Arial Narrow" w:hAnsi="Arial Narrow"/>
+                <w:sz w:val="18"/>
+              </w:rPr>
+              <w:t>***</w:t>
+            </w:r>
+          </w:p>
+        </w:tc>
+        <w:tc>
+          <w:tcPr>
+            <w:tcW w:type="dxa" w:w="1108"/>
+          </w:tcPr>
+          <w:p>
+            <w:pPr>
+              <w:spacing w:before="20" w:after="20" w:line="240" w:lineRule="auto"/>
+            </w:pPr>
+            <w:r>
+              <w:rPr>
+                <w:rFonts w:ascii="Arial Narrow" w:hAnsi="Arial Narrow"/>
+                <w:sz w:val="18"/>
+              </w:rPr>
+              <w:t>differs</w:t>
+            </w:r>
+          </w:p>
+        </w:tc>
+      </w:tr>
+      <w:tr>
+        <w:tc>
+          <w:tcPr>
+            <w:tcW w:type="dxa" w:w="1108"/>
+          </w:tcPr>
+          <w:p>
+            <w:pPr>
+              <w:spacing w:before="20" w:after="20" w:line="240" w:lineRule="auto"/>
+            </w:pPr>
+            <w:r>
+              <w:rPr>
+                <w:rFonts w:ascii="Arial Narrow" w:hAnsi="Arial Narrow"/>
+                <w:sz w:val="18"/>
+              </w:rPr>
+              <w:t>inc_quintile</w:t>
+            </w:r>
+          </w:p>
+        </w:tc>
+        <w:tc>
+          <w:tcPr>
+            <w:tcW w:type="dxa" w:w="1108"/>
+          </w:tcPr>
+          <w:p>
+            <w:pPr>
+              <w:spacing w:before="20" w:after="20" w:line="240" w:lineRule="auto"/>
+            </w:pPr>
+            <w:r>
+              <w:rPr>
+                <w:rFonts w:ascii="Arial Narrow" w:hAnsi="Arial Narrow"/>
+                <w:sz w:val="18"/>
+              </w:rPr>
+              <w:t>2.98</w:t>
+            </w:r>
+          </w:p>
+        </w:tc>
+        <w:tc>
+          <w:tcPr>
+            <w:tcW w:type="dxa" w:w="1108"/>
+          </w:tcPr>
+          <w:p>
+            <w:pPr>
+              <w:spacing w:before="20" w:after="20" w:line="240" w:lineRule="auto"/>
+            </w:pPr>
+            <w:r>
+              <w:rPr>
+                <w:rFonts w:ascii="Arial Narrow" w:hAnsi="Arial Narrow"/>
+                <w:sz w:val="18"/>
+              </w:rPr>
+              <w:t>3.04</w:t>
+            </w:r>
+          </w:p>
+        </w:tc>
+        <w:tc>
+          <w:tcPr>
+            <w:tcW w:type="dxa" w:w="1108"/>
+          </w:tcPr>
+          <w:p>
+            <w:pPr>
+              <w:spacing w:before="20" w:after="20" w:line="240" w:lineRule="auto"/>
+            </w:pPr>
+            <w:r>
+              <w:rPr>
+                <w:rFonts w:ascii="Arial Narrow" w:hAnsi="Arial Narrow"/>
+                <w:sz w:val="18"/>
+              </w:rPr>
+              <w:t>-0.05</w:t>
+            </w:r>
+          </w:p>
+        </w:tc>
+        <w:tc>
+          <w:tcPr>
+            <w:tcW w:type="dxa" w:w="1108"/>
+          </w:tcPr>
+          <w:p>
+            <w:pPr>
+              <w:spacing w:before="20" w:after="20" w:line="240" w:lineRule="auto"/>
+            </w:pPr>
+            <w:r>
+              <w:rPr>
+                <w:rFonts w:ascii="Arial Narrow" w:hAnsi="Arial Narrow"/>
+                <w:sz w:val="18"/>
+              </w:rPr>
+              <w:t>ttest</w:t>
+            </w:r>
+          </w:p>
+        </w:tc>
+        <w:tc>
+          <w:tcPr>
+            <w:tcW w:type="dxa" w:w="1108"/>
+          </w:tcPr>
+          <w:p>
+            <w:pPr>
+              <w:spacing w:before="20" w:after="20" w:line="240" w:lineRule="auto"/>
+            </w:pPr>
+            <w:r>
+              <w:rPr>
+                <w:rFonts w:ascii="Arial Narrow" w:hAnsi="Arial Narrow"/>
+                <w:sz w:val="18"/>
+              </w:rPr>
+              <w:t>0.66</w:t>
+            </w:r>
+          </w:p>
+        </w:tc>
+        <w:tc>
+          <w:tcPr>
+            <w:tcW w:type="dxa" w:w="1108"/>
+          </w:tcPr>
+          <w:p>
+            <w:pPr>
+              <w:spacing w:before="20" w:after="20" w:line="240" w:lineRule="auto"/>
+            </w:pPr>
+            <w:r>
+              <w:rPr>
+                <w:rFonts w:ascii="Arial Narrow" w:hAnsi="Arial Narrow"/>
+                <w:sz w:val="18"/>
+              </w:rPr>
+              <w:t>0.509</w:t>
+            </w:r>
+          </w:p>
+        </w:tc>
+        <w:tc>
+          <w:tcPr>
+            <w:tcW w:type="dxa" w:w="1108"/>
+          </w:tcPr>
+          <w:p>
+            <w:pPr>
+              <w:spacing w:before="20" w:after="20" w:line="240" w:lineRule="auto"/>
+            </w:pPr>
+            <w:r>
+              <w:rPr>
+                <w:rFonts w:ascii="Arial Narrow" w:hAnsi="Arial Narrow"/>
+                <w:sz w:val="18"/>
+              </w:rPr>
+              <w:t>ns</w:t>
+            </w:r>
+          </w:p>
+        </w:tc>
+        <w:tc>
+          <w:tcPr>
+            <w:tcW w:type="dxa" w:w="1108"/>
+          </w:tcPr>
+          <w:p>
+            <w:pPr>
+              <w:spacing w:before="20" w:after="20" w:line="240" w:lineRule="auto"/>
+            </w:pPr>
+            <w:r>
+              <w:rPr>
+                <w:rFonts w:ascii="Arial Narrow" w:hAnsi="Arial Narrow"/>
+                <w:sz w:val="18"/>
+              </w:rPr>
+              <w:t>similar</w:t>
+            </w:r>
+          </w:p>
+        </w:tc>
+      </w:tr>
+      <w:tr>
+        <w:tc>
+          <w:tcPr>
+            <w:tcW w:type="dxa" w:w="1108"/>
+          </w:tcPr>
+          <w:p>
+            <w:pPr>
+              <w:spacing w:before="20" w:after="20" w:line="240" w:lineRule="auto"/>
+            </w:pPr>
+            <w:r>
+              <w:rPr>
+                <w:rFonts w:ascii="Arial Narrow" w:hAnsi="Arial Narrow"/>
+                <w:sz w:val="18"/>
+              </w:rPr>
+              <w:t>geography (stratum)</w:t>
+            </w:r>
+          </w:p>
+        </w:tc>
+        <w:tc>
+          <w:tcPr>
+            <w:tcW w:type="dxa" w:w="1108"/>
+          </w:tcPr>
+          <w:p>
+            <w:pPr>
+              <w:spacing w:before="20" w:after="20" w:line="240" w:lineRule="auto"/>
+            </w:pPr>
+            <w:r>
+              <w:rPr>
+                <w:rFonts w:ascii="Arial Narrow" w:hAnsi="Arial Narrow"/>
+                <w:sz w:val="18"/>
+              </w:rPr>
+              <w:t>39 strata</w:t>
+            </w:r>
+          </w:p>
+        </w:tc>
+        <w:tc>
+          <w:tcPr>
+            <w:tcW w:type="dxa" w:w="1108"/>
+          </w:tcPr>
+          <w:p>
+            <w:pPr>
+              <w:spacing w:before="20" w:after="20" w:line="240" w:lineRule="auto"/>
+            </w:pPr>
+            <w:r>
+              <w:rPr>
+                <w:rFonts w:ascii="Arial Narrow" w:hAnsi="Arial Narrow"/>
+                <w:sz w:val="18"/>
+              </w:rPr>
+              <w:t>39 strata</w:t>
+            </w:r>
+          </w:p>
+        </w:tc>
+        <w:tc>
+          <w:tcPr>
+            <w:tcW w:type="dxa" w:w="1108"/>
+          </w:tcPr>
+          <w:p>
+            <w:pPr>
+              <w:spacing w:before="20" w:after="20" w:line="240" w:lineRule="auto"/>
+            </w:pPr>
+            <w:r>
+              <w:rPr>
+                <w:rFonts w:ascii="Arial Narrow" w:hAnsi="Arial Narrow"/>
+                <w:sz w:val="18"/>
+              </w:rPr>
+            </w:r>
+          </w:p>
+        </w:tc>
+        <w:tc>
+          <w:tcPr>
+            <w:tcW w:type="dxa" w:w="1108"/>
+          </w:tcPr>
+          <w:p>
+            <w:pPr>
+              <w:spacing w:before="20" w:after="20" w:line="240" w:lineRule="auto"/>
+            </w:pPr>
+            <w:r>
+              <w:rPr>
+                <w:rFonts w:ascii="Arial Narrow" w:hAnsi="Arial Narrow"/>
+                <w:sz w:val="18"/>
+              </w:rPr>
+              <w:t>chi2</w:t>
+            </w:r>
+          </w:p>
+        </w:tc>
+        <w:tc>
+          <w:tcPr>
+            <w:tcW w:type="dxa" w:w="1108"/>
+          </w:tcPr>
+          <w:p>
+            <w:pPr>
+              <w:spacing w:before="20" w:after="20" w:line="240" w:lineRule="auto"/>
+            </w:pPr>
+            <w:r>
+              <w:rPr>
+                <w:rFonts w:ascii="Arial Narrow" w:hAnsi="Arial Narrow"/>
+                <w:sz w:val="18"/>
+              </w:rPr>
+              <w:t>52.54</w:t>
+            </w:r>
+          </w:p>
+        </w:tc>
+        <w:tc>
+          <w:tcPr>
+            <w:tcW w:type="dxa" w:w="1108"/>
+          </w:tcPr>
+          <w:p>
+            <w:pPr>
+              <w:spacing w:before="20" w:after="20" w:line="240" w:lineRule="auto"/>
+            </w:pPr>
+            <w:r>
+              <w:rPr>
+                <w:rFonts w:ascii="Arial Narrow" w:hAnsi="Arial Narrow"/>
+                <w:sz w:val="18"/>
+              </w:rPr>
+              <w:t>0.059</w:t>
+            </w:r>
+          </w:p>
+        </w:tc>
+        <w:tc>
+          <w:tcPr>
+            <w:tcW w:type="dxa" w:w="1108"/>
+          </w:tcPr>
+          <w:p>
+            <w:pPr>
+              <w:spacing w:before="20" w:after="20" w:line="240" w:lineRule="auto"/>
+            </w:pPr>
+            <w:r>
+              <w:rPr>
+                <w:rFonts w:ascii="Arial Narrow" w:hAnsi="Arial Narrow"/>
+                <w:sz w:val="18"/>
+              </w:rPr>
+              <w:t>*</w:t>
+            </w:r>
+          </w:p>
+        </w:tc>
+        <w:tc>
+          <w:tcPr>
+            <w:tcW w:type="dxa" w:w="1108"/>
+          </w:tcPr>
+          <w:p>
+            <w:pPr>
+              <w:spacing w:before="20" w:after="20" w:line="240" w:lineRule="auto"/>
+            </w:pPr>
+            <w:r>
+              <w:rPr>
+                <w:rFonts w:ascii="Arial Narrow" w:hAnsi="Arial Narrow"/>
+                <w:sz w:val="18"/>
+              </w:rPr>
+              <w:t>similar</w:t>
+            </w:r>
+          </w:p>
+        </w:tc>
+      </w:tr>
+      <w:tr>
+        <w:tc>
+          <w:tcPr>
+            <w:tcW w:type="dxa" w:w="1108"/>
+          </w:tcPr>
+          <w:p>
+            <w:pPr>
+              <w:spacing w:before="20" w:after="20" w:line="240" w:lineRule="auto"/>
+            </w:pPr>
+            <w:r>
+              <w:rPr>
+                <w:rFonts w:ascii="Arial Narrow" w:hAnsi="Arial Narrow"/>
+                <w:sz w:val="18"/>
+              </w:rPr>
+              <w:t>OVERALL</w:t>
+            </w:r>
+          </w:p>
+        </w:tc>
+        <w:tc>
+          <w:tcPr>
+            <w:tcW w:type="dxa" w:w="1108"/>
+          </w:tcPr>
+          <w:p>
+            <w:pPr>
+              <w:spacing w:before="20" w:after="20" w:line="240" w:lineRule="auto"/>
+            </w:pPr>
+            <w:r>
+              <w:rPr>
+                <w:rFonts w:ascii="Arial Narrow" w:hAnsi="Arial Narrow"/>
+                <w:sz w:val="18"/>
+              </w:rPr>
+            </w:r>
+          </w:p>
+        </w:tc>
+        <w:tc>
+          <w:tcPr>
+            <w:tcW w:type="dxa" w:w="1108"/>
+          </w:tcPr>
+          <w:p>
+            <w:pPr>
+              <w:spacing w:before="20" w:after="20" w:line="240" w:lineRule="auto"/>
+            </w:pPr>
+            <w:r>
+              <w:rPr>
+                <w:rFonts w:ascii="Arial Narrow" w:hAnsi="Arial Narrow"/>
+                <w:sz w:val="18"/>
+              </w:rPr>
+            </w:r>
+          </w:p>
+        </w:tc>
+        <w:tc>
+          <w:tcPr>
+            <w:tcW w:type="dxa" w:w="1108"/>
+          </w:tcPr>
+          <w:p>
+            <w:pPr>
+              <w:spacing w:before="20" w:after="20" w:line="240" w:lineRule="auto"/>
+            </w:pPr>
+            <w:r>
+              <w:rPr>
+                <w:rFonts w:ascii="Arial Narrow" w:hAnsi="Arial Narrow"/>
+                <w:sz w:val="18"/>
+              </w:rPr>
+            </w:r>
+          </w:p>
+        </w:tc>
+        <w:tc>
+          <w:tcPr>
+            <w:tcW w:type="dxa" w:w="1108"/>
+          </w:tcPr>
+          <w:p>
+            <w:pPr>
+              <w:spacing w:before="20" w:after="20" w:line="240" w:lineRule="auto"/>
+            </w:pPr>
+            <w:r>
+              <w:rPr>
+                <w:rFonts w:ascii="Arial Narrow" w:hAnsi="Arial Narrow"/>
+                <w:sz w:val="18"/>
+              </w:rPr>
+            </w:r>
+          </w:p>
+        </w:tc>
+        <w:tc>
+          <w:tcPr>
+            <w:tcW w:type="dxa" w:w="1108"/>
+          </w:tcPr>
+          <w:p>
+            <w:pPr>
+              <w:spacing w:before="20" w:after="20" w:line="240" w:lineRule="auto"/>
+            </w:pPr>
+            <w:r>
+              <w:rPr>
+                <w:rFonts w:ascii="Arial Narrow" w:hAnsi="Arial Narrow"/>
+                <w:sz w:val="18"/>
+              </w:rPr>
+            </w:r>
+          </w:p>
+        </w:tc>
+        <w:tc>
+          <w:tcPr>
+            <w:tcW w:type="dxa" w:w="1108"/>
+          </w:tcPr>
+          <w:p>
+            <w:pPr>
+              <w:spacing w:before="20" w:after="20" w:line="240" w:lineRule="auto"/>
+            </w:pPr>
+            <w:r>
+              <w:rPr>
+                <w:rFonts w:ascii="Arial Narrow" w:hAnsi="Arial Narrow"/>
+                <w:sz w:val="18"/>
+              </w:rPr>
+            </w:r>
+          </w:p>
+        </w:tc>
+        <w:tc>
+          <w:tcPr>
+            <w:tcW w:type="dxa" w:w="1108"/>
+          </w:tcPr>
+          <w:p>
+            <w:pPr>
+              <w:spacing w:before="20" w:after="20" w:line="240" w:lineRule="auto"/>
+            </w:pPr>
+            <w:r>
+              <w:rPr>
+                <w:rFonts w:ascii="Arial Narrow" w:hAnsi="Arial Narrow"/>
+                <w:sz w:val="18"/>
+              </w:rPr>
+            </w:r>
+          </w:p>
+        </w:tc>
+        <w:tc>
+          <w:tcPr>
+            <w:tcW w:type="dxa" w:w="1108"/>
+          </w:tcPr>
+          <w:p>
+            <w:pPr>
+              <w:spacing w:before="20" w:after="20" w:line="240" w:lineRule="auto"/>
+            </w:pPr>
+            <w:r>
+              <w:rPr>
+                <w:rFonts w:ascii="Arial Narrow" w:hAnsi="Arial Narrow"/>
+                <w:sz w:val="18"/>
+              </w:rPr>
+              <w:t>BIASED</w:t>
+            </w:r>
+          </w:p>
+        </w:tc>
+      </w:tr>
+    </w:tbl>
+    <w:p>
+      <w:pPr/>
+      <w:r>
+        <w:t>On the characteristics that matter most for welfare measurement, the two groups are statistically indistinguishable. Income quintile, food insecurity, the head's sex, urban residence, and geographic composition show no significant stayer-leaver difference (all p greater than 0.05). The one significant difference is household size: retained households are larger by about a third of a member (4.48 against 4.15, p = 0.005). Because household size enters the age-sex calibration indirectly, since larger households contribute more person-cells, this residual is partly absorbed by the person-weight step. Baseline employment is not tested here, because the phone panel's employment module has thin Round-1 coverage.</w:t>
+      </w:r>
+    </w:p>
+    <w:p>
+      <w:pPr/>
+      <w:r>
+        <w:t>A formal joint test therefore flags the panel as biased, but the selection is confined to household size and is modest; on income and food security, the dimensions the reweighting does not calibrate to, the households that remain are not a selected subset.</w:t>
+      </w:r>
+    </w:p>
+    <w:p>
+      <w:pPr/>
+      <w:r>
+        <w:t>A direct check on the headline food-security series supports this. Re-estimating the moderate-or-severe rate on the balanced panel, households present in all eight rounds, tracks the full-sample series closely (Round 1, 42.4 against 41.0 percent; Round 8, 20.4 against 20.8), so the recovery in food security is a within-household improvement rather than an artefact of who leaves the panel.</w:t>
+      </w:r>
+    </w:p>
     <w:p>
       <w:pPr>
         <w:pStyle w:val="Heading1"/>

</xml_diff>